<commit_message>
Clarify outcome metrics and Class 5 costs
</commit_message>
<xml_diff>
--- a/docs/Final_Report.docx
+++ b/docs/Final_Report.docx
@@ -33,7 +33,7 @@
     </w:p>
     <w:p>
       <w:r>
-        <w:t>Live OpenRouter evaluation obtained 25 model responses across 30 development cases. Policy and ticket results are reported separately: retrospective AI-assisted policy review passes 22/25 eligible answers (88%), while first-turn complete tickets remain 5/8 (62.5%), below the &gt;85% target. Revised automated engineering checks pass 30/30, but are not a policy-correctness score. New informal offline diagnostics pass 7/12. Review timing and the revised proposal alignment are explained in section 8. [1]</w:t>
+        <w:t>Live OpenRouter evaluation obtained 25 model responses across 30 development cases. Outcome metrics are deliberately separated: ticket structural pass rate is 8/8 (valid JSON, exactly five fields and correct request type); first-turn complete tickets are 5/8 (62.5%), below the &gt;85% target; and retrospective AI-assisted answer-quality review passes 22/25 eligible answers (88%). The answer-quality result is not a completed human spot check. Revised automated engineering checks pass 30/30, but are not a policy-correctness score. New informal offline diagnostics pass 7/12. Review timing and the revised proposal alignment are explained in section 8. [1]</w:t>
       </w:r>
     </w:p>
     <w:p>
@@ -51,7 +51,7 @@
     </w:p>
     <w:p>
       <w:r>
-        <w:t>The original and revised proposals estimated 8–10 HR hours per week spent on recurring enquiries and 8–10 minutes per manually completed form. These are planning assumptions, not measurements from a real employer. Neither the time savings nor the three-minute journey has been validated in a user study. [2]</w:t>
+        <w:t>The original and revised proposals estimated 8–10 HR hours per week spent answering recurring enquiries and 8–10 minutes per manually completed form. These are planning assumptions, not measurements from a real employer. The enquiry-hours estimate concerns the answer-quality half of the workflow; ticket JSON validity is not a proxy for those answered enquiries. Neither the time savings nor the three-minute journey has been validated in a user study. [2]</w:t>
       </w:r>
     </w:p>
     <w:p>
@@ -64,12 +64,12 @@
     </w:p>
     <w:p>
       <w:r>
-        <w:t>The revised proposal separates policy-answer and ticket performance. It retains ticket success as more than 85% of ticket requests producing legal JSON with five complete, correctly formatted fields and the correct request type. Across all eight ticket-intent cases, only five are complete on the first turn: 5/8 = 62.5%. The original target is therefore not achieved. All five fully specified inputs produce correct complete drafts; three incomplete inputs preserve unknown values and ask for details. Those three are safe responses, but not complete tickets.</w:t>
+        <w:t>The revised proposal separates policy-answer and ticket performance. The ticket structural pass rate is 8/8: every ticket-intent result is valid JSON with exactly five fields and the correct request type. This narrow result is expected to benefit from structured output and Python validation. Separately, only five of eight ticket-intent cases produce a complete five-field draft on the first turn: 5/8 = 62.5%. The original &gt;85% completion target is therefore not achieved. All five fully specified inputs produce correct complete drafts; three incomplete inputs preserve unknown values and ask for details. Those three are safe responses, but not complete tickets.</w:t>
       </w:r>
     </w:p>
     <w:p>
       <w:r>
-        <w:t>A valid schema can contain null values. Schema validity, safe handling of missing information, and complete ticket generation must therefore be reported separately. A guided follow-up form is a proposed improvement; multi-turn field collection is not implemented.</w:t>
+        <w:t>A valid schema can contain null values. Schema validity, safe handling of missing information, complete ticket generation and answer quality must therefore be reported separately. The saved answer-quality result is 22/25 in an AI-assisted retrospective review; it is not a completed human spot check. A guided follow-up form is a proposed improvement; multi-turn field collection is not implemented.</w:t>
       </w:r>
     </w:p>
     <w:p>
@@ -518,6 +518,14 @@
     <w:p>
       <w:r>
         <w:t>The project implements policy handling, retrieval, routing constraints, field extraction and evaluation locally, and rents language generation through an API. Training a model is not justified by five synthetic documents. Buying an HR platform could provide mature workflows, but licensing and integration have not been benchmarked. The prototype is intended to test the workflow before such an investment.</w:t>
+      </w:r>
+    </w:p>
+    <w:p>
+      <w:pPr/>
+      <w:r>
+        <w:t>Course coverage</w:t>
+        <w:br/>
+        <w:t>This project applies Class 1 to frame a bounded, repeatable HR enquiry problem; Class 2 to assemble retrieval, generation and evaluation; Class 3 to steer model behaviour and measure it; Class 5 to price per-query inference, fallback and maintenance; and Class 6 to bound risk, privacy and human oversight.</w:t>
       </w:r>
     </w:p>
     <w:p>
@@ -1203,15 +1211,8 @@
             </w:tcMar>
           </w:tcPr>
           <w:p>
-            <w:pPr>
-              <w:spacing w:after="60" w:line="252" w:lineRule="auto"/>
-            </w:pPr>
             <w:r>
-              <w:rPr>
-                <w:b w:val="0"/>
-                <w:sz w:val="18"/>
-              </w:rPr>
-              <w:t>Ticket schema validity</w:t>
+              <w:t>Ticket structural pass rate (JSON, five fields, type)</w:t>
             </w:r>
           </w:p>
         </w:tc>
@@ -1943,7 +1944,7 @@
     <w:p/>
     <w:p>
       <w:r>
-        <w:t>Each denominator includes eligible cases only. Task success combines routing, retrieval, field and safety assertions; it is not a human policy-correctness score. Retrieval and citation checks verify section IDs, not whether every generated statement is supported. Complete-ticket success also differs from successful handling of a request with missing information.</w:t>
+        <w:t>Each denominator includes eligible cases only. Ticket structural pass rate measures valid JSON, five fields and correct request type; it does not establish response quality. Task success combines routing, retrieval, field and safety assertions; it is not a human policy-correctness score. Retrieval and citation checks verify section IDs, not whether every generated statement is supported. Complete-ticket success also differs from successful handling of a request with missing information.</w:t>
       </w:r>
     </w:p>
     <w:p>
@@ -2462,8 +2463,9 @@
       </w:r>
     </w:p>
     <w:p>
+      <w:pPr/>
       <w:r>
-        <w:t>The revised run records 16,658 prompt tokens and 1,842 completion tokens across 25 model responses. Summing the provider-reported usage.cost values gives USD 0.0036039, or USD 0.000144156 per model response. The two saved live evaluation runs together report USD 0.00618615. This is an aggregation of saved response metadata, not a reconciled account bill; later browser demonstrations and other account usage are excluded. [1]</w:t>
+        <w:t>The revised run records 16,658 prompt tokens and 1,842 completion tokens across 25 openai/gpt-4o-mini responses. Per query, that is 666.32 prompt tokens plus 73.68 completion tokens and USD 0.000144156 in provider-reported inference cost. At 400 comparable queries per month, variable model inference would be about USD 0.0577. This is a per-query input cost, not cost per successfully resolved enquiry. The two saved live evaluation runs together report USD 0.00618615. This is an aggregation of saved response metadata, not a reconciled account bill; later browser demonstrations and other account usage are excluded. [1, 4]</w:t>
       </w:r>
     </w:p>
     <w:p>
@@ -2861,12 +2863,7 @@
     <w:p/>
     <w:p>
       <w:r>
-        <w:t>At 20%, 50% and 80% useful resolution, net monthly value is USD 118.00, USD 368.00 and USD 618.00 respectively; setup payback at 50% is about 5.4 months. Useful resolution is not the 30/30 test score or the 62.5% ticket completion rate. Harmful answers, rework, added review time and omitted hosting or integration costs could eliminate the benefit. Low API cost alone does not justify deployment.</w:t>
-      </w:r>
-    </w:p>
-    <w:p>
-      <w:r>
-        <w:br w:type="page"/>
+        <w:t>At 20%, 50% and 80% useful resolution, net monthly value is USD 118.00, USD 368.00 and USD 618.00 respectively; setup payback at 50% is about 5.4 months. Useful resolution covers the estimated 8–10 weekly answer hours and must use human spot checks, not the 8/8 ticket structural pass rate, 30/30 task score or 5/8 completion rate. Other costs could eliminate the benefit.</w:t>
       </w:r>
     </w:p>
     <w:p>
@@ -3722,7 +3719,7 @@
     </w:p>
     <w:p>
       <w:r>
-        <w:t>The saved revised run uses prompt version draft-intent-v2. Dataset, policy and source SHA-256 values are recorded in results/openrouter.json. Provider errors visibly fall back to local output; fallback results must not be reported as model responses. No new API calls were needed to update this report. Run python3 scripts/summarize_evidence.py to aggregate separate content, ticket, escalation and cost measures without model calls.</w:t>
+        <w:t>The saved revised run uses prompt version draft-intent-v2. Dataset, policy and source SHA-256 values are recorded in results/openrouter.json. Provider errors visibly fall back to local output; fallback results must not be reported as model responses. No new API calls were needed to update this report. Run python3 scripts/summarize_evidence.py to aggregate separate answer-quality, ticket-structure, workflow-completion, escalation and cost measures without model calls. The human answer spot-check protocol is tests/MANUAL_ANSWER_SPOT_CHECK.md.</w:t>
       </w:r>
     </w:p>
     <w:p>
@@ -4210,11 +4207,9 @@
       </w:r>
     </w:p>
     <w:p>
+      <w:pPr/>
       <w:r>
-        <w:rPr>
-          <w:sz w:val="18"/>
-        </w:rPr>
-        <w:t>[4] PE6201 Class 5 Capsule 2, cost-to-serve calculator, local course copy retained in the A2 package under PE6201_D6_D7/teacher/class5_original.py. Used as a methodological reference. [5] OpenRouter Structured Outputs documentation: https://openrouter.ai/docs/guides/features/structured-outputs. [6] Supplied course assessment screenshot, End-of-Course Project deliverables.</w:t>
+        <w:t>[4] PE6201 Class 5 Capsule 2, What does it actually cost, supplied course material. Used for the cost-to-serve method: per-task variable cost, expected human fallback and fixed maintenance. [5] OpenRouter Structured Outputs documentation: https://openrouter.ai/docs/guides/features/structured-outputs. [6] Supplied course assessment screenshot, End-of-Course Project deliverables.</w:t>
       </w:r>
     </w:p>
     <w:p>
@@ -4223,11 +4218,6 @@
           <w:sz w:val="18"/>
         </w:rPr>
         <w:t>AI assistance was used for code, synthetic data, analysis, report writing and video materials. The video uses synthetic narration and actual application screenshots, not the student’s voice or a continuous recording. The student remains responsible for reviewing the work, explaining the design and declaring assistance under the course requirements.</w:t>
-      </w:r>
-    </w:p>
-    <w:p>
-      <w:r>
-        <w:br w:type="page"/>
       </w:r>
     </w:p>
     <w:p>
@@ -4372,15 +4362,8 @@
             </w:tcMar>
           </w:tcPr>
           <w:p>
-            <w:pPr>
-              <w:spacing w:after="60" w:line="252" w:lineRule="auto"/>
-            </w:pPr>
             <w:r>
-              <w:rPr>
-                <w:b w:val="0"/>
-                <w:sz w:val="18"/>
-              </w:rPr>
-              <w:t>Policy answer pass rate</w:t>
+              <w:t>Answer-quality review</w:t>
             </w:r>
           </w:p>
         </w:tc>
@@ -4434,15 +4417,8 @@
             </w:tcMar>
           </w:tcPr>
           <w:p>
-            <w:pPr>
-              <w:spacing w:after="60" w:line="252" w:lineRule="auto"/>
-            </w:pPr>
             <w:r>
-              <w:rPr>
-                <w:b w:val="0"/>
-                <w:sz w:val="18"/>
-              </w:rPr>
-              <w:t>AI-assisted retrospective content review; failures T07, T10, T23</w:t>
+              <w:t>AI-assisted retrospective review; human spot check pending</w:t>
             </w:r>
           </w:p>
         </w:tc>
@@ -4467,15 +4443,8 @@
             </w:tcMar>
           </w:tcPr>
           <w:p>
-            <w:pPr>
-              <w:spacing w:after="60" w:line="252" w:lineRule="auto"/>
-            </w:pPr>
             <w:r>
-              <w:rPr>
-                <w:b w:val="0"/>
-                <w:sz w:val="18"/>
-              </w:rPr>
-              <w:t>Ticket pass rate</w:t>
+              <w:t>Ticket structural pass rate</w:t>
             </w:r>
           </w:p>
         </w:tc>
@@ -4498,15 +4467,8 @@
             </w:tcMar>
           </w:tcPr>
           <w:p>
-            <w:pPr>
-              <w:spacing w:after="60" w:line="252" w:lineRule="auto"/>
-            </w:pPr>
             <w:r>
-              <w:rPr>
-                <w:b w:val="0"/>
-                <w:sz w:val="18"/>
-              </w:rPr>
-              <w:t>5/8 (62.5%)</w:t>
+              <w:t>8/8 (100%)</w:t>
             </w:r>
           </w:p>
         </w:tc>
@@ -4529,15 +4491,8 @@
             </w:tcMar>
           </w:tcPr>
           <w:p>
-            <w:pPr>
-              <w:spacing w:after="60" w:line="252" w:lineRule="auto"/>
-            </w:pPr>
             <w:r>
-              <w:rPr>
-                <w:b w:val="0"/>
-                <w:sz w:val="18"/>
-              </w:rPr>
-              <w:t>Strict first-turn complete and correct tickets; target &gt;85% unmet</w:t>
+              <w:t>Valid JSON, five fields and correct request type; first-turn completion is separately 5/8</w:t>
             </w:r>
           </w:p>
         </w:tc>
@@ -4957,7 +4912,7 @@
     </w:p>
     <w:p>
       <w:r>
-        <w:t>The stronger goal of defining all expected answers before the original live test remains unmet. Chroma, a 30–50-page corpus and robust interpretation of unrestricted informal requests also remain proposal-to-implementation gaps. Do not relabel the old cases as independent tests or combine the new offline scores with live results. Next work should freeze a separate rubric and test set before a fresh model evaluation, then obtain independent HR review.</w:t>
+        <w:t>The stronger goal of defining all expected answers before the original live test remains unmet. Chroma, a 30–50-page corpus and robust informal-language handling also remain proposal-to-implementation gaps. A future evaluation should freeze a separate rubric and test set, then obtain independent HR review.</w:t>
       </w:r>
     </w:p>
     <w:p>
@@ -5701,13 +5656,7 @@
         <w:spacing w:after="140" w:line="276" w:lineRule="auto"/>
       </w:pPr>
       <w:r>
-        <w:rPr>
-          <w:rFonts w:ascii="Arial" w:hAnsi="Arial"/>
-          <w:b w:val="0"/>
-          <w:color w:val="000000"/>
-          <w:sz w:val="21"/>
-        </w:rPr>
-        <w:t>The policy content review is 22/25 and is an AI-assisted retrospective review. Complete tickets are 5/8. Automated engineering checks are 30/30. The informal offline diagnostic is 7/12. These measures assess different capabilities and must not be combined into one accuracy rate.</w:t>
+        <w:t>Ticket structural pass rate is 8/8 for valid JSON, five fields and correct request type. First-turn complete tickets are 5/8. Policy answer quality is 22/25 in an AI-assisted retrospective review, with human spot checking still pending. Automated engineering checks are 30/30. The informal offline diagnostic is 7/12. These measures assess different capabilities and must not be combined into one accuracy rate.</w:t>
       </w:r>
     </w:p>
     <w:p>

</xml_diff>

<commit_message>
Model human fallback in service costs
</commit_message>
<xml_diff>
--- a/docs/Final_Report.docx
+++ b/docs/Final_Report.docx
@@ -73,13 +73,9 @@
       </w:r>
     </w:p>
     <w:p>
-      <w:r>
-        <w:br w:type="page"/>
-      </w:r>
-    </w:p>
-    <w:p>
       <w:pPr>
         <w:pStyle w:val="Heading1"/>
+        <w:pageBreakBefore/>
       </w:pPr>
       <w:r>
         <w:t>2 Architecture and implementation</w:t>
@@ -2482,8 +2478,9 @@
       </w:r>
     </w:p>
     <w:p>
+      <w:pPr/>
       <w:r>
-        <w:t>For rule maintenance, assume 20 minutes per rewritten rule for revision, regression testing and release checking, and USD 25 per hour. At 17.5 rules per quarter, this equals 5.83 labour hours and USD 145.83 per quarter, or USD 48.61 per month. The rule count comes from instructor feedback; the minutes per rule and labour rate are transparent assumptions. Assume 400 eligible enquiries per month, five net HR minutes saved per usefully resolved enquiry, USD 2,000 initial setup, and one model call per enquiry at the observed mean, giving about USD 0.0577 monthly API cost. Net value = 400 × useful-resolution rate × 5/60 × 25 − 48.61 − API cost.</w:t>
+        <w:t>For rule maintenance, assume 20 minutes per rewritten rule for revision, regression testing and release checking, and USD 25 per hour. At 17.5 rules per quarter, this equals 5.83 labour hours and USD 145.83 per quarter, or USD 48.61 per month. The rule count comes from instructor feedback; the minutes per rule and labour rate are transparent assumptions. For the fallback scenario, each unsuccessfully resolved enquiry is assumed to require five HR minutes at USD 25 per hour, or USD 2.0833. This is an illustrative fallback assumption, not a measured handling time, and is distinct from the five net minutes saved by a useful resolution. Assume 400 eligible enquiries per month, USD 2,000 initial setup, and one model call per enquiry at the observed mean, giving about USD 0.0577 monthly API cost. Monthly operating cost = API cost + maintenance cost + 400 × (1 − useful-resolution rate) × USD 2.0833. Cost per useful resolution = monthly operating cost ÷ (400 × useful-resolution rate).</w:t>
       </w:r>
     </w:p>
     <w:tbl>
@@ -2520,14 +2517,7 @@
             </w:tcMar>
           </w:tcPr>
           <w:p>
-            <w:pPr>
-              <w:spacing w:after="60" w:line="252" w:lineRule="auto"/>
-            </w:pPr>
             <w:r>
-              <w:rPr>
-                <w:b/>
-                <w:sz w:val="18"/>
-              </w:rPr>
               <w:t>Useful resolution assumption</w:t>
             </w:r>
           </w:p>
@@ -2551,15 +2541,8 @@
             </w:tcMar>
           </w:tcPr>
           <w:p>
-            <w:pPr>
-              <w:spacing w:after="60" w:line="252" w:lineRule="auto"/>
-            </w:pPr>
             <w:r>
-              <w:rPr>
-                <w:b/>
-                <w:sz w:val="18"/>
-              </w:rPr>
-              <w:t>Gross time value per month</w:t>
+              <w:t>Cost per useful resolution</w:t>
             </w:r>
           </w:p>
         </w:tc>
@@ -2582,14 +2565,7 @@
             </w:tcMar>
           </w:tcPr>
           <w:p>
-            <w:pPr>
-              <w:spacing w:after="60" w:line="252" w:lineRule="auto"/>
-            </w:pPr>
             <w:r>
-              <w:rPr>
-                <w:b/>
-                <w:sz w:val="18"/>
-              </w:rPr>
               <w:t>Net value per month</w:t>
             </w:r>
           </w:p>
@@ -2615,14 +2591,7 @@
             </w:tcMar>
           </w:tcPr>
           <w:p>
-            <w:pPr>
-              <w:spacing w:after="60" w:line="252" w:lineRule="auto"/>
-            </w:pPr>
             <w:r>
-              <w:rPr>
-                <w:b w:val="0"/>
-                <w:sz w:val="18"/>
-              </w:rPr>
               <w:t>20%</w:t>
             </w:r>
           </w:p>
@@ -2646,15 +2615,8 @@
             </w:tcMar>
           </w:tcPr>
           <w:p>
-            <w:pPr>
-              <w:spacing w:after="60" w:line="252" w:lineRule="auto"/>
-            </w:pPr>
             <w:r>
-              <w:rPr>
-                <w:b w:val="0"/>
-                <w:sz w:val="18"/>
-              </w:rPr>
-              <w:t>USD 166.67</w:t>
+              <w:t>USD 8.94</w:t>
             </w:r>
           </w:p>
         </w:tc>
@@ -2678,7 +2640,7 @@
           </w:tcPr>
           <w:p>
             <w:r>
-              <w:t>USD 118.00</w:t>
+              <w:t>negative USD 548.67</w:t>
             </w:r>
           </w:p>
         </w:tc>
@@ -2703,14 +2665,7 @@
             </w:tcMar>
           </w:tcPr>
           <w:p>
-            <w:pPr>
-              <w:spacing w:after="60" w:line="252" w:lineRule="auto"/>
-            </w:pPr>
             <w:r>
-              <w:rPr>
-                <w:b w:val="0"/>
-                <w:sz w:val="18"/>
-              </w:rPr>
               <w:t>50%</w:t>
             </w:r>
           </w:p>
@@ -2734,15 +2689,8 @@
             </w:tcMar>
           </w:tcPr>
           <w:p>
-            <w:pPr>
-              <w:spacing w:after="60" w:line="252" w:lineRule="auto"/>
-            </w:pPr>
             <w:r>
-              <w:rPr>
-                <w:b w:val="0"/>
-                <w:sz w:val="18"/>
-              </w:rPr>
-              <w:t>USD 416.67</w:t>
+              <w:t>USD 2.33</w:t>
             </w:r>
           </w:p>
         </w:tc>
@@ -2766,7 +2714,7 @@
           </w:tcPr>
           <w:p>
             <w:r>
-              <w:t>USD 368.00</w:t>
+              <w:t>negative USD 48.67</w:t>
             </w:r>
           </w:p>
         </w:tc>
@@ -2791,14 +2739,7 @@
             </w:tcMar>
           </w:tcPr>
           <w:p>
-            <w:pPr>
-              <w:spacing w:after="60" w:line="252" w:lineRule="auto"/>
-            </w:pPr>
             <w:r>
-              <w:rPr>
-                <w:b w:val="0"/>
-                <w:sz w:val="18"/>
-              </w:rPr>
               <w:t>80%</w:t>
             </w:r>
           </w:p>
@@ -2822,15 +2763,8 @@
             </w:tcMar>
           </w:tcPr>
           <w:p>
-            <w:pPr>
-              <w:spacing w:after="60" w:line="252" w:lineRule="auto"/>
-            </w:pPr>
             <w:r>
-              <w:rPr>
-                <w:b w:val="0"/>
-                <w:sz w:val="18"/>
-              </w:rPr>
-              <w:t>USD 666.67</w:t>
+              <w:t>USD 0.67</w:t>
             </w:r>
           </w:p>
         </w:tc>
@@ -2854,7 +2788,7 @@
           </w:tcPr>
           <w:p>
             <w:r>
-              <w:t>USD 618.00</w:t>
+              <w:t>USD 451.33</w:t>
             </w:r>
           </w:p>
         </w:tc>
@@ -2862,8 +2796,9 @@
     </w:tbl>
     <w:p/>
     <w:p>
+      <w:pPr/>
       <w:r>
-        <w:t>At 20%, 50% and 80% useful resolution, net monthly value is USD 118.00, USD 368.00 and USD 618.00 respectively; setup payback at 50% is about 5.4 months. Useful resolution covers the estimated 8–10 weekly answer hours and must use human spot checks, not the 8/8 ticket structural pass rate, 30/30 task score or 5/8 completion rate. Other costs could eliminate the benefit.</w:t>
+        <w:t>At 20%, 50% and 80% useful resolution, operating cost per useful resolution is USD 8.94, USD 2.33 and USD 0.67 respectively. Net monthly value is negative USD 548.67, negative USD 48.67 and USD 451.33; only the 80% scenario repays USD 2,000 setup, in about 4.4 months. Useful resolution covers the estimated 8–10 weekly answer hours and must use human spot checks, not the 8/8 ticket structural pass rate, 30/30 task score or 5/8 completion rate. Other costs could eliminate the benefit.</w:t>
       </w:r>
     </w:p>
     <w:p>
@@ -3682,13 +3617,9 @@
       </w:r>
     </w:p>
     <w:p>
+      <w:pPr/>
       <w:r>
-        <w:t>The server binds to loopback for local demonstration. A future deployment would require authentication, access controls, retention rules, monitoring and explicit confirmation before any new submission connector. Policy interpretation and employment decisions remain with HR. Embedding retrieval should be compared against the same frozen questions before replacing the lexical baseline.</w:t>
-      </w:r>
-    </w:p>
-    <w:p>
-      <w:r>
-        <w:br w:type="page"/>
+        <w:t>The server is loopback only. Production requires authentication, access controls, retention rules, monitoring and explicit confirmation before any submission connector. HR retains policy interpretation and employment decisions.</w:t>
       </w:r>
     </w:p>
     <w:p>

</xml_diff>

<commit_message>
Record completed manual answer spot check
</commit_message>
<xml_diff>
--- a/docs/Final_Report.docx
+++ b/docs/Final_Report.docx
@@ -15,7 +15,7 @@
         <w:pStyle w:val="Subtitle"/>
       </w:pPr>
       <w:r>
-        <w:t>End of Course Project | Kang Xingyao | Section C | Updated 23 September 2026</w:t>
+        <w:t>End of Course Project | Kang Xingyao | Section C | Updated 25 September 2026</w:t>
       </w:r>
     </w:p>
     <w:p>
@@ -33,7 +33,7 @@
     </w:p>
     <w:p>
       <w:r>
-        <w:t>Live OpenRouter evaluation obtained 25 model responses across 30 development cases. Outcome metrics are deliberately separated: ticket structural pass rate is 8/8 (valid JSON, exactly five fields and correct request type); first-turn complete tickets are 5/8 (62.5%), below the &gt;85% target; and retrospective AI-assisted answer-quality review passes 22/25 eligible answers (88%). The answer-quality result is not a completed human spot check. Revised automated engineering checks pass 30/30, but are not a policy-correctness score. New informal offline diagnostics pass 7/12. Review timing and the revised proposal alignment are explained in section 8. [1]</w:t>
+        <w:t>Live OpenRouter evaluation obtained 25 model responses across 30 development cases. Outcome metrics are deliberately separated: ticket structural pass rate is 8/8 (valid JSON, exactly five fields and correct request type); first-turn complete tickets are 5/8 (62.5%), below the &gt;85% target; and retrospective AI-assisted answer-quality review passes 22/25 eligible answers (88%). A completed manual student spot check passes 8/10 answers (80%) from a stratified random sample, using seed 20260925. The manual sample is not an independent HR review. Revised automated engineering checks pass 30/30, but are not a policy-correctness score. New informal offline diagnostics pass 7/12. Review timing and the revised proposal alignment are explained in section 8. [1]</w:t>
       </w:r>
     </w:p>
     <w:p>
@@ -69,7 +69,7 @@
     </w:p>
     <w:p>
       <w:r>
-        <w:t>A valid schema can contain null values. Schema validity, safe handling of missing information, complete ticket generation and answer quality must therefore be reported separately. The saved answer-quality result is 22/25 in an AI-assisted retrospective review; it is not a completed human spot check. A guided follow-up form is a proposed improvement; multi-turn field collection is not implemented.</w:t>
+        <w:t>A valid schema can contain null values. Schema validity, safe handling of missing information, complete ticket generation and answer quality must therefore be reported separately. The saved answer-quality result is 22/25 in an AI-assisted retrospective review. A separate manual student spot check passes 8/10 randomly sampled eligible answers; it is recorded with its reviewer role, policy snapshot and sample method, but is not an independent HR review. A guided follow-up form is a proposed improvement; multi-turn field collection is not implemented.</w:t>
       </w:r>
     </w:p>
     <w:p>
@@ -2798,7 +2798,7 @@
     <w:p>
       <w:pPr/>
       <w:r>
-        <w:t>At 20%, 50% and 80% useful resolution, operating cost per useful resolution is USD 8.94, USD 2.33 and USD 0.67 respectively. Net monthly value is negative USD 548.67, negative USD 48.67 and USD 451.33; only the 80% scenario repays USD 2,000 setup, in about 4.4 months. Useful resolution covers the estimated 8–10 weekly answer hours and must use human spot checks, not the 8/8 ticket structural pass rate, 30/30 task score or 5/8 completion rate. Other costs could eliminate the benefit.</w:t>
+        <w:t>At 20%, 50% and 80% useful resolution, operating cost per useful resolution is USD 8.94, USD 2.33 and USD 0.67 respectively. Net monthly value is negative USD 548.67, negative USD 48.67 and USD 451.33; only the 80% scenario repays USD 2,000 setup, in about 4.4 months. The completed manual student spot check passes 8/10 answers (80%) and supplies the 80% illustrative useful-resolution input. It is distinct from the 8/8 ticket structural pass rate, 30/30 task score and 5/8 completion rate, and it is not an independent HR review. Other costs could eliminate the benefit.</w:t>
       </w:r>
     </w:p>
     <w:p>
@@ -3916,15 +3916,8 @@
             </w:tcMar>
           </w:tcPr>
           <w:p>
-            <w:pPr>
-              <w:spacing w:after="60" w:line="252" w:lineRule="auto"/>
-            </w:pPr>
             <w:r>
-              <w:rPr>
-                <w:b w:val="0"/>
-                <w:sz w:val="18"/>
-              </w:rPr>
-              <w:t>results/comparison.json, challenge.json and report_cost_summary.json</w:t>
+              <w:t>results/comparison.json, challenge.json, report_cost_summary.json and manual_answer_spot_check.json</w:t>
             </w:r>
           </w:p>
         </w:tc>
@@ -3980,15 +3973,8 @@
             </w:tcMar>
           </w:tcPr>
           <w:p>
-            <w:pPr>
-              <w:spacing w:after="60" w:line="252" w:lineRule="auto"/>
-            </w:pPr>
             <w:r>
-              <w:rPr>
-                <w:b w:val="0"/>
-                <w:sz w:val="18"/>
-              </w:rPr>
-              <w:t>src/hrask.py, evaluate.py, server.py, policies/ and tests/; GitHub publication not verified.</w:t>
+              <w:t>src/hrask.py, evaluate.py, server.py, policies/ and tests/; GitHub: github.com/kxy-creator/PE6201-End-of-project.</w:t>
             </w:r>
           </w:p>
         </w:tc>
@@ -4294,7 +4280,7 @@
           </w:tcPr>
           <w:p>
             <w:r>
-              <w:t>Answer-quality review</w:t>
+              <w:t>Answer-quality reviews</w:t>
             </w:r>
           </w:p>
         </w:tc>
@@ -4317,15 +4303,8 @@
             </w:tcMar>
           </w:tcPr>
           <w:p>
-            <w:pPr>
-              <w:spacing w:after="60" w:line="252" w:lineRule="auto"/>
-            </w:pPr>
             <w:r>
-              <w:rPr>
-                <w:b w:val="0"/>
-                <w:sz w:val="18"/>
-              </w:rPr>
-              <w:t>22/25 (88%)</w:t>
+              <w:t>22/25 (88%) AI-assisted; 8/10 (80%) manual</w:t>
             </w:r>
           </w:p>
         </w:tc>
@@ -4349,7 +4328,7 @@
           </w:tcPr>
           <w:p>
             <w:r>
-              <w:t>AI-assisted retrospective review; human spot check pending</w:t>
+              <w:t>Retrospective AI-assisted review; manual student sample uses seed 20260925 and is not independent HR review</w:t>
             </w:r>
           </w:p>
         </w:tc>
@@ -4825,7 +4804,7 @@
     </w:p>
     <w:p>
       <w:r>
-        <w:t>Expected conclusions and judgments were written on 23 September after observing the 21 September model outputs. They are explicitly retrospective, not pre-registered labels or independent human validation. Files tests/policy_answer_rubric.json and results/policy_answer_review.json provide every case, expected conclusion, answer and rationale. The latter is bound to the reviewed result by a SHA-256 hash. Student and independent HR verification remain pending.</w:t>
+        <w:t>Expected conclusions and judgments were written on 23 September after observing the 21 September model outputs. They are explicitly retrospective, not pre-registered labels or independent human validation. Files tests/policy_answer_rubric.json and results/policy_answer_review.json provide every case, expected conclusion, answer and rationale. The latter is bound to the reviewed result by a SHA-256 hash. Independent HR verification remains pending.</w:t>
       </w:r>
     </w:p>
     <w:p>
@@ -5587,7 +5566,7 @@
         <w:spacing w:after="140" w:line="276" w:lineRule="auto"/>
       </w:pPr>
       <w:r>
-        <w:t>Ticket structural pass rate is 8/8 for valid JSON, five fields and correct request type. First-turn complete tickets are 5/8. Policy answer quality is 22/25 in an AI-assisted retrospective review, with human spot checking still pending. Automated engineering checks are 30/30. The informal offline diagnostic is 7/12. These measures assess different capabilities and must not be combined into one accuracy rate.</w:t>
+        <w:t>Ticket structural pass rate is 8/8 for valid JSON, five fields and correct request type. First-turn complete tickets are 5/8. Policy answer quality is 22/25 in an AI-assisted retrospective review. A manual student spot check passes 8/10 answers (80%); it is not independent HR review. Automated engineering checks are 30/30. The informal offline diagnostic is 7/12. These measures assess different capabilities and must not be combined into one accuracy rate.</w:t>
       </w:r>
     </w:p>
     <w:p>

</xml_diff>

<commit_message>
Use monochrome tables in final report
</commit_message>
<xml_diff>
--- a/docs/Final_Report.docx
+++ b/docs/Final_Report.docx
@@ -90,7 +90,7 @@
       <w:tblPr>
         <w:tblW w:type="auto" w:w="0"/>
         <w:tblLayout w:type="fixed"/>
-        <w:tblLook w:firstColumn="1" w:firstRow="1" w:lastColumn="0" w:lastRow="0" w:noHBand="0" w:noVBand="1" w:val="04A0"/>
+        <w:tblLook w:firstColumn="1" w:firstRow="1" w:lastColumn="0" w:lastRow="0" w:noHBand="1" w:noVBand="1" w:val="04A0"/>
       </w:tblPr>
       <w:tblGrid>
         <w:gridCol w:w="1944"/>
@@ -105,12 +105,13 @@
             <w:tcW w:type="dxa" w:w="1944"/>
             <w:vAlign w:val="center"/>
             <w:tcBorders>
-              <w:top w:val="single" w:sz="4" w:color="D9D9D9"/>
-              <w:left w:val="single" w:sz="4" w:color="D9D9D9"/>
-              <w:bottom w:val="single" w:sz="4" w:color="D9D9D9"/>
-              <w:right w:val="single" w:sz="4" w:color="D9D9D9"/>
+              <w:top w:val="single" w:sz="4" w:color="000000" w:space="0"/>
+              <w:left w:val="single" w:sz="4" w:color="000000" w:space="0"/>
+              <w:bottom w:val="single" w:sz="4" w:color="000000" w:space="0"/>
+              <w:right w:val="single" w:sz="4" w:color="000000" w:space="0"/>
+              <w:insideH w:val="single" w:sz="4" w:space="0" w:color="000000"/>
+              <w:insideV w:val="single" w:sz="4" w:space="0" w:color="000000"/>
             </w:tcBorders>
-            <w:shd w:fill="E4EBF0"/>
             <w:tcMar>
               <w:top w:w="90" w:type="dxa"/>
               <w:left w:w="90" w:type="dxa"/>
@@ -125,6 +126,7 @@
             <w:r>
               <w:rPr>
                 <w:b/>
+                <w:color w:val="000000"/>
                 <w:sz w:val="18"/>
               </w:rPr>
               <w:t>Component</w:t>
@@ -136,12 +138,13 @@
             <w:tcW w:type="dxa" w:w="7272"/>
             <w:vAlign w:val="center"/>
             <w:tcBorders>
-              <w:top w:val="single" w:sz="4" w:color="D9D9D9"/>
-              <w:left w:val="single" w:sz="4" w:color="D9D9D9"/>
-              <w:bottom w:val="single" w:sz="4" w:color="D9D9D9"/>
-              <w:right w:val="single" w:sz="4" w:color="D9D9D9"/>
+              <w:top w:val="single" w:sz="4" w:color="000000" w:space="0"/>
+              <w:left w:val="single" w:sz="4" w:color="000000" w:space="0"/>
+              <w:bottom w:val="single" w:sz="4" w:color="000000" w:space="0"/>
+              <w:right w:val="single" w:sz="4" w:color="000000" w:space="0"/>
+              <w:insideH w:val="single" w:sz="4" w:space="0" w:color="000000"/>
+              <w:insideV w:val="single" w:sz="4" w:space="0" w:color="000000"/>
             </w:tcBorders>
-            <w:shd w:fill="E4EBF0"/>
             <w:tcMar>
               <w:top w:w="90" w:type="dxa"/>
               <w:left w:w="90" w:type="dxa"/>
@@ -156,6 +159,7 @@
             <w:r>
               <w:rPr>
                 <w:b/>
+                <w:color w:val="000000"/>
                 <w:sz w:val="18"/>
               </w:rPr>
               <w:t>Implemented behavior</w:t>
@@ -169,12 +173,13 @@
             <w:tcW w:type="dxa" w:w="1944"/>
             <w:vAlign w:val="center"/>
             <w:tcBorders>
-              <w:top w:val="single" w:sz="4" w:color="D9D9D9"/>
-              <w:left w:val="single" w:sz="4" w:color="D9D9D9"/>
-              <w:bottom w:val="single" w:sz="4" w:color="D9D9D9"/>
-              <w:right w:val="single" w:sz="4" w:color="D9D9D9"/>
+              <w:top w:val="single" w:sz="4" w:color="000000" w:space="0"/>
+              <w:left w:val="single" w:sz="4" w:color="000000" w:space="0"/>
+              <w:bottom w:val="single" w:sz="4" w:color="000000" w:space="0"/>
+              <w:right w:val="single" w:sz="4" w:color="000000" w:space="0"/>
+              <w:insideH w:val="single" w:sz="4" w:space="0" w:color="000000"/>
+              <w:insideV w:val="single" w:sz="4" w:space="0" w:color="000000"/>
             </w:tcBorders>
-            <w:shd w:fill="FFFFFF"/>
             <w:tcMar>
               <w:top w:w="90" w:type="dxa"/>
               <w:left w:w="90" w:type="dxa"/>
@@ -189,6 +194,7 @@
             <w:r>
               <w:rPr>
                 <w:b w:val="0"/>
+                <w:color w:val="000000"/>
                 <w:sz w:val="18"/>
               </w:rPr>
               <w:t>Policy knowledge</w:t>
@@ -200,12 +206,13 @@
             <w:tcW w:type="dxa" w:w="7272"/>
             <w:vAlign w:val="center"/>
             <w:tcBorders>
-              <w:top w:val="single" w:sz="4" w:color="D9D9D9"/>
-              <w:left w:val="single" w:sz="4" w:color="D9D9D9"/>
-              <w:bottom w:val="single" w:sz="4" w:color="D9D9D9"/>
-              <w:right w:val="single" w:sz="4" w:color="D9D9D9"/>
+              <w:top w:val="single" w:sz="4" w:color="000000" w:space="0"/>
+              <w:left w:val="single" w:sz="4" w:color="000000" w:space="0"/>
+              <w:bottom w:val="single" w:sz="4" w:color="000000" w:space="0"/>
+              <w:right w:val="single" w:sz="4" w:color="000000" w:space="0"/>
+              <w:insideH w:val="single" w:sz="4" w:space="0" w:color="000000"/>
+              <w:insideV w:val="single" w:sz="4" w:space="0" w:color="000000"/>
             </w:tcBorders>
-            <w:shd w:fill="FFFFFF"/>
             <w:tcMar>
               <w:top w:w="90" w:type="dxa"/>
               <w:left w:w="90" w:type="dxa"/>
@@ -220,6 +227,7 @@
             <w:r>
               <w:rPr>
                 <w:b w:val="0"/>
+                <w:color w:val="000000"/>
                 <w:sz w:val="18"/>
               </w:rPr>
               <w:t>Five Markdown policy files with 20 sections. Effective-date and version checks select usable policies; equal-date conflicts stop loading.</w:t>
@@ -233,12 +241,13 @@
             <w:tcW w:type="dxa" w:w="1944"/>
             <w:vAlign w:val="center"/>
             <w:tcBorders>
-              <w:top w:val="single" w:sz="4" w:color="D9D9D9"/>
-              <w:left w:val="single" w:sz="4" w:color="D9D9D9"/>
-              <w:bottom w:val="single" w:sz="4" w:color="D9D9D9"/>
-              <w:right w:val="single" w:sz="4" w:color="D9D9D9"/>
+              <w:top w:val="single" w:sz="4" w:color="000000" w:space="0"/>
+              <w:left w:val="single" w:sz="4" w:color="000000" w:space="0"/>
+              <w:bottom w:val="single" w:sz="4" w:color="000000" w:space="0"/>
+              <w:right w:val="single" w:sz="4" w:color="000000" w:space="0"/>
+              <w:insideH w:val="single" w:sz="4" w:space="0" w:color="000000"/>
+              <w:insideV w:val="single" w:sz="4" w:space="0" w:color="000000"/>
             </w:tcBorders>
-            <w:shd w:fill="FFFFFF"/>
             <w:tcMar>
               <w:top w:w="90" w:type="dxa"/>
               <w:left w:w="90" w:type="dxa"/>
@@ -253,6 +262,7 @@
             <w:r>
               <w:rPr>
                 <w:b w:val="0"/>
+                <w:color w:val="000000"/>
                 <w:sz w:val="18"/>
               </w:rPr>
               <w:t>Retrieval</w:t>
@@ -264,12 +274,13 @@
             <w:tcW w:type="dxa" w:w="7272"/>
             <w:vAlign w:val="center"/>
             <w:tcBorders>
-              <w:top w:val="single" w:sz="4" w:color="D9D9D9"/>
-              <w:left w:val="single" w:sz="4" w:color="D9D9D9"/>
-              <w:bottom w:val="single" w:sz="4" w:color="D9D9D9"/>
-              <w:right w:val="single" w:sz="4" w:color="D9D9D9"/>
+              <w:top w:val="single" w:sz="4" w:color="000000" w:space="0"/>
+              <w:left w:val="single" w:sz="4" w:color="000000" w:space="0"/>
+              <w:bottom w:val="single" w:sz="4" w:color="000000" w:space="0"/>
+              <w:right w:val="single" w:sz="4" w:color="000000" w:space="0"/>
+              <w:insideH w:val="single" w:sz="4" w:space="0" w:color="000000"/>
+              <w:insideV w:val="single" w:sz="4" w:space="0" w:color="000000"/>
             </w:tcBorders>
-            <w:shd w:fill="FFFFFF"/>
             <w:tcMar>
               <w:top w:w="90" w:type="dxa"/>
               <w:left w:w="90" w:type="dxa"/>
@@ -284,6 +295,7 @@
             <w:r>
               <w:rPr>
                 <w:b w:val="0"/>
+                <w:color w:val="000000"/>
                 <w:sz w:val="18"/>
               </w:rPr>
               <w:t>Chinese bigrams, English tokens, aliases, TF-IDF and cosine similarity. Retrieve up to three relevant sections with source IDs.</w:t>
@@ -297,12 +309,13 @@
             <w:tcW w:type="dxa" w:w="1944"/>
             <w:vAlign w:val="center"/>
             <w:tcBorders>
-              <w:top w:val="single" w:sz="4" w:color="D9D9D9"/>
-              <w:left w:val="single" w:sz="4" w:color="D9D9D9"/>
-              <w:bottom w:val="single" w:sz="4" w:color="D9D9D9"/>
-              <w:right w:val="single" w:sz="4" w:color="D9D9D9"/>
+              <w:top w:val="single" w:sz="4" w:color="000000" w:space="0"/>
+              <w:left w:val="single" w:sz="4" w:color="000000" w:space="0"/>
+              <w:bottom w:val="single" w:sz="4" w:color="000000" w:space="0"/>
+              <w:right w:val="single" w:sz="4" w:color="000000" w:space="0"/>
+              <w:insideH w:val="single" w:sz="4" w:space="0" w:color="000000"/>
+              <w:insideV w:val="single" w:sz="4" w:space="0" w:color="000000"/>
             </w:tcBorders>
-            <w:shd w:fill="FFFFFF"/>
             <w:tcMar>
               <w:top w:w="90" w:type="dxa"/>
               <w:left w:w="90" w:type="dxa"/>
@@ -317,6 +330,7 @@
             <w:r>
               <w:rPr>
                 <w:b w:val="0"/>
+                <w:color w:val="000000"/>
                 <w:sz w:val="18"/>
               </w:rPr>
               <w:t>Routing</w:t>
@@ -328,12 +342,13 @@
             <w:tcW w:type="dxa" w:w="7272"/>
             <w:vAlign w:val="center"/>
             <w:tcBorders>
-              <w:top w:val="single" w:sz="4" w:color="D9D9D9"/>
-              <w:left w:val="single" w:sz="4" w:color="D9D9D9"/>
-              <w:bottom w:val="single" w:sz="4" w:color="D9D9D9"/>
-              <w:right w:val="single" w:sz="4" w:color="D9D9D9"/>
+              <w:top w:val="single" w:sz="4" w:color="000000" w:space="0"/>
+              <w:left w:val="single" w:sz="4" w:color="000000" w:space="0"/>
+              <w:bottom w:val="single" w:sz="4" w:color="000000" w:space="0"/>
+              <w:right w:val="single" w:sz="4" w:color="000000" w:space="0"/>
+              <w:insideH w:val="single" w:sz="4" w:space="0" w:color="000000"/>
+              <w:insideV w:val="single" w:sz="4" w:space="0" w:color="000000"/>
             </w:tcBorders>
-            <w:shd w:fill="FFFFFF"/>
             <w:tcMar>
               <w:top w:w="90" w:type="dxa"/>
               <w:left w:w="90" w:type="dxa"/>
@@ -348,6 +363,7 @@
             <w:r>
               <w:rPr>
                 <w:b w:val="0"/>
+                <w:color w:val="000000"/>
                 <w:sz w:val="18"/>
               </w:rPr>
               <w:t>Consult, draft, clarify or escalate. A local gate restricts drafting; the model can retain drafting or route more conservatively.</w:t>
@@ -361,12 +377,13 @@
             <w:tcW w:type="dxa" w:w="1944"/>
             <w:vAlign w:val="center"/>
             <w:tcBorders>
-              <w:top w:val="single" w:sz="4" w:color="D9D9D9"/>
-              <w:left w:val="single" w:sz="4" w:color="D9D9D9"/>
-              <w:bottom w:val="single" w:sz="4" w:color="D9D9D9"/>
-              <w:right w:val="single" w:sz="4" w:color="D9D9D9"/>
+              <w:top w:val="single" w:sz="4" w:color="000000" w:space="0"/>
+              <w:left w:val="single" w:sz="4" w:color="000000" w:space="0"/>
+              <w:bottom w:val="single" w:sz="4" w:color="000000" w:space="0"/>
+              <w:right w:val="single" w:sz="4" w:color="000000" w:space="0"/>
+              <w:insideH w:val="single" w:sz="4" w:space="0" w:color="000000"/>
+              <w:insideV w:val="single" w:sz="4" w:space="0" w:color="000000"/>
             </w:tcBorders>
-            <w:shd w:fill="FFFFFF"/>
             <w:tcMar>
               <w:top w:w="90" w:type="dxa"/>
               <w:left w:w="90" w:type="dxa"/>
@@ -381,6 +398,7 @@
             <w:r>
               <w:rPr>
                 <w:b w:val="0"/>
+                <w:color w:val="000000"/>
                 <w:sz w:val="18"/>
               </w:rPr>
               <w:t>Generation</w:t>
@@ -392,12 +410,13 @@
             <w:tcW w:type="dxa" w:w="7272"/>
             <w:vAlign w:val="center"/>
             <w:tcBorders>
-              <w:top w:val="single" w:sz="4" w:color="D9D9D9"/>
-              <w:left w:val="single" w:sz="4" w:color="D9D9D9"/>
-              <w:bottom w:val="single" w:sz="4" w:color="D9D9D9"/>
-              <w:right w:val="single" w:sz="4" w:color="D9D9D9"/>
+              <w:top w:val="single" w:sz="4" w:color="000000" w:space="0"/>
+              <w:left w:val="single" w:sz="4" w:color="000000" w:space="0"/>
+              <w:bottom w:val="single" w:sz="4" w:color="000000" w:space="0"/>
+              <w:right w:val="single" w:sz="4" w:color="000000" w:space="0"/>
+              <w:insideH w:val="single" w:sz="4" w:space="0" w:color="000000"/>
+              <w:insideV w:val="single" w:sz="4" w:space="0" w:color="000000"/>
             </w:tcBorders>
-            <w:shd w:fill="FFFFFF"/>
             <w:tcMar>
               <w:top w:w="90" w:type="dxa"/>
               <w:left w:w="90" w:type="dxa"/>
@@ -412,6 +431,7 @@
             <w:r>
               <w:rPr>
                 <w:b w:val="0"/>
+                <w:color w:val="000000"/>
                 <w:sz w:val="18"/>
               </w:rPr>
               <w:t>Local mode returns excerpts. OpenRouter mode uses retrieved evidence and a structured response schema. Actual execution mode and API errors remain visible.</w:t>
@@ -425,12 +445,13 @@
             <w:tcW w:type="dxa" w:w="1944"/>
             <w:vAlign w:val="center"/>
             <w:tcBorders>
-              <w:top w:val="single" w:sz="4" w:color="D9D9D9"/>
-              <w:left w:val="single" w:sz="4" w:color="D9D9D9"/>
-              <w:bottom w:val="single" w:sz="4" w:color="D9D9D9"/>
-              <w:right w:val="single" w:sz="4" w:color="D9D9D9"/>
+              <w:top w:val="single" w:sz="4" w:color="000000" w:space="0"/>
+              <w:left w:val="single" w:sz="4" w:color="000000" w:space="0"/>
+              <w:bottom w:val="single" w:sz="4" w:color="000000" w:space="0"/>
+              <w:right w:val="single" w:sz="4" w:color="000000" w:space="0"/>
+              <w:insideH w:val="single" w:sz="4" w:space="0" w:color="000000"/>
+              <w:insideV w:val="single" w:sz="4" w:space="0" w:color="000000"/>
             </w:tcBorders>
-            <w:shd w:fill="FFFFFF"/>
             <w:tcMar>
               <w:top w:w="90" w:type="dxa"/>
               <w:left w:w="90" w:type="dxa"/>
@@ -445,6 +466,7 @@
             <w:r>
               <w:rPr>
                 <w:b w:val="0"/>
+                <w:color w:val="000000"/>
                 <w:sz w:val="18"/>
               </w:rPr>
               <w:t>Draft validation</w:t>
@@ -456,12 +478,13 @@
             <w:tcW w:type="dxa" w:w="7272"/>
             <w:vAlign w:val="center"/>
             <w:tcBorders>
-              <w:top w:val="single" w:sz="4" w:color="D9D9D9"/>
-              <w:left w:val="single" w:sz="4" w:color="D9D9D9"/>
-              <w:bottom w:val="single" w:sz="4" w:color="D9D9D9"/>
-              <w:right w:val="single" w:sz="4" w:color="D9D9D9"/>
+              <w:top w:val="single" w:sz="4" w:color="000000" w:space="0"/>
+              <w:left w:val="single" w:sz="4" w:color="000000" w:space="0"/>
+              <w:bottom w:val="single" w:sz="4" w:color="000000" w:space="0"/>
+              <w:right w:val="single" w:sz="4" w:color="000000" w:space="0"/>
+              <w:insideH w:val="single" w:sz="4" w:space="0" w:color="000000"/>
+              <w:insideV w:val="single" w:sz="4" w:space="0" w:color="000000"/>
             </w:tcBorders>
-            <w:shd w:fill="FFFFFF"/>
             <w:tcMar>
               <w:top w:w="90" w:type="dxa"/>
               <w:left w:w="90" w:type="dxa"/>
@@ -476,6 +499,7 @@
             <w:r>
               <w:rPr>
                 <w:b w:val="0"/>
+                <w:color w:val="000000"/>
                 <w:sz w:val="18"/>
               </w:rPr>
               <w:t>employee_id, request_type, requested_date, reason, contact_channel. Missing values stay null; dates and field formats are validated. Drafts remain unsubmitted.</w:t>
@@ -546,7 +570,7 @@
       <w:tblPr>
         <w:tblW w:type="auto" w:w="0"/>
         <w:tblLayout w:type="fixed"/>
-        <w:tblLook w:firstColumn="1" w:firstRow="1" w:lastColumn="0" w:lastRow="0" w:noHBand="0" w:noVBand="1" w:val="04A0"/>
+        <w:tblLook w:firstColumn="1" w:firstRow="1" w:lastColumn="0" w:lastRow="0" w:noHBand="1" w:noVBand="1" w:val="04A0"/>
       </w:tblPr>
       <w:tblGrid>
         <w:gridCol w:w="4032"/>
@@ -563,12 +587,13 @@
             <w:tcW w:type="dxa" w:w="4032"/>
             <w:vAlign w:val="center"/>
             <w:tcBorders>
-              <w:top w:val="single" w:sz="4" w:color="D9D9D9"/>
-              <w:left w:val="single" w:sz="4" w:color="D9D9D9"/>
-              <w:bottom w:val="single" w:sz="4" w:color="D9D9D9"/>
-              <w:right w:val="single" w:sz="4" w:color="D9D9D9"/>
+              <w:top w:val="single" w:sz="4" w:color="000000" w:space="0"/>
+              <w:left w:val="single" w:sz="4" w:color="000000" w:space="0"/>
+              <w:bottom w:val="single" w:sz="4" w:color="000000" w:space="0"/>
+              <w:right w:val="single" w:sz="4" w:color="000000" w:space="0"/>
+              <w:insideH w:val="single" w:sz="4" w:space="0" w:color="000000"/>
+              <w:insideV w:val="single" w:sz="4" w:space="0" w:color="000000"/>
             </w:tcBorders>
-            <w:shd w:fill="E4EBF0"/>
             <w:tcMar>
               <w:top w:w="90" w:type="dxa"/>
               <w:left w:w="90" w:type="dxa"/>
@@ -583,6 +608,7 @@
             <w:r>
               <w:rPr>
                 <w:b/>
+                <w:color w:val="000000"/>
                 <w:sz w:val="18"/>
               </w:rPr>
               <w:t>Metric</w:t>
@@ -594,12 +620,13 @@
             <w:tcW w:type="dxa" w:w="1656"/>
             <w:vAlign w:val="center"/>
             <w:tcBorders>
-              <w:top w:val="single" w:sz="4" w:color="D9D9D9"/>
-              <w:left w:val="single" w:sz="4" w:color="D9D9D9"/>
-              <w:bottom w:val="single" w:sz="4" w:color="D9D9D9"/>
-              <w:right w:val="single" w:sz="4" w:color="D9D9D9"/>
+              <w:top w:val="single" w:sz="4" w:color="000000" w:space="0"/>
+              <w:left w:val="single" w:sz="4" w:color="000000" w:space="0"/>
+              <w:bottom w:val="single" w:sz="4" w:color="000000" w:space="0"/>
+              <w:right w:val="single" w:sz="4" w:color="000000" w:space="0"/>
+              <w:insideH w:val="single" w:sz="4" w:space="0" w:color="000000"/>
+              <w:insideV w:val="single" w:sz="4" w:space="0" w:color="000000"/>
             </w:tcBorders>
-            <w:shd w:fill="E4EBF0"/>
             <w:tcMar>
               <w:top w:w="90" w:type="dxa"/>
               <w:left w:w="90" w:type="dxa"/>
@@ -614,6 +641,7 @@
             <w:r>
               <w:rPr>
                 <w:b/>
+                <w:color w:val="000000"/>
                 <w:sz w:val="18"/>
               </w:rPr>
               <w:t>Live before</w:t>
@@ -625,12 +653,13 @@
             <w:tcW w:type="dxa" w:w="1656"/>
             <w:vAlign w:val="center"/>
             <w:tcBorders>
-              <w:top w:val="single" w:sz="4" w:color="D9D9D9"/>
-              <w:left w:val="single" w:sz="4" w:color="D9D9D9"/>
-              <w:bottom w:val="single" w:sz="4" w:color="D9D9D9"/>
-              <w:right w:val="single" w:sz="4" w:color="D9D9D9"/>
+              <w:top w:val="single" w:sz="4" w:color="000000" w:space="0"/>
+              <w:left w:val="single" w:sz="4" w:color="000000" w:space="0"/>
+              <w:bottom w:val="single" w:sz="4" w:color="000000" w:space="0"/>
+              <w:right w:val="single" w:sz="4" w:color="000000" w:space="0"/>
+              <w:insideH w:val="single" w:sz="4" w:space="0" w:color="000000"/>
+              <w:insideV w:val="single" w:sz="4" w:space="0" w:color="000000"/>
             </w:tcBorders>
-            <w:shd w:fill="E4EBF0"/>
             <w:tcMar>
               <w:top w:w="90" w:type="dxa"/>
               <w:left w:w="90" w:type="dxa"/>
@@ -645,6 +674,7 @@
             <w:r>
               <w:rPr>
                 <w:b/>
+                <w:color w:val="000000"/>
                 <w:sz w:val="18"/>
               </w:rPr>
               <w:t>Live revised</w:t>
@@ -656,12 +686,13 @@
             <w:tcW w:type="dxa" w:w="1872"/>
             <w:vAlign w:val="center"/>
             <w:tcBorders>
-              <w:top w:val="single" w:sz="4" w:color="D9D9D9"/>
-              <w:left w:val="single" w:sz="4" w:color="D9D9D9"/>
-              <w:bottom w:val="single" w:sz="4" w:color="D9D9D9"/>
-              <w:right w:val="single" w:sz="4" w:color="D9D9D9"/>
+              <w:top w:val="single" w:sz="4" w:color="000000" w:space="0"/>
+              <w:left w:val="single" w:sz="4" w:color="000000" w:space="0"/>
+              <w:bottom w:val="single" w:sz="4" w:color="000000" w:space="0"/>
+              <w:right w:val="single" w:sz="4" w:color="000000" w:space="0"/>
+              <w:insideH w:val="single" w:sz="4" w:space="0" w:color="000000"/>
+              <w:insideV w:val="single" w:sz="4" w:space="0" w:color="000000"/>
             </w:tcBorders>
-            <w:shd w:fill="E4EBF0"/>
             <w:tcMar>
               <w:top w:w="90" w:type="dxa"/>
               <w:left w:w="90" w:type="dxa"/>
@@ -676,6 +707,7 @@
             <w:r>
               <w:rPr>
                 <w:b/>
+                <w:color w:val="000000"/>
                 <w:sz w:val="18"/>
               </w:rPr>
               <w:t>Offline challenge</w:t>
@@ -689,12 +721,13 @@
             <w:tcW w:type="dxa" w:w="4032"/>
             <w:vAlign w:val="center"/>
             <w:tcBorders>
-              <w:top w:val="single" w:sz="4" w:color="D9D9D9"/>
-              <w:left w:val="single" w:sz="4" w:color="D9D9D9"/>
-              <w:bottom w:val="single" w:sz="4" w:color="D9D9D9"/>
-              <w:right w:val="single" w:sz="4" w:color="D9D9D9"/>
+              <w:top w:val="single" w:sz="4" w:color="000000" w:space="0"/>
+              <w:left w:val="single" w:sz="4" w:color="000000" w:space="0"/>
+              <w:bottom w:val="single" w:sz="4" w:color="000000" w:space="0"/>
+              <w:right w:val="single" w:sz="4" w:color="000000" w:space="0"/>
+              <w:insideH w:val="single" w:sz="4" w:space="0" w:color="000000"/>
+              <w:insideV w:val="single" w:sz="4" w:space="0" w:color="000000"/>
             </w:tcBorders>
-            <w:shd w:fill="FFFFFF"/>
             <w:tcMar>
               <w:top w:w="90" w:type="dxa"/>
               <w:left w:w="90" w:type="dxa"/>
@@ -709,6 +742,7 @@
             <w:r>
               <w:rPr>
                 <w:b w:val="0"/>
+                <w:color w:val="000000"/>
                 <w:sz w:val="18"/>
               </w:rPr>
               <w:t>Actual model responses</w:t>
@@ -720,12 +754,13 @@
             <w:tcW w:type="dxa" w:w="1656"/>
             <w:vAlign w:val="center"/>
             <w:tcBorders>
-              <w:top w:val="single" w:sz="4" w:color="D9D9D9"/>
-              <w:left w:val="single" w:sz="4" w:color="D9D9D9"/>
-              <w:bottom w:val="single" w:sz="4" w:color="D9D9D9"/>
-              <w:right w:val="single" w:sz="4" w:color="D9D9D9"/>
+              <w:top w:val="single" w:sz="4" w:color="000000" w:space="0"/>
+              <w:left w:val="single" w:sz="4" w:color="000000" w:space="0"/>
+              <w:bottom w:val="single" w:sz="4" w:color="000000" w:space="0"/>
+              <w:right w:val="single" w:sz="4" w:color="000000" w:space="0"/>
+              <w:insideH w:val="single" w:sz="4" w:space="0" w:color="000000"/>
+              <w:insideV w:val="single" w:sz="4" w:space="0" w:color="000000"/>
             </w:tcBorders>
-            <w:shd w:fill="FFFFFF"/>
             <w:tcMar>
               <w:top w:w="90" w:type="dxa"/>
               <w:left w:w="90" w:type="dxa"/>
@@ -740,6 +775,7 @@
             <w:r>
               <w:rPr>
                 <w:b w:val="0"/>
+                <w:color w:val="000000"/>
                 <w:sz w:val="18"/>
               </w:rPr>
               <w:t>25</w:t>
@@ -751,12 +787,13 @@
             <w:tcW w:type="dxa" w:w="1656"/>
             <w:vAlign w:val="center"/>
             <w:tcBorders>
-              <w:top w:val="single" w:sz="4" w:color="D9D9D9"/>
-              <w:left w:val="single" w:sz="4" w:color="D9D9D9"/>
-              <w:bottom w:val="single" w:sz="4" w:color="D9D9D9"/>
-              <w:right w:val="single" w:sz="4" w:color="D9D9D9"/>
+              <w:top w:val="single" w:sz="4" w:color="000000" w:space="0"/>
+              <w:left w:val="single" w:sz="4" w:color="000000" w:space="0"/>
+              <w:bottom w:val="single" w:sz="4" w:color="000000" w:space="0"/>
+              <w:right w:val="single" w:sz="4" w:color="000000" w:space="0"/>
+              <w:insideH w:val="single" w:sz="4" w:space="0" w:color="000000"/>
+              <w:insideV w:val="single" w:sz="4" w:space="0" w:color="000000"/>
             </w:tcBorders>
-            <w:shd w:fill="FFFFFF"/>
             <w:tcMar>
               <w:top w:w="90" w:type="dxa"/>
               <w:left w:w="90" w:type="dxa"/>
@@ -771,6 +808,7 @@
             <w:r>
               <w:rPr>
                 <w:b w:val="0"/>
+                <w:color w:val="000000"/>
                 <w:sz w:val="18"/>
               </w:rPr>
               <w:t>25</w:t>
@@ -782,12 +820,13 @@
             <w:tcW w:type="dxa" w:w="1872"/>
             <w:vAlign w:val="center"/>
             <w:tcBorders>
-              <w:top w:val="single" w:sz="4" w:color="D9D9D9"/>
-              <w:left w:val="single" w:sz="4" w:color="D9D9D9"/>
-              <w:bottom w:val="single" w:sz="4" w:color="D9D9D9"/>
-              <w:right w:val="single" w:sz="4" w:color="D9D9D9"/>
+              <w:top w:val="single" w:sz="4" w:color="000000" w:space="0"/>
+              <w:left w:val="single" w:sz="4" w:color="000000" w:space="0"/>
+              <w:bottom w:val="single" w:sz="4" w:color="000000" w:space="0"/>
+              <w:right w:val="single" w:sz="4" w:color="000000" w:space="0"/>
+              <w:insideH w:val="single" w:sz="4" w:space="0" w:color="000000"/>
+              <w:insideV w:val="single" w:sz="4" w:space="0" w:color="000000"/>
             </w:tcBorders>
-            <w:shd w:fill="FFFFFF"/>
             <w:tcMar>
               <w:top w:w="90" w:type="dxa"/>
               <w:left w:w="90" w:type="dxa"/>
@@ -802,6 +841,7 @@
             <w:r>
               <w:rPr>
                 <w:b w:val="0"/>
+                <w:color w:val="000000"/>
                 <w:sz w:val="18"/>
               </w:rPr>
               <w:t>0</w:t>
@@ -815,12 +855,13 @@
             <w:tcW w:type="dxa" w:w="4032"/>
             <w:vAlign w:val="center"/>
             <w:tcBorders>
-              <w:top w:val="single" w:sz="4" w:color="D9D9D9"/>
-              <w:left w:val="single" w:sz="4" w:color="D9D9D9"/>
-              <w:bottom w:val="single" w:sz="4" w:color="D9D9D9"/>
-              <w:right w:val="single" w:sz="4" w:color="D9D9D9"/>
+              <w:top w:val="single" w:sz="4" w:color="000000" w:space="0"/>
+              <w:left w:val="single" w:sz="4" w:color="000000" w:space="0"/>
+              <w:bottom w:val="single" w:sz="4" w:color="000000" w:space="0"/>
+              <w:right w:val="single" w:sz="4" w:color="000000" w:space="0"/>
+              <w:insideH w:val="single" w:sz="4" w:space="0" w:color="000000"/>
+              <w:insideV w:val="single" w:sz="4" w:space="0" w:color="000000"/>
             </w:tcBorders>
-            <w:shd w:fill="FFFFFF"/>
             <w:tcMar>
               <w:top w:w="90" w:type="dxa"/>
               <w:left w:w="90" w:type="dxa"/>
@@ -835,6 +876,7 @@
             <w:r>
               <w:rPr>
                 <w:b w:val="0"/>
+                <w:color w:val="000000"/>
                 <w:sz w:val="18"/>
               </w:rPr>
               <w:t>Intent accuracy</w:t>
@@ -846,12 +888,13 @@
             <w:tcW w:type="dxa" w:w="1656"/>
             <w:vAlign w:val="center"/>
             <w:tcBorders>
-              <w:top w:val="single" w:sz="4" w:color="D9D9D9"/>
-              <w:left w:val="single" w:sz="4" w:color="D9D9D9"/>
-              <w:bottom w:val="single" w:sz="4" w:color="D9D9D9"/>
-              <w:right w:val="single" w:sz="4" w:color="D9D9D9"/>
+              <w:top w:val="single" w:sz="4" w:color="000000" w:space="0"/>
+              <w:left w:val="single" w:sz="4" w:color="000000" w:space="0"/>
+              <w:bottom w:val="single" w:sz="4" w:color="000000" w:space="0"/>
+              <w:right w:val="single" w:sz="4" w:color="000000" w:space="0"/>
+              <w:insideH w:val="single" w:sz="4" w:space="0" w:color="000000"/>
+              <w:insideV w:val="single" w:sz="4" w:space="0" w:color="000000"/>
             </w:tcBorders>
-            <w:shd w:fill="FFFFFF"/>
             <w:tcMar>
               <w:top w:w="90" w:type="dxa"/>
               <w:left w:w="90" w:type="dxa"/>
@@ -866,6 +909,7 @@
             <w:r>
               <w:rPr>
                 <w:b w:val="0"/>
+                <w:color w:val="000000"/>
                 <w:sz w:val="18"/>
               </w:rPr>
               <w:t>22/30</w:t>
@@ -877,12 +921,13 @@
             <w:tcW w:type="dxa" w:w="1656"/>
             <w:vAlign w:val="center"/>
             <w:tcBorders>
-              <w:top w:val="single" w:sz="4" w:color="D9D9D9"/>
-              <w:left w:val="single" w:sz="4" w:color="D9D9D9"/>
-              <w:bottom w:val="single" w:sz="4" w:color="D9D9D9"/>
-              <w:right w:val="single" w:sz="4" w:color="D9D9D9"/>
+              <w:top w:val="single" w:sz="4" w:color="000000" w:space="0"/>
+              <w:left w:val="single" w:sz="4" w:color="000000" w:space="0"/>
+              <w:bottom w:val="single" w:sz="4" w:color="000000" w:space="0"/>
+              <w:right w:val="single" w:sz="4" w:color="000000" w:space="0"/>
+              <w:insideH w:val="single" w:sz="4" w:space="0" w:color="000000"/>
+              <w:insideV w:val="single" w:sz="4" w:space="0" w:color="000000"/>
             </w:tcBorders>
-            <w:shd w:fill="FFFFFF"/>
             <w:tcMar>
               <w:top w:w="90" w:type="dxa"/>
               <w:left w:w="90" w:type="dxa"/>
@@ -897,6 +942,7 @@
             <w:r>
               <w:rPr>
                 <w:b w:val="0"/>
+                <w:color w:val="000000"/>
                 <w:sz w:val="18"/>
               </w:rPr>
               <w:t>30/30</w:t>
@@ -908,12 +954,13 @@
             <w:tcW w:type="dxa" w:w="1872"/>
             <w:vAlign w:val="center"/>
             <w:tcBorders>
-              <w:top w:val="single" w:sz="4" w:color="D9D9D9"/>
-              <w:left w:val="single" w:sz="4" w:color="D9D9D9"/>
-              <w:bottom w:val="single" w:sz="4" w:color="D9D9D9"/>
-              <w:right w:val="single" w:sz="4" w:color="D9D9D9"/>
+              <w:top w:val="single" w:sz="4" w:color="000000" w:space="0"/>
+              <w:left w:val="single" w:sz="4" w:color="000000" w:space="0"/>
+              <w:bottom w:val="single" w:sz="4" w:color="000000" w:space="0"/>
+              <w:right w:val="single" w:sz="4" w:color="000000" w:space="0"/>
+              <w:insideH w:val="single" w:sz="4" w:space="0" w:color="000000"/>
+              <w:insideV w:val="single" w:sz="4" w:space="0" w:color="000000"/>
             </w:tcBorders>
-            <w:shd w:fill="FFFFFF"/>
             <w:tcMar>
               <w:top w:w="90" w:type="dxa"/>
               <w:left w:w="90" w:type="dxa"/>
@@ -928,6 +975,7 @@
             <w:r>
               <w:rPr>
                 <w:b w:val="0"/>
+                <w:color w:val="000000"/>
                 <w:sz w:val="18"/>
               </w:rPr>
               <w:t>10/12</w:t>
@@ -941,12 +989,13 @@
             <w:tcW w:type="dxa" w:w="4032"/>
             <w:vAlign w:val="center"/>
             <w:tcBorders>
-              <w:top w:val="single" w:sz="4" w:color="D9D9D9"/>
-              <w:left w:val="single" w:sz="4" w:color="D9D9D9"/>
-              <w:bottom w:val="single" w:sz="4" w:color="D9D9D9"/>
-              <w:right w:val="single" w:sz="4" w:color="D9D9D9"/>
+              <w:top w:val="single" w:sz="4" w:color="000000" w:space="0"/>
+              <w:left w:val="single" w:sz="4" w:color="000000" w:space="0"/>
+              <w:bottom w:val="single" w:sz="4" w:color="000000" w:space="0"/>
+              <w:right w:val="single" w:sz="4" w:color="000000" w:space="0"/>
+              <w:insideH w:val="single" w:sz="4" w:space="0" w:color="000000"/>
+              <w:insideV w:val="single" w:sz="4" w:space="0" w:color="000000"/>
             </w:tcBorders>
-            <w:shd w:fill="FFFFFF"/>
             <w:tcMar>
               <w:top w:w="90" w:type="dxa"/>
               <w:left w:w="90" w:type="dxa"/>
@@ -961,6 +1010,7 @@
             <w:r>
               <w:rPr>
                 <w:b w:val="0"/>
+                <w:color w:val="000000"/>
                 <w:sz w:val="18"/>
               </w:rPr>
               <w:t>Gold section in top three</w:t>
@@ -972,12 +1022,13 @@
             <w:tcW w:type="dxa" w:w="1656"/>
             <w:vAlign w:val="center"/>
             <w:tcBorders>
-              <w:top w:val="single" w:sz="4" w:color="D9D9D9"/>
-              <w:left w:val="single" w:sz="4" w:color="D9D9D9"/>
-              <w:bottom w:val="single" w:sz="4" w:color="D9D9D9"/>
-              <w:right w:val="single" w:sz="4" w:color="D9D9D9"/>
+              <w:top w:val="single" w:sz="4" w:color="000000" w:space="0"/>
+              <w:left w:val="single" w:sz="4" w:color="000000" w:space="0"/>
+              <w:bottom w:val="single" w:sz="4" w:color="000000" w:space="0"/>
+              <w:right w:val="single" w:sz="4" w:color="000000" w:space="0"/>
+              <w:insideH w:val="single" w:sz="4" w:space="0" w:color="000000"/>
+              <w:insideV w:val="single" w:sz="4" w:space="0" w:color="000000"/>
             </w:tcBorders>
-            <w:shd w:fill="FFFFFF"/>
             <w:tcMar>
               <w:top w:w="90" w:type="dxa"/>
               <w:left w:w="90" w:type="dxa"/>
@@ -992,6 +1043,7 @@
             <w:r>
               <w:rPr>
                 <w:b w:val="0"/>
+                <w:color w:val="000000"/>
                 <w:sz w:val="18"/>
               </w:rPr>
               <w:t>25/25</w:t>
@@ -1003,12 +1055,13 @@
             <w:tcW w:type="dxa" w:w="1656"/>
             <w:vAlign w:val="center"/>
             <w:tcBorders>
-              <w:top w:val="single" w:sz="4" w:color="D9D9D9"/>
-              <w:left w:val="single" w:sz="4" w:color="D9D9D9"/>
-              <w:bottom w:val="single" w:sz="4" w:color="D9D9D9"/>
-              <w:right w:val="single" w:sz="4" w:color="D9D9D9"/>
+              <w:top w:val="single" w:sz="4" w:color="000000" w:space="0"/>
+              <w:left w:val="single" w:sz="4" w:color="000000" w:space="0"/>
+              <w:bottom w:val="single" w:sz="4" w:color="000000" w:space="0"/>
+              <w:right w:val="single" w:sz="4" w:color="000000" w:space="0"/>
+              <w:insideH w:val="single" w:sz="4" w:space="0" w:color="000000"/>
+              <w:insideV w:val="single" w:sz="4" w:space="0" w:color="000000"/>
             </w:tcBorders>
-            <w:shd w:fill="FFFFFF"/>
             <w:tcMar>
               <w:top w:w="90" w:type="dxa"/>
               <w:left w:w="90" w:type="dxa"/>
@@ -1023,6 +1076,7 @@
             <w:r>
               <w:rPr>
                 <w:b w:val="0"/>
+                <w:color w:val="000000"/>
                 <w:sz w:val="18"/>
               </w:rPr>
               <w:t>25/25</w:t>
@@ -1034,12 +1088,13 @@
             <w:tcW w:type="dxa" w:w="1872"/>
             <w:vAlign w:val="center"/>
             <w:tcBorders>
-              <w:top w:val="single" w:sz="4" w:color="D9D9D9"/>
-              <w:left w:val="single" w:sz="4" w:color="D9D9D9"/>
-              <w:bottom w:val="single" w:sz="4" w:color="D9D9D9"/>
-              <w:right w:val="single" w:sz="4" w:color="D9D9D9"/>
+              <w:top w:val="single" w:sz="4" w:color="000000" w:space="0"/>
+              <w:left w:val="single" w:sz="4" w:color="000000" w:space="0"/>
+              <w:bottom w:val="single" w:sz="4" w:color="000000" w:space="0"/>
+              <w:right w:val="single" w:sz="4" w:color="000000" w:space="0"/>
+              <w:insideH w:val="single" w:sz="4" w:space="0" w:color="000000"/>
+              <w:insideV w:val="single" w:sz="4" w:space="0" w:color="000000"/>
             </w:tcBorders>
-            <w:shd w:fill="FFFFFF"/>
             <w:tcMar>
               <w:top w:w="90" w:type="dxa"/>
               <w:left w:w="90" w:type="dxa"/>
@@ -1054,6 +1109,7 @@
             <w:r>
               <w:rPr>
                 <w:b w:val="0"/>
+                <w:color w:val="000000"/>
                 <w:sz w:val="18"/>
               </w:rPr>
               <w:t>8/10</w:t>
@@ -1067,12 +1123,13 @@
             <w:tcW w:type="dxa" w:w="4032"/>
             <w:vAlign w:val="center"/>
             <w:tcBorders>
-              <w:top w:val="single" w:sz="4" w:color="D9D9D9"/>
-              <w:left w:val="single" w:sz="4" w:color="D9D9D9"/>
-              <w:bottom w:val="single" w:sz="4" w:color="D9D9D9"/>
-              <w:right w:val="single" w:sz="4" w:color="D9D9D9"/>
+              <w:top w:val="single" w:sz="4" w:color="000000" w:space="0"/>
+              <w:left w:val="single" w:sz="4" w:color="000000" w:space="0"/>
+              <w:bottom w:val="single" w:sz="4" w:color="000000" w:space="0"/>
+              <w:right w:val="single" w:sz="4" w:color="000000" w:space="0"/>
+              <w:insideH w:val="single" w:sz="4" w:space="0" w:color="000000"/>
+              <w:insideV w:val="single" w:sz="4" w:space="0" w:color="000000"/>
             </w:tcBorders>
-            <w:shd w:fill="FFFFFF"/>
             <w:tcMar>
               <w:top w:w="90" w:type="dxa"/>
               <w:left w:w="90" w:type="dxa"/>
@@ -1087,6 +1144,7 @@
             <w:r>
               <w:rPr>
                 <w:b w:val="0"/>
+                <w:color w:val="000000"/>
                 <w:sz w:val="18"/>
               </w:rPr>
               <w:t>Citation IDs from retrieved sections</w:t>
@@ -1098,12 +1156,13 @@
             <w:tcW w:type="dxa" w:w="1656"/>
             <w:vAlign w:val="center"/>
             <w:tcBorders>
-              <w:top w:val="single" w:sz="4" w:color="D9D9D9"/>
-              <w:left w:val="single" w:sz="4" w:color="D9D9D9"/>
-              <w:bottom w:val="single" w:sz="4" w:color="D9D9D9"/>
-              <w:right w:val="single" w:sz="4" w:color="D9D9D9"/>
+              <w:top w:val="single" w:sz="4" w:color="000000" w:space="0"/>
+              <w:left w:val="single" w:sz="4" w:color="000000" w:space="0"/>
+              <w:bottom w:val="single" w:sz="4" w:color="000000" w:space="0"/>
+              <w:right w:val="single" w:sz="4" w:color="000000" w:space="0"/>
+              <w:insideH w:val="single" w:sz="4" w:space="0" w:color="000000"/>
+              <w:insideV w:val="single" w:sz="4" w:space="0" w:color="000000"/>
             </w:tcBorders>
-            <w:shd w:fill="FFFFFF"/>
             <w:tcMar>
               <w:top w:w="90" w:type="dxa"/>
               <w:left w:w="90" w:type="dxa"/>
@@ -1118,6 +1177,7 @@
             <w:r>
               <w:rPr>
                 <w:b w:val="0"/>
+                <w:color w:val="000000"/>
                 <w:sz w:val="18"/>
               </w:rPr>
               <w:t>25/25</w:t>
@@ -1129,12 +1189,13 @@
             <w:tcW w:type="dxa" w:w="1656"/>
             <w:vAlign w:val="center"/>
             <w:tcBorders>
-              <w:top w:val="single" w:sz="4" w:color="D9D9D9"/>
-              <w:left w:val="single" w:sz="4" w:color="D9D9D9"/>
-              <w:bottom w:val="single" w:sz="4" w:color="D9D9D9"/>
-              <w:right w:val="single" w:sz="4" w:color="D9D9D9"/>
+              <w:top w:val="single" w:sz="4" w:color="000000" w:space="0"/>
+              <w:left w:val="single" w:sz="4" w:color="000000" w:space="0"/>
+              <w:bottom w:val="single" w:sz="4" w:color="000000" w:space="0"/>
+              <w:right w:val="single" w:sz="4" w:color="000000" w:space="0"/>
+              <w:insideH w:val="single" w:sz="4" w:space="0" w:color="000000"/>
+              <w:insideV w:val="single" w:sz="4" w:space="0" w:color="000000"/>
             </w:tcBorders>
-            <w:shd w:fill="FFFFFF"/>
             <w:tcMar>
               <w:top w:w="90" w:type="dxa"/>
               <w:left w:w="90" w:type="dxa"/>
@@ -1149,6 +1210,7 @@
             <w:r>
               <w:rPr>
                 <w:b w:val="0"/>
+                <w:color w:val="000000"/>
                 <w:sz w:val="18"/>
               </w:rPr>
               <w:t>25/25</w:t>
@@ -1160,12 +1222,13 @@
             <w:tcW w:type="dxa" w:w="1872"/>
             <w:vAlign w:val="center"/>
             <w:tcBorders>
-              <w:top w:val="single" w:sz="4" w:color="D9D9D9"/>
-              <w:left w:val="single" w:sz="4" w:color="D9D9D9"/>
-              <w:bottom w:val="single" w:sz="4" w:color="D9D9D9"/>
-              <w:right w:val="single" w:sz="4" w:color="D9D9D9"/>
+              <w:top w:val="single" w:sz="4" w:color="000000" w:space="0"/>
+              <w:left w:val="single" w:sz="4" w:color="000000" w:space="0"/>
+              <w:bottom w:val="single" w:sz="4" w:color="000000" w:space="0"/>
+              <w:right w:val="single" w:sz="4" w:color="000000" w:space="0"/>
+              <w:insideH w:val="single" w:sz="4" w:space="0" w:color="000000"/>
+              <w:insideV w:val="single" w:sz="4" w:space="0" w:color="000000"/>
             </w:tcBorders>
-            <w:shd w:fill="FFFFFF"/>
             <w:tcMar>
               <w:top w:w="90" w:type="dxa"/>
               <w:left w:w="90" w:type="dxa"/>
@@ -1180,6 +1243,7 @@
             <w:r>
               <w:rPr>
                 <w:b w:val="0"/>
+                <w:color w:val="000000"/>
                 <w:sz w:val="18"/>
               </w:rPr>
               <w:t>9/9</w:t>
@@ -1193,12 +1257,13 @@
             <w:tcW w:type="dxa" w:w="4032"/>
             <w:vAlign w:val="center"/>
             <w:tcBorders>
-              <w:top w:val="single" w:sz="4" w:color="D9D9D9"/>
-              <w:left w:val="single" w:sz="4" w:color="D9D9D9"/>
-              <w:bottom w:val="single" w:sz="4" w:color="D9D9D9"/>
-              <w:right w:val="single" w:sz="4" w:color="D9D9D9"/>
+              <w:top w:val="single" w:sz="4" w:color="000000" w:space="0"/>
+              <w:left w:val="single" w:sz="4" w:color="000000" w:space="0"/>
+              <w:bottom w:val="single" w:sz="4" w:color="000000" w:space="0"/>
+              <w:right w:val="single" w:sz="4" w:color="000000" w:space="0"/>
+              <w:insideH w:val="single" w:sz="4" w:space="0" w:color="000000"/>
+              <w:insideV w:val="single" w:sz="4" w:space="0" w:color="000000"/>
             </w:tcBorders>
-            <w:shd w:fill="FFFFFF"/>
             <w:tcMar>
               <w:top w:w="90" w:type="dxa"/>
               <w:left w:w="90" w:type="dxa"/>
@@ -1208,6 +1273,9 @@
           </w:tcPr>
           <w:p>
             <w:r>
+              <w:rPr>
+                <w:color w:val="000000"/>
+              </w:rPr>
               <w:t>Ticket structural pass rate (JSON, five fields, type)</w:t>
             </w:r>
           </w:p>
@@ -1217,12 +1285,13 @@
             <w:tcW w:type="dxa" w:w="1656"/>
             <w:vAlign w:val="center"/>
             <w:tcBorders>
-              <w:top w:val="single" w:sz="4" w:color="D9D9D9"/>
-              <w:left w:val="single" w:sz="4" w:color="D9D9D9"/>
-              <w:bottom w:val="single" w:sz="4" w:color="D9D9D9"/>
-              <w:right w:val="single" w:sz="4" w:color="D9D9D9"/>
+              <w:top w:val="single" w:sz="4" w:color="000000" w:space="0"/>
+              <w:left w:val="single" w:sz="4" w:color="000000" w:space="0"/>
+              <w:bottom w:val="single" w:sz="4" w:color="000000" w:space="0"/>
+              <w:right w:val="single" w:sz="4" w:color="000000" w:space="0"/>
+              <w:insideH w:val="single" w:sz="4" w:space="0" w:color="000000"/>
+              <w:insideV w:val="single" w:sz="4" w:space="0" w:color="000000"/>
             </w:tcBorders>
-            <w:shd w:fill="FFFFFF"/>
             <w:tcMar>
               <w:top w:w="90" w:type="dxa"/>
               <w:left w:w="90" w:type="dxa"/>
@@ -1237,6 +1306,7 @@
             <w:r>
               <w:rPr>
                 <w:b w:val="0"/>
+                <w:color w:val="000000"/>
                 <w:sz w:val="18"/>
               </w:rPr>
               <w:t>0/8</w:t>
@@ -1248,12 +1318,13 @@
             <w:tcW w:type="dxa" w:w="1656"/>
             <w:vAlign w:val="center"/>
             <w:tcBorders>
-              <w:top w:val="single" w:sz="4" w:color="D9D9D9"/>
-              <w:left w:val="single" w:sz="4" w:color="D9D9D9"/>
-              <w:bottom w:val="single" w:sz="4" w:color="D9D9D9"/>
-              <w:right w:val="single" w:sz="4" w:color="D9D9D9"/>
+              <w:top w:val="single" w:sz="4" w:color="000000" w:space="0"/>
+              <w:left w:val="single" w:sz="4" w:color="000000" w:space="0"/>
+              <w:bottom w:val="single" w:sz="4" w:color="000000" w:space="0"/>
+              <w:right w:val="single" w:sz="4" w:color="000000" w:space="0"/>
+              <w:insideH w:val="single" w:sz="4" w:space="0" w:color="000000"/>
+              <w:insideV w:val="single" w:sz="4" w:space="0" w:color="000000"/>
             </w:tcBorders>
-            <w:shd w:fill="FFFFFF"/>
             <w:tcMar>
               <w:top w:w="90" w:type="dxa"/>
               <w:left w:w="90" w:type="dxa"/>
@@ -1268,6 +1339,7 @@
             <w:r>
               <w:rPr>
                 <w:b w:val="0"/>
+                <w:color w:val="000000"/>
                 <w:sz w:val="18"/>
               </w:rPr>
               <w:t>8/8</w:t>
@@ -1279,12 +1351,13 @@
             <w:tcW w:type="dxa" w:w="1872"/>
             <w:vAlign w:val="center"/>
             <w:tcBorders>
-              <w:top w:val="single" w:sz="4" w:color="D9D9D9"/>
-              <w:left w:val="single" w:sz="4" w:color="D9D9D9"/>
-              <w:bottom w:val="single" w:sz="4" w:color="D9D9D9"/>
-              <w:right w:val="single" w:sz="4" w:color="D9D9D9"/>
+              <w:top w:val="single" w:sz="4" w:color="000000" w:space="0"/>
+              <w:left w:val="single" w:sz="4" w:color="000000" w:space="0"/>
+              <w:bottom w:val="single" w:sz="4" w:color="000000" w:space="0"/>
+              <w:right w:val="single" w:sz="4" w:color="000000" w:space="0"/>
+              <w:insideH w:val="single" w:sz="4" w:space="0" w:color="000000"/>
+              <w:insideV w:val="single" w:sz="4" w:space="0" w:color="000000"/>
             </w:tcBorders>
-            <w:shd w:fill="FFFFFF"/>
             <w:tcMar>
               <w:top w:w="90" w:type="dxa"/>
               <w:left w:w="90" w:type="dxa"/>
@@ -1299,6 +1372,7 @@
             <w:r>
               <w:rPr>
                 <w:b w:val="0"/>
+                <w:color w:val="000000"/>
                 <w:sz w:val="18"/>
               </w:rPr>
               <w:t>2/2</w:t>
@@ -1312,12 +1386,13 @@
             <w:tcW w:type="dxa" w:w="4032"/>
             <w:vAlign w:val="center"/>
             <w:tcBorders>
-              <w:top w:val="single" w:sz="4" w:color="D9D9D9"/>
-              <w:left w:val="single" w:sz="4" w:color="D9D9D9"/>
-              <w:bottom w:val="single" w:sz="4" w:color="D9D9D9"/>
-              <w:right w:val="single" w:sz="4" w:color="D9D9D9"/>
+              <w:top w:val="single" w:sz="4" w:color="000000" w:space="0"/>
+              <w:left w:val="single" w:sz="4" w:color="000000" w:space="0"/>
+              <w:bottom w:val="single" w:sz="4" w:color="000000" w:space="0"/>
+              <w:right w:val="single" w:sz="4" w:color="000000" w:space="0"/>
+              <w:insideH w:val="single" w:sz="4" w:space="0" w:color="000000"/>
+              <w:insideV w:val="single" w:sz="4" w:space="0" w:color="000000"/>
             </w:tcBorders>
-            <w:shd w:fill="FFFFFF"/>
             <w:tcMar>
               <w:top w:w="90" w:type="dxa"/>
               <w:left w:w="90" w:type="dxa"/>
@@ -1332,6 +1407,7 @@
             <w:r>
               <w:rPr>
                 <w:b w:val="0"/>
+                <w:color w:val="000000"/>
                 <w:sz w:val="18"/>
               </w:rPr>
               <w:t>Exact five-field match</w:t>
@@ -1343,12 +1419,13 @@
             <w:tcW w:type="dxa" w:w="1656"/>
             <w:vAlign w:val="center"/>
             <w:tcBorders>
-              <w:top w:val="single" w:sz="4" w:color="D9D9D9"/>
-              <w:left w:val="single" w:sz="4" w:color="D9D9D9"/>
-              <w:bottom w:val="single" w:sz="4" w:color="D9D9D9"/>
-              <w:right w:val="single" w:sz="4" w:color="D9D9D9"/>
+              <w:top w:val="single" w:sz="4" w:color="000000" w:space="0"/>
+              <w:left w:val="single" w:sz="4" w:color="000000" w:space="0"/>
+              <w:bottom w:val="single" w:sz="4" w:color="000000" w:space="0"/>
+              <w:right w:val="single" w:sz="4" w:color="000000" w:space="0"/>
+              <w:insideH w:val="single" w:sz="4" w:space="0" w:color="000000"/>
+              <w:insideV w:val="single" w:sz="4" w:space="0" w:color="000000"/>
             </w:tcBorders>
-            <w:shd w:fill="FFFFFF"/>
             <w:tcMar>
               <w:top w:w="90" w:type="dxa"/>
               <w:left w:w="90" w:type="dxa"/>
@@ -1363,6 +1440,7 @@
             <w:r>
               <w:rPr>
                 <w:b w:val="0"/>
+                <w:color w:val="000000"/>
                 <w:sz w:val="18"/>
               </w:rPr>
               <w:t>0/8</w:t>
@@ -1374,12 +1452,13 @@
             <w:tcW w:type="dxa" w:w="1656"/>
             <w:vAlign w:val="center"/>
             <w:tcBorders>
-              <w:top w:val="single" w:sz="4" w:color="D9D9D9"/>
-              <w:left w:val="single" w:sz="4" w:color="D9D9D9"/>
-              <w:bottom w:val="single" w:sz="4" w:color="D9D9D9"/>
-              <w:right w:val="single" w:sz="4" w:color="D9D9D9"/>
+              <w:top w:val="single" w:sz="4" w:color="000000" w:space="0"/>
+              <w:left w:val="single" w:sz="4" w:color="000000" w:space="0"/>
+              <w:bottom w:val="single" w:sz="4" w:color="000000" w:space="0"/>
+              <w:right w:val="single" w:sz="4" w:color="000000" w:space="0"/>
+              <w:insideH w:val="single" w:sz="4" w:space="0" w:color="000000"/>
+              <w:insideV w:val="single" w:sz="4" w:space="0" w:color="000000"/>
             </w:tcBorders>
-            <w:shd w:fill="FFFFFF"/>
             <w:tcMar>
               <w:top w:w="90" w:type="dxa"/>
               <w:left w:w="90" w:type="dxa"/>
@@ -1394,6 +1473,7 @@
             <w:r>
               <w:rPr>
                 <w:b w:val="0"/>
+                <w:color w:val="000000"/>
                 <w:sz w:val="18"/>
               </w:rPr>
               <w:t>8/8</w:t>
@@ -1405,12 +1485,13 @@
             <w:tcW w:type="dxa" w:w="1872"/>
             <w:vAlign w:val="center"/>
             <w:tcBorders>
-              <w:top w:val="single" w:sz="4" w:color="D9D9D9"/>
-              <w:left w:val="single" w:sz="4" w:color="D9D9D9"/>
-              <w:bottom w:val="single" w:sz="4" w:color="D9D9D9"/>
-              <w:right w:val="single" w:sz="4" w:color="D9D9D9"/>
+              <w:top w:val="single" w:sz="4" w:color="000000" w:space="0"/>
+              <w:left w:val="single" w:sz="4" w:color="000000" w:space="0"/>
+              <w:bottom w:val="single" w:sz="4" w:color="000000" w:space="0"/>
+              <w:right w:val="single" w:sz="4" w:color="000000" w:space="0"/>
+              <w:insideH w:val="single" w:sz="4" w:space="0" w:color="000000"/>
+              <w:insideV w:val="single" w:sz="4" w:space="0" w:color="000000"/>
             </w:tcBorders>
-            <w:shd w:fill="FFFFFF"/>
             <w:tcMar>
               <w:top w:w="90" w:type="dxa"/>
               <w:left w:w="90" w:type="dxa"/>
@@ -1425,6 +1506,7 @@
             <w:r>
               <w:rPr>
                 <w:b w:val="0"/>
+                <w:color w:val="000000"/>
                 <w:sz w:val="18"/>
               </w:rPr>
               <w:t>Not labelled</w:t>
@@ -1438,12 +1520,13 @@
             <w:tcW w:type="dxa" w:w="4032"/>
             <w:vAlign w:val="center"/>
             <w:tcBorders>
-              <w:top w:val="single" w:sz="4" w:color="D9D9D9"/>
-              <w:left w:val="single" w:sz="4" w:color="D9D9D9"/>
-              <w:bottom w:val="single" w:sz="4" w:color="D9D9D9"/>
-              <w:right w:val="single" w:sz="4" w:color="D9D9D9"/>
+              <w:top w:val="single" w:sz="4" w:color="000000" w:space="0"/>
+              <w:left w:val="single" w:sz="4" w:color="000000" w:space="0"/>
+              <w:bottom w:val="single" w:sz="4" w:color="000000" w:space="0"/>
+              <w:right w:val="single" w:sz="4" w:color="000000" w:space="0"/>
+              <w:insideH w:val="single" w:sz="4" w:space="0" w:color="000000"/>
+              <w:insideV w:val="single" w:sz="4" w:space="0" w:color="000000"/>
             </w:tcBorders>
-            <w:shd w:fill="FFFFFF"/>
             <w:tcMar>
               <w:top w:w="90" w:type="dxa"/>
               <w:left w:w="90" w:type="dxa"/>
@@ -1458,6 +1541,7 @@
             <w:r>
               <w:rPr>
                 <w:b w:val="0"/>
+                <w:color w:val="000000"/>
                 <w:sz w:val="18"/>
               </w:rPr>
               <w:t>Complete fully specified tickets</w:t>
@@ -1469,12 +1553,13 @@
             <w:tcW w:type="dxa" w:w="1656"/>
             <w:vAlign w:val="center"/>
             <w:tcBorders>
-              <w:top w:val="single" w:sz="4" w:color="D9D9D9"/>
-              <w:left w:val="single" w:sz="4" w:color="D9D9D9"/>
-              <w:bottom w:val="single" w:sz="4" w:color="D9D9D9"/>
-              <w:right w:val="single" w:sz="4" w:color="D9D9D9"/>
+              <w:top w:val="single" w:sz="4" w:color="000000" w:space="0"/>
+              <w:left w:val="single" w:sz="4" w:color="000000" w:space="0"/>
+              <w:bottom w:val="single" w:sz="4" w:color="000000" w:space="0"/>
+              <w:right w:val="single" w:sz="4" w:color="000000" w:space="0"/>
+              <w:insideH w:val="single" w:sz="4" w:space="0" w:color="000000"/>
+              <w:insideV w:val="single" w:sz="4" w:space="0" w:color="000000"/>
             </w:tcBorders>
-            <w:shd w:fill="FFFFFF"/>
             <w:tcMar>
               <w:top w:w="90" w:type="dxa"/>
               <w:left w:w="90" w:type="dxa"/>
@@ -1489,6 +1574,7 @@
             <w:r>
               <w:rPr>
                 <w:b w:val="0"/>
+                <w:color w:val="000000"/>
                 <w:sz w:val="18"/>
               </w:rPr>
               <w:t>0/5</w:t>
@@ -1500,12 +1586,13 @@
             <w:tcW w:type="dxa" w:w="1656"/>
             <w:vAlign w:val="center"/>
             <w:tcBorders>
-              <w:top w:val="single" w:sz="4" w:color="D9D9D9"/>
-              <w:left w:val="single" w:sz="4" w:color="D9D9D9"/>
-              <w:bottom w:val="single" w:sz="4" w:color="D9D9D9"/>
-              <w:right w:val="single" w:sz="4" w:color="D9D9D9"/>
+              <w:top w:val="single" w:sz="4" w:color="000000" w:space="0"/>
+              <w:left w:val="single" w:sz="4" w:color="000000" w:space="0"/>
+              <w:bottom w:val="single" w:sz="4" w:color="000000" w:space="0"/>
+              <w:right w:val="single" w:sz="4" w:color="000000" w:space="0"/>
+              <w:insideH w:val="single" w:sz="4" w:space="0" w:color="000000"/>
+              <w:insideV w:val="single" w:sz="4" w:space="0" w:color="000000"/>
             </w:tcBorders>
-            <w:shd w:fill="FFFFFF"/>
             <w:tcMar>
               <w:top w:w="90" w:type="dxa"/>
               <w:left w:w="90" w:type="dxa"/>
@@ -1520,6 +1607,7 @@
             <w:r>
               <w:rPr>
                 <w:b w:val="0"/>
+                <w:color w:val="000000"/>
                 <w:sz w:val="18"/>
               </w:rPr>
               <w:t>5/5</w:t>
@@ -1531,12 +1619,13 @@
             <w:tcW w:type="dxa" w:w="1872"/>
             <w:vAlign w:val="center"/>
             <w:tcBorders>
-              <w:top w:val="single" w:sz="4" w:color="D9D9D9"/>
-              <w:left w:val="single" w:sz="4" w:color="D9D9D9"/>
-              <w:bottom w:val="single" w:sz="4" w:color="D9D9D9"/>
-              <w:right w:val="single" w:sz="4" w:color="D9D9D9"/>
+              <w:top w:val="single" w:sz="4" w:color="000000" w:space="0"/>
+              <w:left w:val="single" w:sz="4" w:color="000000" w:space="0"/>
+              <w:bottom w:val="single" w:sz="4" w:color="000000" w:space="0"/>
+              <w:right w:val="single" w:sz="4" w:color="000000" w:space="0"/>
+              <w:insideH w:val="single" w:sz="4" w:space="0" w:color="000000"/>
+              <w:insideV w:val="single" w:sz="4" w:space="0" w:color="000000"/>
             </w:tcBorders>
-            <w:shd w:fill="FFFFFF"/>
             <w:tcMar>
               <w:top w:w="90" w:type="dxa"/>
               <w:left w:w="90" w:type="dxa"/>
@@ -1551,6 +1640,7 @@
             <w:r>
               <w:rPr>
                 <w:b w:val="0"/>
+                <w:color w:val="000000"/>
                 <w:sz w:val="18"/>
               </w:rPr>
               <w:t>No eligible cases</w:t>
@@ -1564,12 +1654,13 @@
             <w:tcW w:type="dxa" w:w="4032"/>
             <w:vAlign w:val="center"/>
             <w:tcBorders>
-              <w:top w:val="single" w:sz="4" w:color="D9D9D9"/>
-              <w:left w:val="single" w:sz="4" w:color="D9D9D9"/>
-              <w:bottom w:val="single" w:sz="4" w:color="D9D9D9"/>
-              <w:right w:val="single" w:sz="4" w:color="D9D9D9"/>
+              <w:top w:val="single" w:sz="4" w:color="000000" w:space="0"/>
+              <w:left w:val="single" w:sz="4" w:color="000000" w:space="0"/>
+              <w:bottom w:val="single" w:sz="4" w:color="000000" w:space="0"/>
+              <w:right w:val="single" w:sz="4" w:color="000000" w:space="0"/>
+              <w:insideH w:val="single" w:sz="4" w:space="0" w:color="000000"/>
+              <w:insideV w:val="single" w:sz="4" w:space="0" w:color="000000"/>
             </w:tcBorders>
-            <w:shd w:fill="FFFFFF"/>
             <w:tcMar>
               <w:top w:w="90" w:type="dxa"/>
               <w:left w:w="90" w:type="dxa"/>
@@ -1584,6 +1675,7 @@
             <w:r>
               <w:rPr>
                 <w:b w:val="0"/>
+                <w:color w:val="000000"/>
                 <w:sz w:val="18"/>
               </w:rPr>
               <w:t>Safe incomplete drafts</w:t>
@@ -1595,12 +1687,13 @@
             <w:tcW w:type="dxa" w:w="1656"/>
             <w:vAlign w:val="center"/>
             <w:tcBorders>
-              <w:top w:val="single" w:sz="4" w:color="D9D9D9"/>
-              <w:left w:val="single" w:sz="4" w:color="D9D9D9"/>
-              <w:bottom w:val="single" w:sz="4" w:color="D9D9D9"/>
-              <w:right w:val="single" w:sz="4" w:color="D9D9D9"/>
+              <w:top w:val="single" w:sz="4" w:color="000000" w:space="0"/>
+              <w:left w:val="single" w:sz="4" w:color="000000" w:space="0"/>
+              <w:bottom w:val="single" w:sz="4" w:color="000000" w:space="0"/>
+              <w:right w:val="single" w:sz="4" w:color="000000" w:space="0"/>
+              <w:insideH w:val="single" w:sz="4" w:space="0" w:color="000000"/>
+              <w:insideV w:val="single" w:sz="4" w:space="0" w:color="000000"/>
             </w:tcBorders>
-            <w:shd w:fill="FFFFFF"/>
             <w:tcMar>
               <w:top w:w="90" w:type="dxa"/>
               <w:left w:w="90" w:type="dxa"/>
@@ -1615,6 +1708,7 @@
             <w:r>
               <w:rPr>
                 <w:b w:val="0"/>
+                <w:color w:val="000000"/>
                 <w:sz w:val="18"/>
               </w:rPr>
               <w:t>0/3</w:t>
@@ -1626,12 +1720,13 @@
             <w:tcW w:type="dxa" w:w="1656"/>
             <w:vAlign w:val="center"/>
             <w:tcBorders>
-              <w:top w:val="single" w:sz="4" w:color="D9D9D9"/>
-              <w:left w:val="single" w:sz="4" w:color="D9D9D9"/>
-              <w:bottom w:val="single" w:sz="4" w:color="D9D9D9"/>
-              <w:right w:val="single" w:sz="4" w:color="D9D9D9"/>
+              <w:top w:val="single" w:sz="4" w:color="000000" w:space="0"/>
+              <w:left w:val="single" w:sz="4" w:color="000000" w:space="0"/>
+              <w:bottom w:val="single" w:sz="4" w:color="000000" w:space="0"/>
+              <w:right w:val="single" w:sz="4" w:color="000000" w:space="0"/>
+              <w:insideH w:val="single" w:sz="4" w:space="0" w:color="000000"/>
+              <w:insideV w:val="single" w:sz="4" w:space="0" w:color="000000"/>
             </w:tcBorders>
-            <w:shd w:fill="FFFFFF"/>
             <w:tcMar>
               <w:top w:w="90" w:type="dxa"/>
               <w:left w:w="90" w:type="dxa"/>
@@ -1646,6 +1741,7 @@
             <w:r>
               <w:rPr>
                 <w:b w:val="0"/>
+                <w:color w:val="000000"/>
                 <w:sz w:val="18"/>
               </w:rPr>
               <w:t>3/3</w:t>
@@ -1657,12 +1753,13 @@
             <w:tcW w:type="dxa" w:w="1872"/>
             <w:vAlign w:val="center"/>
             <w:tcBorders>
-              <w:top w:val="single" w:sz="4" w:color="D9D9D9"/>
-              <w:left w:val="single" w:sz="4" w:color="D9D9D9"/>
-              <w:bottom w:val="single" w:sz="4" w:color="D9D9D9"/>
-              <w:right w:val="single" w:sz="4" w:color="D9D9D9"/>
+              <w:top w:val="single" w:sz="4" w:color="000000" w:space="0"/>
+              <w:left w:val="single" w:sz="4" w:color="000000" w:space="0"/>
+              <w:bottom w:val="single" w:sz="4" w:color="000000" w:space="0"/>
+              <w:right w:val="single" w:sz="4" w:color="000000" w:space="0"/>
+              <w:insideH w:val="single" w:sz="4" w:space="0" w:color="000000"/>
+              <w:insideV w:val="single" w:sz="4" w:space="0" w:color="000000"/>
             </w:tcBorders>
-            <w:shd w:fill="FFFFFF"/>
             <w:tcMar>
               <w:top w:w="90" w:type="dxa"/>
               <w:left w:w="90" w:type="dxa"/>
@@ -1677,6 +1774,7 @@
             <w:r>
               <w:rPr>
                 <w:b w:val="0"/>
+                <w:color w:val="000000"/>
                 <w:sz w:val="18"/>
               </w:rPr>
               <w:t>2/2</w:t>
@@ -1690,12 +1788,13 @@
             <w:tcW w:type="dxa" w:w="4032"/>
             <w:vAlign w:val="center"/>
             <w:tcBorders>
-              <w:top w:val="single" w:sz="4" w:color="D9D9D9"/>
-              <w:left w:val="single" w:sz="4" w:color="D9D9D9"/>
-              <w:bottom w:val="single" w:sz="4" w:color="D9D9D9"/>
-              <w:right w:val="single" w:sz="4" w:color="D9D9D9"/>
+              <w:top w:val="single" w:sz="4" w:color="000000" w:space="0"/>
+              <w:left w:val="single" w:sz="4" w:color="000000" w:space="0"/>
+              <w:bottom w:val="single" w:sz="4" w:color="000000" w:space="0"/>
+              <w:right w:val="single" w:sz="4" w:color="000000" w:space="0"/>
+              <w:insideH w:val="single" w:sz="4" w:space="0" w:color="000000"/>
+              <w:insideV w:val="single" w:sz="4" w:space="0" w:color="000000"/>
             </w:tcBorders>
-            <w:shd w:fill="FFFFFF"/>
             <w:tcMar>
               <w:top w:w="90" w:type="dxa"/>
               <w:left w:w="90" w:type="dxa"/>
@@ -1710,6 +1809,7 @@
             <w:r>
               <w:rPr>
                 <w:b w:val="0"/>
+                <w:color w:val="000000"/>
                 <w:sz w:val="18"/>
               </w:rPr>
               <w:t>Complete across all ticket inputs</w:t>
@@ -1721,12 +1821,13 @@
             <w:tcW w:type="dxa" w:w="1656"/>
             <w:vAlign w:val="center"/>
             <w:tcBorders>
-              <w:top w:val="single" w:sz="4" w:color="D9D9D9"/>
-              <w:left w:val="single" w:sz="4" w:color="D9D9D9"/>
-              <w:bottom w:val="single" w:sz="4" w:color="D9D9D9"/>
-              <w:right w:val="single" w:sz="4" w:color="D9D9D9"/>
+              <w:top w:val="single" w:sz="4" w:color="000000" w:space="0"/>
+              <w:left w:val="single" w:sz="4" w:color="000000" w:space="0"/>
+              <w:bottom w:val="single" w:sz="4" w:color="000000" w:space="0"/>
+              <w:right w:val="single" w:sz="4" w:color="000000" w:space="0"/>
+              <w:insideH w:val="single" w:sz="4" w:space="0" w:color="000000"/>
+              <w:insideV w:val="single" w:sz="4" w:space="0" w:color="000000"/>
             </w:tcBorders>
-            <w:shd w:fill="FFFFFF"/>
             <w:tcMar>
               <w:top w:w="90" w:type="dxa"/>
               <w:left w:w="90" w:type="dxa"/>
@@ -1741,6 +1842,7 @@
             <w:r>
               <w:rPr>
                 <w:b w:val="0"/>
+                <w:color w:val="000000"/>
                 <w:sz w:val="18"/>
               </w:rPr>
               <w:t>0/8</w:t>
@@ -1752,12 +1854,13 @@
             <w:tcW w:type="dxa" w:w="1656"/>
             <w:vAlign w:val="center"/>
             <w:tcBorders>
-              <w:top w:val="single" w:sz="4" w:color="D9D9D9"/>
-              <w:left w:val="single" w:sz="4" w:color="D9D9D9"/>
-              <w:bottom w:val="single" w:sz="4" w:color="D9D9D9"/>
-              <w:right w:val="single" w:sz="4" w:color="D9D9D9"/>
+              <w:top w:val="single" w:sz="4" w:color="000000" w:space="0"/>
+              <w:left w:val="single" w:sz="4" w:color="000000" w:space="0"/>
+              <w:bottom w:val="single" w:sz="4" w:color="000000" w:space="0"/>
+              <w:right w:val="single" w:sz="4" w:color="000000" w:space="0"/>
+              <w:insideH w:val="single" w:sz="4" w:space="0" w:color="000000"/>
+              <w:insideV w:val="single" w:sz="4" w:space="0" w:color="000000"/>
             </w:tcBorders>
-            <w:shd w:fill="FFFFFF"/>
             <w:tcMar>
               <w:top w:w="90" w:type="dxa"/>
               <w:left w:w="90" w:type="dxa"/>
@@ -1772,6 +1875,7 @@
             <w:r>
               <w:rPr>
                 <w:b w:val="0"/>
+                <w:color w:val="000000"/>
                 <w:sz w:val="18"/>
               </w:rPr>
               <w:t>5/8</w:t>
@@ -1783,12 +1887,13 @@
             <w:tcW w:type="dxa" w:w="1872"/>
             <w:vAlign w:val="center"/>
             <w:tcBorders>
-              <w:top w:val="single" w:sz="4" w:color="D9D9D9"/>
-              <w:left w:val="single" w:sz="4" w:color="D9D9D9"/>
-              <w:bottom w:val="single" w:sz="4" w:color="D9D9D9"/>
-              <w:right w:val="single" w:sz="4" w:color="D9D9D9"/>
+              <w:top w:val="single" w:sz="4" w:color="000000" w:space="0"/>
+              <w:left w:val="single" w:sz="4" w:color="000000" w:space="0"/>
+              <w:bottom w:val="single" w:sz="4" w:color="000000" w:space="0"/>
+              <w:right w:val="single" w:sz="4" w:color="000000" w:space="0"/>
+              <w:insideH w:val="single" w:sz="4" w:space="0" w:color="000000"/>
+              <w:insideV w:val="single" w:sz="4" w:space="0" w:color="000000"/>
             </w:tcBorders>
-            <w:shd w:fill="FFFFFF"/>
             <w:tcMar>
               <w:top w:w="90" w:type="dxa"/>
               <w:left w:w="90" w:type="dxa"/>
@@ -1803,6 +1908,7 @@
             <w:r>
               <w:rPr>
                 <w:b w:val="0"/>
+                <w:color w:val="000000"/>
                 <w:sz w:val="18"/>
               </w:rPr>
               <w:t>0/2</w:t>
@@ -1816,12 +1922,13 @@
             <w:tcW w:type="dxa" w:w="4032"/>
             <w:vAlign w:val="center"/>
             <w:tcBorders>
-              <w:top w:val="single" w:sz="4" w:color="D9D9D9"/>
-              <w:left w:val="single" w:sz="4" w:color="D9D9D9"/>
-              <w:bottom w:val="single" w:sz="4" w:color="D9D9D9"/>
-              <w:right w:val="single" w:sz="4" w:color="D9D9D9"/>
+              <w:top w:val="single" w:sz="4" w:color="000000" w:space="0"/>
+              <w:left w:val="single" w:sz="4" w:color="000000" w:space="0"/>
+              <w:bottom w:val="single" w:sz="4" w:color="000000" w:space="0"/>
+              <w:right w:val="single" w:sz="4" w:color="000000" w:space="0"/>
+              <w:insideH w:val="single" w:sz="4" w:space="0" w:color="000000"/>
+              <w:insideV w:val="single" w:sz="4" w:space="0" w:color="000000"/>
             </w:tcBorders>
-            <w:shd w:fill="FFFFFF"/>
             <w:tcMar>
               <w:top w:w="90" w:type="dxa"/>
               <w:left w:w="90" w:type="dxa"/>
@@ -1836,6 +1943,7 @@
             <w:r>
               <w:rPr>
                 <w:b w:val="0"/>
+                <w:color w:val="000000"/>
                 <w:sz w:val="18"/>
               </w:rPr>
               <w:t>All applicable task checks pass</w:t>
@@ -1847,12 +1955,13 @@
             <w:tcW w:type="dxa" w:w="1656"/>
             <w:vAlign w:val="center"/>
             <w:tcBorders>
-              <w:top w:val="single" w:sz="4" w:color="D9D9D9"/>
-              <w:left w:val="single" w:sz="4" w:color="D9D9D9"/>
-              <w:bottom w:val="single" w:sz="4" w:color="D9D9D9"/>
-              <w:right w:val="single" w:sz="4" w:color="D9D9D9"/>
+              <w:top w:val="single" w:sz="4" w:color="000000" w:space="0"/>
+              <w:left w:val="single" w:sz="4" w:color="000000" w:space="0"/>
+              <w:bottom w:val="single" w:sz="4" w:color="000000" w:space="0"/>
+              <w:right w:val="single" w:sz="4" w:color="000000" w:space="0"/>
+              <w:insideH w:val="single" w:sz="4" w:space="0" w:color="000000"/>
+              <w:insideV w:val="single" w:sz="4" w:space="0" w:color="000000"/>
             </w:tcBorders>
-            <w:shd w:fill="FFFFFF"/>
             <w:tcMar>
               <w:top w:w="90" w:type="dxa"/>
               <w:left w:w="90" w:type="dxa"/>
@@ -1867,6 +1976,7 @@
             <w:r>
               <w:rPr>
                 <w:b w:val="0"/>
+                <w:color w:val="000000"/>
                 <w:sz w:val="18"/>
               </w:rPr>
               <w:t>22/30</w:t>
@@ -1878,12 +1988,13 @@
             <w:tcW w:type="dxa" w:w="1656"/>
             <w:vAlign w:val="center"/>
             <w:tcBorders>
-              <w:top w:val="single" w:sz="4" w:color="D9D9D9"/>
-              <w:left w:val="single" w:sz="4" w:color="D9D9D9"/>
-              <w:bottom w:val="single" w:sz="4" w:color="D9D9D9"/>
-              <w:right w:val="single" w:sz="4" w:color="D9D9D9"/>
+              <w:top w:val="single" w:sz="4" w:color="000000" w:space="0"/>
+              <w:left w:val="single" w:sz="4" w:color="000000" w:space="0"/>
+              <w:bottom w:val="single" w:sz="4" w:color="000000" w:space="0"/>
+              <w:right w:val="single" w:sz="4" w:color="000000" w:space="0"/>
+              <w:insideH w:val="single" w:sz="4" w:space="0" w:color="000000"/>
+              <w:insideV w:val="single" w:sz="4" w:space="0" w:color="000000"/>
             </w:tcBorders>
-            <w:shd w:fill="FFFFFF"/>
             <w:tcMar>
               <w:top w:w="90" w:type="dxa"/>
               <w:left w:w="90" w:type="dxa"/>
@@ -1898,6 +2009,7 @@
             <w:r>
               <w:rPr>
                 <w:b w:val="0"/>
+                <w:color w:val="000000"/>
                 <w:sz w:val="18"/>
               </w:rPr>
               <w:t>30/30</w:t>
@@ -1909,12 +2021,13 @@
             <w:tcW w:type="dxa" w:w="1872"/>
             <w:vAlign w:val="center"/>
             <w:tcBorders>
-              <w:top w:val="single" w:sz="4" w:color="D9D9D9"/>
-              <w:left w:val="single" w:sz="4" w:color="D9D9D9"/>
-              <w:bottom w:val="single" w:sz="4" w:color="D9D9D9"/>
-              <w:right w:val="single" w:sz="4" w:color="D9D9D9"/>
+              <w:top w:val="single" w:sz="4" w:color="000000" w:space="0"/>
+              <w:left w:val="single" w:sz="4" w:color="000000" w:space="0"/>
+              <w:bottom w:val="single" w:sz="4" w:color="000000" w:space="0"/>
+              <w:right w:val="single" w:sz="4" w:color="000000" w:space="0"/>
+              <w:insideH w:val="single" w:sz="4" w:space="0" w:color="000000"/>
+              <w:insideV w:val="single" w:sz="4" w:space="0" w:color="000000"/>
             </w:tcBorders>
-            <w:shd w:fill="FFFFFF"/>
             <w:tcMar>
               <w:top w:w="90" w:type="dxa"/>
               <w:left w:w="90" w:type="dxa"/>
@@ -1929,6 +2042,7 @@
             <w:r>
               <w:rPr>
                 <w:b w:val="0"/>
+                <w:color w:val="000000"/>
                 <w:sz w:val="18"/>
               </w:rPr>
               <w:t>10/12</w:t>
@@ -2004,7 +2118,7 @@
       <w:tblPr>
         <w:tblW w:type="auto" w:w="0"/>
         <w:tblLayout w:type="fixed"/>
-        <w:tblLook w:firstColumn="1" w:firstRow="1" w:lastColumn="0" w:lastRow="0" w:noHBand="0" w:noVBand="1" w:val="04A0"/>
+        <w:tblLook w:firstColumn="1" w:firstRow="1" w:lastColumn="0" w:lastRow="0" w:noHBand="1" w:noVBand="1" w:val="04A0"/>
       </w:tblPr>
       <w:tblGrid>
         <w:gridCol w:w="936"/>
@@ -2020,12 +2134,13 @@
             <w:tcW w:type="dxa" w:w="936"/>
             <w:vAlign w:val="center"/>
             <w:tcBorders>
-              <w:top w:val="single" w:sz="4" w:color="D9D9D9"/>
-              <w:left w:val="single" w:sz="4" w:color="D9D9D9"/>
-              <w:bottom w:val="single" w:sz="4" w:color="D9D9D9"/>
-              <w:right w:val="single" w:sz="4" w:color="D9D9D9"/>
+              <w:top w:val="single" w:sz="4" w:color="000000" w:space="0"/>
+              <w:left w:val="single" w:sz="4" w:color="000000" w:space="0"/>
+              <w:bottom w:val="single" w:sz="4" w:color="000000" w:space="0"/>
+              <w:right w:val="single" w:sz="4" w:color="000000" w:space="0"/>
+              <w:insideH w:val="single" w:sz="4" w:space="0" w:color="000000"/>
+              <w:insideV w:val="single" w:sz="4" w:space="0" w:color="000000"/>
             </w:tcBorders>
-            <w:shd w:fill="E4EBF0"/>
             <w:tcMar>
               <w:top w:w="90" w:type="dxa"/>
               <w:left w:w="90" w:type="dxa"/>
@@ -2040,6 +2155,7 @@
             <w:r>
               <w:rPr>
                 <w:b/>
+                <w:color w:val="000000"/>
                 <w:sz w:val="18"/>
               </w:rPr>
               <w:t>Case</w:t>
@@ -2051,12 +2167,13 @@
             <w:tcW w:type="dxa" w:w="4536"/>
             <w:vAlign w:val="center"/>
             <w:tcBorders>
-              <w:top w:val="single" w:sz="4" w:color="D9D9D9"/>
-              <w:left w:val="single" w:sz="4" w:color="D9D9D9"/>
-              <w:bottom w:val="single" w:sz="4" w:color="D9D9D9"/>
-              <w:right w:val="single" w:sz="4" w:color="D9D9D9"/>
+              <w:top w:val="single" w:sz="4" w:color="000000" w:space="0"/>
+              <w:left w:val="single" w:sz="4" w:color="000000" w:space="0"/>
+              <w:bottom w:val="single" w:sz="4" w:color="000000" w:space="0"/>
+              <w:right w:val="single" w:sz="4" w:color="000000" w:space="0"/>
+              <w:insideH w:val="single" w:sz="4" w:space="0" w:color="000000"/>
+              <w:insideV w:val="single" w:sz="4" w:space="0" w:color="000000"/>
             </w:tcBorders>
-            <w:shd w:fill="E4EBF0"/>
             <w:tcMar>
               <w:top w:w="90" w:type="dxa"/>
               <w:left w:w="90" w:type="dxa"/>
@@ -2071,6 +2188,7 @@
             <w:r>
               <w:rPr>
                 <w:b/>
+                <w:color w:val="000000"/>
                 <w:sz w:val="18"/>
               </w:rPr>
               <w:t>Observed issue</w:t>
@@ -2082,12 +2200,13 @@
             <w:tcW w:type="dxa" w:w="3744"/>
             <w:vAlign w:val="center"/>
             <w:tcBorders>
-              <w:top w:val="single" w:sz="4" w:color="D9D9D9"/>
-              <w:left w:val="single" w:sz="4" w:color="D9D9D9"/>
-              <w:bottom w:val="single" w:sz="4" w:color="D9D9D9"/>
-              <w:right w:val="single" w:sz="4" w:color="D9D9D9"/>
+              <w:top w:val="single" w:sz="4" w:color="000000" w:space="0"/>
+              <w:left w:val="single" w:sz="4" w:color="000000" w:space="0"/>
+              <w:bottom w:val="single" w:sz="4" w:color="000000" w:space="0"/>
+              <w:right w:val="single" w:sz="4" w:color="000000" w:space="0"/>
+              <w:insideH w:val="single" w:sz="4" w:space="0" w:color="000000"/>
+              <w:insideV w:val="single" w:sz="4" w:space="0" w:color="000000"/>
             </w:tcBorders>
-            <w:shd w:fill="E4EBF0"/>
             <w:tcMar>
               <w:top w:w="90" w:type="dxa"/>
               <w:left w:w="90" w:type="dxa"/>
@@ -2102,6 +2221,7 @@
             <w:r>
               <w:rPr>
                 <w:b/>
+                <w:color w:val="000000"/>
                 <w:sz w:val="18"/>
               </w:rPr>
               <w:t>Implication</w:t>
@@ -2115,12 +2235,13 @@
             <w:tcW w:type="dxa" w:w="936"/>
             <w:vAlign w:val="center"/>
             <w:tcBorders>
-              <w:top w:val="single" w:sz="4" w:color="D9D9D9"/>
-              <w:left w:val="single" w:sz="4" w:color="D9D9D9"/>
-              <w:bottom w:val="single" w:sz="4" w:color="D9D9D9"/>
-              <w:right w:val="single" w:sz="4" w:color="D9D9D9"/>
+              <w:top w:val="single" w:sz="4" w:color="000000" w:space="0"/>
+              <w:left w:val="single" w:sz="4" w:color="000000" w:space="0"/>
+              <w:bottom w:val="single" w:sz="4" w:color="000000" w:space="0"/>
+              <w:right w:val="single" w:sz="4" w:color="000000" w:space="0"/>
+              <w:insideH w:val="single" w:sz="4" w:space="0" w:color="000000"/>
+              <w:insideV w:val="single" w:sz="4" w:space="0" w:color="000000"/>
             </w:tcBorders>
-            <w:shd w:fill="FFFFFF"/>
             <w:tcMar>
               <w:top w:w="90" w:type="dxa"/>
               <w:left w:w="90" w:type="dxa"/>
@@ -2135,6 +2256,7 @@
             <w:r>
               <w:rPr>
                 <w:b w:val="0"/>
+                <w:color w:val="000000"/>
                 <w:sz w:val="18"/>
               </w:rPr>
               <w:t>T07 and complete-draft demo</w:t>
@@ -2146,12 +2268,13 @@
             <w:tcW w:type="dxa" w:w="4536"/>
             <w:vAlign w:val="center"/>
             <w:tcBorders>
-              <w:top w:val="single" w:sz="4" w:color="D9D9D9"/>
-              <w:left w:val="single" w:sz="4" w:color="D9D9D9"/>
-              <w:bottom w:val="single" w:sz="4" w:color="D9D9D9"/>
-              <w:right w:val="single" w:sz="4" w:color="D9D9D9"/>
+              <w:top w:val="single" w:sz="4" w:color="000000" w:space="0"/>
+              <w:left w:val="single" w:sz="4" w:color="000000" w:space="0"/>
+              <w:bottom w:val="single" w:sz="4" w:color="000000" w:space="0"/>
+              <w:right w:val="single" w:sz="4" w:color="000000" w:space="0"/>
+              <w:insideH w:val="single" w:sz="4" w:space="0" w:color="000000"/>
+              <w:insideV w:val="single" w:sz="4" w:space="0" w:color="000000"/>
             </w:tcBorders>
-            <w:shd w:fill="FFFFFF"/>
             <w:tcMar>
               <w:top w:w="90" w:type="dxa"/>
               <w:left w:w="90" w:type="dxa"/>
@@ -2166,6 +2289,7 @@
             <w:r>
               <w:rPr>
                 <w:b w:val="0"/>
+                <w:color w:val="000000"/>
                 <w:sz w:val="18"/>
               </w:rPr>
               <w:t>The answer requests a name and other personal details even though all five draft fields are present.</w:t>
@@ -2177,12 +2301,13 @@
             <w:tcW w:type="dxa" w:w="3744"/>
             <w:vAlign w:val="center"/>
             <w:tcBorders>
-              <w:top w:val="single" w:sz="4" w:color="D9D9D9"/>
-              <w:left w:val="single" w:sz="4" w:color="D9D9D9"/>
-              <w:bottom w:val="single" w:sz="4" w:color="D9D9D9"/>
-              <w:right w:val="single" w:sz="4" w:color="D9D9D9"/>
+              <w:top w:val="single" w:sz="4" w:color="000000" w:space="0"/>
+              <w:left w:val="single" w:sz="4" w:color="000000" w:space="0"/>
+              <w:bottom w:val="single" w:sz="4" w:color="000000" w:space="0"/>
+              <w:right w:val="single" w:sz="4" w:color="000000" w:space="0"/>
+              <w:insideH w:val="single" w:sz="4" w:space="0" w:color="000000"/>
+              <w:insideV w:val="single" w:sz="4" w:space="0" w:color="000000"/>
             </w:tcBorders>
-            <w:shd w:fill="FFFFFF"/>
             <w:tcMar>
               <w:top w:w="90" w:type="dxa"/>
               <w:left w:w="90" w:type="dxa"/>
@@ -2197,6 +2322,7 @@
             <w:r>
               <w:rPr>
                 <w:b w:val="0"/>
+                <w:color w:val="000000"/>
                 <w:sz w:val="18"/>
               </w:rPr>
               <w:t>Text and draft status disagree; extra information is unnecessary.</w:t>
@@ -2210,12 +2336,13 @@
             <w:tcW w:type="dxa" w:w="936"/>
             <w:vAlign w:val="center"/>
             <w:tcBorders>
-              <w:top w:val="single" w:sz="4" w:color="D9D9D9"/>
-              <w:left w:val="single" w:sz="4" w:color="D9D9D9"/>
-              <w:bottom w:val="single" w:sz="4" w:color="D9D9D9"/>
-              <w:right w:val="single" w:sz="4" w:color="D9D9D9"/>
+              <w:top w:val="single" w:sz="4" w:color="000000" w:space="0"/>
+              <w:left w:val="single" w:sz="4" w:color="000000" w:space="0"/>
+              <w:bottom w:val="single" w:sz="4" w:color="000000" w:space="0"/>
+              <w:right w:val="single" w:sz="4" w:color="000000" w:space="0"/>
+              <w:insideH w:val="single" w:sz="4" w:space="0" w:color="000000"/>
+              <w:insideV w:val="single" w:sz="4" w:space="0" w:color="000000"/>
             </w:tcBorders>
-            <w:shd w:fill="FFFFFF"/>
             <w:tcMar>
               <w:top w:w="90" w:type="dxa"/>
               <w:left w:w="90" w:type="dxa"/>
@@ -2230,6 +2357,7 @@
             <w:r>
               <w:rPr>
                 <w:b w:val="0"/>
+                <w:color w:val="000000"/>
                 <w:sz w:val="18"/>
               </w:rPr>
               <w:t>T08</w:t>
@@ -2241,12 +2369,13 @@
             <w:tcW w:type="dxa" w:w="4536"/>
             <w:vAlign w:val="center"/>
             <w:tcBorders>
-              <w:top w:val="single" w:sz="4" w:color="D9D9D9"/>
-              <w:left w:val="single" w:sz="4" w:color="D9D9D9"/>
-              <w:bottom w:val="single" w:sz="4" w:color="D9D9D9"/>
-              <w:right w:val="single" w:sz="4" w:color="D9D9D9"/>
+              <w:top w:val="single" w:sz="4" w:color="000000" w:space="0"/>
+              <w:left w:val="single" w:sz="4" w:color="000000" w:space="0"/>
+              <w:bottom w:val="single" w:sz="4" w:color="000000" w:space="0"/>
+              <w:right w:val="single" w:sz="4" w:color="000000" w:space="0"/>
+              <w:insideH w:val="single" w:sz="4" w:space="0" w:color="000000"/>
+              <w:insideV w:val="single" w:sz="4" w:space="0" w:color="000000"/>
             </w:tcBorders>
-            <w:shd w:fill="FFFFFF"/>
             <w:tcMar>
               <w:top w:w="90" w:type="dxa"/>
               <w:left w:w="90" w:type="dxa"/>
@@ -2261,6 +2390,7 @@
             <w:r>
               <w:rPr>
                 <w:b w:val="0"/>
+                <w:color w:val="000000"/>
                 <w:sz w:val="18"/>
               </w:rPr>
               <w:t>The answer asks whether a draft is wanted even though the request is explicit and a draft is already present.</w:t>
@@ -2272,12 +2402,13 @@
             <w:tcW w:type="dxa" w:w="3744"/>
             <w:vAlign w:val="center"/>
             <w:tcBorders>
-              <w:top w:val="single" w:sz="4" w:color="D9D9D9"/>
-              <w:left w:val="single" w:sz="4" w:color="D9D9D9"/>
-              <w:bottom w:val="single" w:sz="4" w:color="D9D9D9"/>
-              <w:right w:val="single" w:sz="4" w:color="D9D9D9"/>
+              <w:top w:val="single" w:sz="4" w:color="000000" w:space="0"/>
+              <w:left w:val="single" w:sz="4" w:color="000000" w:space="0"/>
+              <w:bottom w:val="single" w:sz="4" w:color="000000" w:space="0"/>
+              <w:right w:val="single" w:sz="4" w:color="000000" w:space="0"/>
+              <w:insideH w:val="single" w:sz="4" w:space="0" w:color="000000"/>
+              <w:insideV w:val="single" w:sz="4" w:space="0" w:color="000000"/>
             </w:tcBorders>
-            <w:shd w:fill="FFFFFF"/>
             <w:tcMar>
               <w:top w:w="90" w:type="dxa"/>
               <w:left w:w="90" w:type="dxa"/>
@@ -2292,6 +2423,7 @@
             <w:r>
               <w:rPr>
                 <w:b w:val="0"/>
+                <w:color w:val="000000"/>
                 <w:sz w:val="18"/>
               </w:rPr>
               <w:t>A redundant confirmation reduces clarity.</w:t>
@@ -2305,12 +2437,13 @@
             <w:tcW w:type="dxa" w:w="936"/>
             <w:vAlign w:val="center"/>
             <w:tcBorders>
-              <w:top w:val="single" w:sz="4" w:color="D9D9D9"/>
-              <w:left w:val="single" w:sz="4" w:color="D9D9D9"/>
-              <w:bottom w:val="single" w:sz="4" w:color="D9D9D9"/>
-              <w:right w:val="single" w:sz="4" w:color="D9D9D9"/>
+              <w:top w:val="single" w:sz="4" w:color="000000" w:space="0"/>
+              <w:left w:val="single" w:sz="4" w:color="000000" w:space="0"/>
+              <w:bottom w:val="single" w:sz="4" w:color="000000" w:space="0"/>
+              <w:right w:val="single" w:sz="4" w:color="000000" w:space="0"/>
+              <w:insideH w:val="single" w:sz="4" w:space="0" w:color="000000"/>
+              <w:insideV w:val="single" w:sz="4" w:space="0" w:color="000000"/>
             </w:tcBorders>
-            <w:shd w:fill="FFFFFF"/>
             <w:tcMar>
               <w:top w:w="90" w:type="dxa"/>
               <w:left w:w="90" w:type="dxa"/>
@@ -2325,6 +2458,7 @@
             <w:r>
               <w:rPr>
                 <w:b w:val="0"/>
+                <w:color w:val="000000"/>
                 <w:sz w:val="18"/>
               </w:rPr>
               <w:t>T10</w:t>
@@ -2336,12 +2470,13 @@
             <w:tcW w:type="dxa" w:w="4536"/>
             <w:vAlign w:val="center"/>
             <w:tcBorders>
-              <w:top w:val="single" w:sz="4" w:color="D9D9D9"/>
-              <w:left w:val="single" w:sz="4" w:color="D9D9D9"/>
-              <w:bottom w:val="single" w:sz="4" w:color="D9D9D9"/>
-              <w:right w:val="single" w:sz="4" w:color="D9D9D9"/>
+              <w:top w:val="single" w:sz="4" w:color="000000" w:space="0"/>
+              <w:left w:val="single" w:sz="4" w:color="000000" w:space="0"/>
+              <w:bottom w:val="single" w:sz="4" w:color="000000" w:space="0"/>
+              <w:right w:val="single" w:sz="4" w:color="000000" w:space="0"/>
+              <w:insideH w:val="single" w:sz="4" w:space="0" w:color="000000"/>
+              <w:insideV w:val="single" w:sz="4" w:space="0" w:color="000000"/>
             </w:tcBorders>
-            <w:shd w:fill="FFFFFF"/>
             <w:tcMar>
               <w:top w:w="90" w:type="dxa"/>
               <w:left w:w="90" w:type="dxa"/>
@@ -2356,6 +2491,7 @@
             <w:r>
               <w:rPr>
                 <w:b w:val="0"/>
+                <w:color w:val="000000"/>
                 <w:sz w:val="18"/>
               </w:rPr>
               <w:t>The answer says tomorrow’s leave cannot be requested, omitting the policy’s emergency route via the supervisor.</w:t>
@@ -2367,12 +2503,13 @@
             <w:tcW w:type="dxa" w:w="3744"/>
             <w:vAlign w:val="center"/>
             <w:tcBorders>
-              <w:top w:val="single" w:sz="4" w:color="D9D9D9"/>
-              <w:left w:val="single" w:sz="4" w:color="D9D9D9"/>
-              <w:bottom w:val="single" w:sz="4" w:color="D9D9D9"/>
-              <w:right w:val="single" w:sz="4" w:color="D9D9D9"/>
+              <w:top w:val="single" w:sz="4" w:color="000000" w:space="0"/>
+              <w:left w:val="single" w:sz="4" w:color="000000" w:space="0"/>
+              <w:bottom w:val="single" w:sz="4" w:color="000000" w:space="0"/>
+              <w:right w:val="single" w:sz="4" w:color="000000" w:space="0"/>
+              <w:insideH w:val="single" w:sz="4" w:space="0" w:color="000000"/>
+              <w:insideV w:val="single" w:sz="4" w:space="0" w:color="000000"/>
             </w:tcBorders>
-            <w:shd w:fill="FFFFFF"/>
             <w:tcMar>
               <w:top w:w="90" w:type="dxa"/>
               <w:left w:w="90" w:type="dxa"/>
@@ -2387,6 +2524,7 @@
             <w:r>
               <w:rPr>
                 <w:b w:val="0"/>
+                <w:color w:val="000000"/>
                 <w:sz w:val="18"/>
               </w:rPr>
               <w:t>An overly absolute conclusion is not justified by the evidence.</w:t>
@@ -2487,7 +2625,7 @@
       <w:tblPr>
         <w:tblW w:type="auto" w:w="0"/>
         <w:tblLayout w:type="fixed"/>
-        <w:tblLook w:firstColumn="1" w:firstRow="1" w:lastColumn="0" w:lastRow="0" w:noHBand="0" w:noVBand="1" w:val="04A0"/>
+        <w:tblLook w:firstColumn="1" w:firstRow="1" w:lastColumn="0" w:lastRow="0" w:noHBand="1" w:noVBand="1" w:val="04A0"/>
       </w:tblPr>
       <w:tblGrid>
         <w:gridCol w:w="3168"/>
@@ -2503,12 +2641,13 @@
             <w:tcW w:type="dxa" w:w="3168"/>
             <w:vAlign w:val="center"/>
             <w:tcBorders>
-              <w:top w:val="single" w:sz="4" w:color="D9D9D9"/>
-              <w:left w:val="single" w:sz="4" w:color="D9D9D9"/>
-              <w:bottom w:val="single" w:sz="4" w:color="D9D9D9"/>
-              <w:right w:val="single" w:sz="4" w:color="D9D9D9"/>
+              <w:top w:val="single" w:sz="4" w:color="000000" w:space="0"/>
+              <w:left w:val="single" w:sz="4" w:color="000000" w:space="0"/>
+              <w:bottom w:val="single" w:sz="4" w:color="000000" w:space="0"/>
+              <w:right w:val="single" w:sz="4" w:color="000000" w:space="0"/>
+              <w:insideH w:val="single" w:sz="4" w:space="0" w:color="000000"/>
+              <w:insideV w:val="single" w:sz="4" w:space="0" w:color="000000"/>
             </w:tcBorders>
-            <w:shd w:fill="E4EBF0"/>
             <w:tcMar>
               <w:top w:w="90" w:type="dxa"/>
               <w:left w:w="90" w:type="dxa"/>
@@ -2518,6 +2657,9 @@
           </w:tcPr>
           <w:p>
             <w:r>
+              <w:rPr>
+                <w:color w:val="000000"/>
+              </w:rPr>
               <w:t>Useful resolution assumption</w:t>
             </w:r>
           </w:p>
@@ -2527,12 +2669,13 @@
             <w:tcW w:type="dxa" w:w="3024"/>
             <w:vAlign w:val="center"/>
             <w:tcBorders>
-              <w:top w:val="single" w:sz="4" w:color="D9D9D9"/>
-              <w:left w:val="single" w:sz="4" w:color="D9D9D9"/>
-              <w:bottom w:val="single" w:sz="4" w:color="D9D9D9"/>
-              <w:right w:val="single" w:sz="4" w:color="D9D9D9"/>
+              <w:top w:val="single" w:sz="4" w:color="000000" w:space="0"/>
+              <w:left w:val="single" w:sz="4" w:color="000000" w:space="0"/>
+              <w:bottom w:val="single" w:sz="4" w:color="000000" w:space="0"/>
+              <w:right w:val="single" w:sz="4" w:color="000000" w:space="0"/>
+              <w:insideH w:val="single" w:sz="4" w:space="0" w:color="000000"/>
+              <w:insideV w:val="single" w:sz="4" w:space="0" w:color="000000"/>
             </w:tcBorders>
-            <w:shd w:fill="E4EBF0"/>
             <w:tcMar>
               <w:top w:w="90" w:type="dxa"/>
               <w:left w:w="90" w:type="dxa"/>
@@ -2542,6 +2685,9 @@
           </w:tcPr>
           <w:p>
             <w:r>
+              <w:rPr>
+                <w:color w:val="000000"/>
+              </w:rPr>
               <w:t>Cost per useful resolution</w:t>
             </w:r>
           </w:p>
@@ -2551,12 +2697,13 @@
             <w:tcW w:type="dxa" w:w="3024"/>
             <w:vAlign w:val="center"/>
             <w:tcBorders>
-              <w:top w:val="single" w:sz="4" w:color="D9D9D9"/>
-              <w:left w:val="single" w:sz="4" w:color="D9D9D9"/>
-              <w:bottom w:val="single" w:sz="4" w:color="D9D9D9"/>
-              <w:right w:val="single" w:sz="4" w:color="D9D9D9"/>
+              <w:top w:val="single" w:sz="4" w:color="000000" w:space="0"/>
+              <w:left w:val="single" w:sz="4" w:color="000000" w:space="0"/>
+              <w:bottom w:val="single" w:sz="4" w:color="000000" w:space="0"/>
+              <w:right w:val="single" w:sz="4" w:color="000000" w:space="0"/>
+              <w:insideH w:val="single" w:sz="4" w:space="0" w:color="000000"/>
+              <w:insideV w:val="single" w:sz="4" w:space="0" w:color="000000"/>
             </w:tcBorders>
-            <w:shd w:fill="E4EBF0"/>
             <w:tcMar>
               <w:top w:w="90" w:type="dxa"/>
               <w:left w:w="90" w:type="dxa"/>
@@ -2566,6 +2713,9 @@
           </w:tcPr>
           <w:p>
             <w:r>
+              <w:rPr>
+                <w:color w:val="000000"/>
+              </w:rPr>
               <w:t>Net value per month</w:t>
             </w:r>
           </w:p>
@@ -2577,12 +2727,13 @@
             <w:tcW w:type="dxa" w:w="3168"/>
             <w:vAlign w:val="center"/>
             <w:tcBorders>
-              <w:top w:val="single" w:sz="4" w:color="D9D9D9"/>
-              <w:left w:val="single" w:sz="4" w:color="D9D9D9"/>
-              <w:bottom w:val="single" w:sz="4" w:color="D9D9D9"/>
-              <w:right w:val="single" w:sz="4" w:color="D9D9D9"/>
+              <w:top w:val="single" w:sz="4" w:color="000000" w:space="0"/>
+              <w:left w:val="single" w:sz="4" w:color="000000" w:space="0"/>
+              <w:bottom w:val="single" w:sz="4" w:color="000000" w:space="0"/>
+              <w:right w:val="single" w:sz="4" w:color="000000" w:space="0"/>
+              <w:insideH w:val="single" w:sz="4" w:space="0" w:color="000000"/>
+              <w:insideV w:val="single" w:sz="4" w:space="0" w:color="000000"/>
             </w:tcBorders>
-            <w:shd w:fill="FFFFFF"/>
             <w:tcMar>
               <w:top w:w="90" w:type="dxa"/>
               <w:left w:w="90" w:type="dxa"/>
@@ -2592,6 +2743,9 @@
           </w:tcPr>
           <w:p>
             <w:r>
+              <w:rPr>
+                <w:color w:val="000000"/>
+              </w:rPr>
               <w:t>20%</w:t>
             </w:r>
           </w:p>
@@ -2601,12 +2755,13 @@
             <w:tcW w:type="dxa" w:w="3024"/>
             <w:vAlign w:val="center"/>
             <w:tcBorders>
-              <w:top w:val="single" w:sz="4" w:color="D9D9D9"/>
-              <w:left w:val="single" w:sz="4" w:color="D9D9D9"/>
-              <w:bottom w:val="single" w:sz="4" w:color="D9D9D9"/>
-              <w:right w:val="single" w:sz="4" w:color="D9D9D9"/>
+              <w:top w:val="single" w:sz="4" w:color="000000" w:space="0"/>
+              <w:left w:val="single" w:sz="4" w:color="000000" w:space="0"/>
+              <w:bottom w:val="single" w:sz="4" w:color="000000" w:space="0"/>
+              <w:right w:val="single" w:sz="4" w:color="000000" w:space="0"/>
+              <w:insideH w:val="single" w:sz="4" w:space="0" w:color="000000"/>
+              <w:insideV w:val="single" w:sz="4" w:space="0" w:color="000000"/>
             </w:tcBorders>
-            <w:shd w:fill="FFFFFF"/>
             <w:tcMar>
               <w:top w:w="90" w:type="dxa"/>
               <w:left w:w="90" w:type="dxa"/>
@@ -2616,6 +2771,9 @@
           </w:tcPr>
           <w:p>
             <w:r>
+              <w:rPr>
+                <w:color w:val="000000"/>
+              </w:rPr>
               <w:t>USD 8.94</w:t>
             </w:r>
           </w:p>
@@ -2625,12 +2783,13 @@
             <w:tcW w:type="dxa" w:w="3024"/>
             <w:vAlign w:val="center"/>
             <w:tcBorders>
-              <w:top w:val="single" w:sz="4" w:color="D9D9D9"/>
-              <w:left w:val="single" w:sz="4" w:color="D9D9D9"/>
-              <w:bottom w:val="single" w:sz="4" w:color="D9D9D9"/>
-              <w:right w:val="single" w:sz="4" w:color="D9D9D9"/>
+              <w:top w:val="single" w:sz="4" w:color="000000" w:space="0"/>
+              <w:left w:val="single" w:sz="4" w:color="000000" w:space="0"/>
+              <w:bottom w:val="single" w:sz="4" w:color="000000" w:space="0"/>
+              <w:right w:val="single" w:sz="4" w:color="000000" w:space="0"/>
+              <w:insideH w:val="single" w:sz="4" w:space="0" w:color="000000"/>
+              <w:insideV w:val="single" w:sz="4" w:space="0" w:color="000000"/>
             </w:tcBorders>
-            <w:shd w:fill="FFFFFF"/>
             <w:tcMar>
               <w:top w:w="90" w:type="dxa"/>
               <w:left w:w="90" w:type="dxa"/>
@@ -2640,6 +2799,9 @@
           </w:tcPr>
           <w:p>
             <w:r>
+              <w:rPr>
+                <w:color w:val="000000"/>
+              </w:rPr>
               <w:t>negative USD 548.67</w:t>
             </w:r>
           </w:p>
@@ -2651,12 +2813,13 @@
             <w:tcW w:type="dxa" w:w="3168"/>
             <w:vAlign w:val="center"/>
             <w:tcBorders>
-              <w:top w:val="single" w:sz="4" w:color="D9D9D9"/>
-              <w:left w:val="single" w:sz="4" w:color="D9D9D9"/>
-              <w:bottom w:val="single" w:sz="4" w:color="D9D9D9"/>
-              <w:right w:val="single" w:sz="4" w:color="D9D9D9"/>
+              <w:top w:val="single" w:sz="4" w:color="000000" w:space="0"/>
+              <w:left w:val="single" w:sz="4" w:color="000000" w:space="0"/>
+              <w:bottom w:val="single" w:sz="4" w:color="000000" w:space="0"/>
+              <w:right w:val="single" w:sz="4" w:color="000000" w:space="0"/>
+              <w:insideH w:val="single" w:sz="4" w:space="0" w:color="000000"/>
+              <w:insideV w:val="single" w:sz="4" w:space="0" w:color="000000"/>
             </w:tcBorders>
-            <w:shd w:fill="FFFFFF"/>
             <w:tcMar>
               <w:top w:w="90" w:type="dxa"/>
               <w:left w:w="90" w:type="dxa"/>
@@ -2666,6 +2829,9 @@
           </w:tcPr>
           <w:p>
             <w:r>
+              <w:rPr>
+                <w:color w:val="000000"/>
+              </w:rPr>
               <w:t>50%</w:t>
             </w:r>
           </w:p>
@@ -2675,12 +2841,13 @@
             <w:tcW w:type="dxa" w:w="3024"/>
             <w:vAlign w:val="center"/>
             <w:tcBorders>
-              <w:top w:val="single" w:sz="4" w:color="D9D9D9"/>
-              <w:left w:val="single" w:sz="4" w:color="D9D9D9"/>
-              <w:bottom w:val="single" w:sz="4" w:color="D9D9D9"/>
-              <w:right w:val="single" w:sz="4" w:color="D9D9D9"/>
+              <w:top w:val="single" w:sz="4" w:color="000000" w:space="0"/>
+              <w:left w:val="single" w:sz="4" w:color="000000" w:space="0"/>
+              <w:bottom w:val="single" w:sz="4" w:color="000000" w:space="0"/>
+              <w:right w:val="single" w:sz="4" w:color="000000" w:space="0"/>
+              <w:insideH w:val="single" w:sz="4" w:space="0" w:color="000000"/>
+              <w:insideV w:val="single" w:sz="4" w:space="0" w:color="000000"/>
             </w:tcBorders>
-            <w:shd w:fill="FFFFFF"/>
             <w:tcMar>
               <w:top w:w="90" w:type="dxa"/>
               <w:left w:w="90" w:type="dxa"/>
@@ -2690,6 +2857,9 @@
           </w:tcPr>
           <w:p>
             <w:r>
+              <w:rPr>
+                <w:color w:val="000000"/>
+              </w:rPr>
               <w:t>USD 2.33</w:t>
             </w:r>
           </w:p>
@@ -2699,12 +2869,13 @@
             <w:tcW w:type="dxa" w:w="3024"/>
             <w:vAlign w:val="center"/>
             <w:tcBorders>
-              <w:top w:val="single" w:sz="4" w:color="D9D9D9"/>
-              <w:left w:val="single" w:sz="4" w:color="D9D9D9"/>
-              <w:bottom w:val="single" w:sz="4" w:color="D9D9D9"/>
-              <w:right w:val="single" w:sz="4" w:color="D9D9D9"/>
+              <w:top w:val="single" w:sz="4" w:color="000000" w:space="0"/>
+              <w:left w:val="single" w:sz="4" w:color="000000" w:space="0"/>
+              <w:bottom w:val="single" w:sz="4" w:color="000000" w:space="0"/>
+              <w:right w:val="single" w:sz="4" w:color="000000" w:space="0"/>
+              <w:insideH w:val="single" w:sz="4" w:space="0" w:color="000000"/>
+              <w:insideV w:val="single" w:sz="4" w:space="0" w:color="000000"/>
             </w:tcBorders>
-            <w:shd w:fill="FFFFFF"/>
             <w:tcMar>
               <w:top w:w="90" w:type="dxa"/>
               <w:left w:w="90" w:type="dxa"/>
@@ -2714,6 +2885,9 @@
           </w:tcPr>
           <w:p>
             <w:r>
+              <w:rPr>
+                <w:color w:val="000000"/>
+              </w:rPr>
               <w:t>negative USD 48.67</w:t>
             </w:r>
           </w:p>
@@ -2725,12 +2899,13 @@
             <w:tcW w:type="dxa" w:w="3168"/>
             <w:vAlign w:val="center"/>
             <w:tcBorders>
-              <w:top w:val="single" w:sz="4" w:color="D9D9D9"/>
-              <w:left w:val="single" w:sz="4" w:color="D9D9D9"/>
-              <w:bottom w:val="single" w:sz="4" w:color="D9D9D9"/>
-              <w:right w:val="single" w:sz="4" w:color="D9D9D9"/>
+              <w:top w:val="single" w:sz="4" w:color="000000" w:space="0"/>
+              <w:left w:val="single" w:sz="4" w:color="000000" w:space="0"/>
+              <w:bottom w:val="single" w:sz="4" w:color="000000" w:space="0"/>
+              <w:right w:val="single" w:sz="4" w:color="000000" w:space="0"/>
+              <w:insideH w:val="single" w:sz="4" w:space="0" w:color="000000"/>
+              <w:insideV w:val="single" w:sz="4" w:space="0" w:color="000000"/>
             </w:tcBorders>
-            <w:shd w:fill="FFFFFF"/>
             <w:tcMar>
               <w:top w:w="90" w:type="dxa"/>
               <w:left w:w="90" w:type="dxa"/>
@@ -2740,6 +2915,9 @@
           </w:tcPr>
           <w:p>
             <w:r>
+              <w:rPr>
+                <w:color w:val="000000"/>
+              </w:rPr>
               <w:t>80%</w:t>
             </w:r>
           </w:p>
@@ -2749,12 +2927,13 @@
             <w:tcW w:type="dxa" w:w="3024"/>
             <w:vAlign w:val="center"/>
             <w:tcBorders>
-              <w:top w:val="single" w:sz="4" w:color="D9D9D9"/>
-              <w:left w:val="single" w:sz="4" w:color="D9D9D9"/>
-              <w:bottom w:val="single" w:sz="4" w:color="D9D9D9"/>
-              <w:right w:val="single" w:sz="4" w:color="D9D9D9"/>
+              <w:top w:val="single" w:sz="4" w:color="000000" w:space="0"/>
+              <w:left w:val="single" w:sz="4" w:color="000000" w:space="0"/>
+              <w:bottom w:val="single" w:sz="4" w:color="000000" w:space="0"/>
+              <w:right w:val="single" w:sz="4" w:color="000000" w:space="0"/>
+              <w:insideH w:val="single" w:sz="4" w:space="0" w:color="000000"/>
+              <w:insideV w:val="single" w:sz="4" w:space="0" w:color="000000"/>
             </w:tcBorders>
-            <w:shd w:fill="FFFFFF"/>
             <w:tcMar>
               <w:top w:w="90" w:type="dxa"/>
               <w:left w:w="90" w:type="dxa"/>
@@ -2764,6 +2943,9 @@
           </w:tcPr>
           <w:p>
             <w:r>
+              <w:rPr>
+                <w:color w:val="000000"/>
+              </w:rPr>
               <w:t>USD 0.67</w:t>
             </w:r>
           </w:p>
@@ -2773,12 +2955,13 @@
             <w:tcW w:type="dxa" w:w="3024"/>
             <w:vAlign w:val="center"/>
             <w:tcBorders>
-              <w:top w:val="single" w:sz="4" w:color="D9D9D9"/>
-              <w:left w:val="single" w:sz="4" w:color="D9D9D9"/>
-              <w:bottom w:val="single" w:sz="4" w:color="D9D9D9"/>
-              <w:right w:val="single" w:sz="4" w:color="D9D9D9"/>
+              <w:top w:val="single" w:sz="4" w:color="000000" w:space="0"/>
+              <w:left w:val="single" w:sz="4" w:color="000000" w:space="0"/>
+              <w:bottom w:val="single" w:sz="4" w:color="000000" w:space="0"/>
+              <w:right w:val="single" w:sz="4" w:color="000000" w:space="0"/>
+              <w:insideH w:val="single" w:sz="4" w:space="0" w:color="000000"/>
+              <w:insideV w:val="single" w:sz="4" w:space="0" w:color="000000"/>
             </w:tcBorders>
-            <w:shd w:fill="FFFFFF"/>
             <w:tcMar>
               <w:top w:w="90" w:type="dxa"/>
               <w:left w:w="90" w:type="dxa"/>
@@ -2788,6 +2971,9 @@
           </w:tcPr>
           <w:p>
             <w:r>
+              <w:rPr>
+                <w:color w:val="000000"/>
+              </w:rPr>
               <w:t>USD 451.33</w:t>
             </w:r>
           </w:p>
@@ -2813,7 +2999,7 @@
       <w:tblPr>
         <w:tblW w:type="auto" w:w="0"/>
         <w:tblLayout w:type="fixed"/>
-        <w:tblLook w:firstColumn="1" w:firstRow="1" w:lastColumn="0" w:lastRow="0" w:noHBand="0" w:noVBand="1" w:val="04A0"/>
+        <w:tblLook w:firstColumn="1" w:firstRow="1" w:lastColumn="0" w:lastRow="0" w:noHBand="1" w:noVBand="1" w:val="04A0"/>
       </w:tblPr>
       <w:tblGrid>
         <w:gridCol w:w="1944"/>
@@ -2829,12 +3015,13 @@
             <w:tcW w:type="dxa" w:w="1944"/>
             <w:vAlign w:val="center"/>
             <w:tcBorders>
-              <w:top w:val="single" w:sz="4" w:color="D9D9D9"/>
-              <w:left w:val="single" w:sz="4" w:color="D9D9D9"/>
-              <w:bottom w:val="single" w:sz="4" w:color="D9D9D9"/>
-              <w:right w:val="single" w:sz="4" w:color="D9D9D9"/>
+              <w:top w:val="single" w:sz="4" w:color="000000" w:space="0"/>
+              <w:left w:val="single" w:sz="4" w:color="000000" w:space="0"/>
+              <w:bottom w:val="single" w:sz="4" w:color="000000" w:space="0"/>
+              <w:right w:val="single" w:sz="4" w:color="000000" w:space="0"/>
+              <w:insideH w:val="single" w:sz="4" w:space="0" w:color="000000"/>
+              <w:insideV w:val="single" w:sz="4" w:space="0" w:color="000000"/>
             </w:tcBorders>
-            <w:shd w:fill="E4EBF0"/>
             <w:tcMar>
               <w:top w:w="90" w:type="dxa"/>
               <w:left w:w="90" w:type="dxa"/>
@@ -2849,6 +3036,7 @@
             <w:r>
               <w:rPr>
                 <w:b/>
+                <w:color w:val="000000"/>
                 <w:sz w:val="18"/>
               </w:rPr>
               <w:t>Risk</w:t>
@@ -2860,12 +3048,13 @@
             <w:tcW w:type="dxa" w:w="3312"/>
             <w:vAlign w:val="center"/>
             <w:tcBorders>
-              <w:top w:val="single" w:sz="4" w:color="D9D9D9"/>
-              <w:left w:val="single" w:sz="4" w:color="D9D9D9"/>
-              <w:bottom w:val="single" w:sz="4" w:color="D9D9D9"/>
-              <w:right w:val="single" w:sz="4" w:color="D9D9D9"/>
+              <w:top w:val="single" w:sz="4" w:color="000000" w:space="0"/>
+              <w:left w:val="single" w:sz="4" w:color="000000" w:space="0"/>
+              <w:bottom w:val="single" w:sz="4" w:color="000000" w:space="0"/>
+              <w:right w:val="single" w:sz="4" w:color="000000" w:space="0"/>
+              <w:insideH w:val="single" w:sz="4" w:space="0" w:color="000000"/>
+              <w:insideV w:val="single" w:sz="4" w:space="0" w:color="000000"/>
             </w:tcBorders>
-            <w:shd w:fill="E4EBF0"/>
             <w:tcMar>
               <w:top w:w="90" w:type="dxa"/>
               <w:left w:w="90" w:type="dxa"/>
@@ -2880,6 +3069,7 @@
             <w:r>
               <w:rPr>
                 <w:b/>
+                <w:color w:val="000000"/>
                 <w:sz w:val="18"/>
               </w:rPr>
               <w:t>Current control</w:t>
@@ -2891,12 +3081,13 @@
             <w:tcW w:type="dxa" w:w="3960"/>
             <w:vAlign w:val="center"/>
             <w:tcBorders>
-              <w:top w:val="single" w:sz="4" w:color="D9D9D9"/>
-              <w:left w:val="single" w:sz="4" w:color="D9D9D9"/>
-              <w:bottom w:val="single" w:sz="4" w:color="D9D9D9"/>
-              <w:right w:val="single" w:sz="4" w:color="D9D9D9"/>
+              <w:top w:val="single" w:sz="4" w:color="000000" w:space="0"/>
+              <w:left w:val="single" w:sz="4" w:color="000000" w:space="0"/>
+              <w:bottom w:val="single" w:sz="4" w:color="000000" w:space="0"/>
+              <w:right w:val="single" w:sz="4" w:color="000000" w:space="0"/>
+              <w:insideH w:val="single" w:sz="4" w:space="0" w:color="000000"/>
+              <w:insideV w:val="single" w:sz="4" w:space="0" w:color="000000"/>
             </w:tcBorders>
-            <w:shd w:fill="E4EBF0"/>
             <w:tcMar>
               <w:top w:w="90" w:type="dxa"/>
               <w:left w:w="90" w:type="dxa"/>
@@ -2911,6 +3102,7 @@
             <w:r>
               <w:rPr>
                 <w:b/>
+                <w:color w:val="000000"/>
                 <w:sz w:val="18"/>
               </w:rPr>
               <w:t>Remaining limit</w:t>
@@ -2924,12 +3116,13 @@
             <w:tcW w:type="dxa" w:w="1944"/>
             <w:vAlign w:val="center"/>
             <w:tcBorders>
-              <w:top w:val="single" w:sz="4" w:color="D9D9D9"/>
-              <w:left w:val="single" w:sz="4" w:color="D9D9D9"/>
-              <w:bottom w:val="single" w:sz="4" w:color="D9D9D9"/>
-              <w:right w:val="single" w:sz="4" w:color="D9D9D9"/>
+              <w:top w:val="single" w:sz="4" w:color="000000" w:space="0"/>
+              <w:left w:val="single" w:sz="4" w:color="000000" w:space="0"/>
+              <w:bottom w:val="single" w:sz="4" w:color="000000" w:space="0"/>
+              <w:right w:val="single" w:sz="4" w:color="000000" w:space="0"/>
+              <w:insideH w:val="single" w:sz="4" w:space="0" w:color="000000"/>
+              <w:insideV w:val="single" w:sz="4" w:space="0" w:color="000000"/>
             </w:tcBorders>
-            <w:shd w:fill="FFFFFF"/>
             <w:tcMar>
               <w:top w:w="90" w:type="dxa"/>
               <w:left w:w="90" w:type="dxa"/>
@@ -2944,6 +3137,7 @@
             <w:r>
               <w:rPr>
                 <w:b w:val="0"/>
+                <w:color w:val="000000"/>
                 <w:sz w:val="18"/>
               </w:rPr>
               <w:t>Policy errors</w:t>
@@ -2955,12 +3149,13 @@
             <w:tcW w:type="dxa" w:w="3312"/>
             <w:vAlign w:val="center"/>
             <w:tcBorders>
-              <w:top w:val="single" w:sz="4" w:color="D9D9D9"/>
-              <w:left w:val="single" w:sz="4" w:color="D9D9D9"/>
-              <w:bottom w:val="single" w:sz="4" w:color="D9D9D9"/>
-              <w:right w:val="single" w:sz="4" w:color="D9D9D9"/>
+              <w:top w:val="single" w:sz="4" w:color="000000" w:space="0"/>
+              <w:left w:val="single" w:sz="4" w:color="000000" w:space="0"/>
+              <w:bottom w:val="single" w:sz="4" w:color="000000" w:space="0"/>
+              <w:right w:val="single" w:sz="4" w:color="000000" w:space="0"/>
+              <w:insideH w:val="single" w:sz="4" w:space="0" w:color="000000"/>
+              <w:insideV w:val="single" w:sz="4" w:space="0" w:color="000000"/>
             </w:tcBorders>
-            <w:shd w:fill="FFFFFF"/>
             <w:tcMar>
               <w:top w:w="90" w:type="dxa"/>
               <w:left w:w="90" w:type="dxa"/>
@@ -2975,6 +3170,7 @@
             <w:r>
               <w:rPr>
                 <w:b w:val="0"/>
+                <w:color w:val="000000"/>
                 <w:sz w:val="18"/>
               </w:rPr>
               <w:t>Version checks, retrieved evidence and source IDs</w:t>
@@ -2986,12 +3182,13 @@
             <w:tcW w:type="dxa" w:w="3960"/>
             <w:vAlign w:val="center"/>
             <w:tcBorders>
-              <w:top w:val="single" w:sz="4" w:color="D9D9D9"/>
-              <w:left w:val="single" w:sz="4" w:color="D9D9D9"/>
-              <w:bottom w:val="single" w:sz="4" w:color="D9D9D9"/>
-              <w:right w:val="single" w:sz="4" w:color="D9D9D9"/>
+              <w:top w:val="single" w:sz="4" w:color="000000" w:space="0"/>
+              <w:left w:val="single" w:sz="4" w:color="000000" w:space="0"/>
+              <w:bottom w:val="single" w:sz="4" w:color="000000" w:space="0"/>
+              <w:right w:val="single" w:sz="4" w:color="000000" w:space="0"/>
+              <w:insideH w:val="single" w:sz="4" w:space="0" w:color="000000"/>
+              <w:insideV w:val="single" w:sz="4" w:space="0" w:color="000000"/>
             </w:tcBorders>
-            <w:shd w:fill="FFFFFF"/>
             <w:tcMar>
               <w:top w:w="90" w:type="dxa"/>
               <w:left w:w="90" w:type="dxa"/>
@@ -3006,6 +3203,7 @@
             <w:r>
               <w:rPr>
                 <w:b w:val="0"/>
+                <w:color w:val="000000"/>
                 <w:sz w:val="18"/>
               </w:rPr>
               <w:t>No independent HR approval; cited answers can still be misleading.</w:t>
@@ -3019,12 +3217,13 @@
             <w:tcW w:type="dxa" w:w="1944"/>
             <w:vAlign w:val="center"/>
             <w:tcBorders>
-              <w:top w:val="single" w:sz="4" w:color="D9D9D9"/>
-              <w:left w:val="single" w:sz="4" w:color="D9D9D9"/>
-              <w:bottom w:val="single" w:sz="4" w:color="D9D9D9"/>
-              <w:right w:val="single" w:sz="4" w:color="D9D9D9"/>
+              <w:top w:val="single" w:sz="4" w:color="000000" w:space="0"/>
+              <w:left w:val="single" w:sz="4" w:color="000000" w:space="0"/>
+              <w:bottom w:val="single" w:sz="4" w:color="000000" w:space="0"/>
+              <w:right w:val="single" w:sz="4" w:color="000000" w:space="0"/>
+              <w:insideH w:val="single" w:sz="4" w:space="0" w:color="000000"/>
+              <w:insideV w:val="single" w:sz="4" w:space="0" w:color="000000"/>
             </w:tcBorders>
-            <w:shd w:fill="FFFFFF"/>
             <w:tcMar>
               <w:top w:w="90" w:type="dxa"/>
               <w:left w:w="90" w:type="dxa"/>
@@ -3039,6 +3238,7 @@
             <w:r>
               <w:rPr>
                 <w:b w:val="0"/>
+                <w:color w:val="000000"/>
                 <w:sz w:val="18"/>
               </w:rPr>
               <w:t>Unwanted action</w:t>
@@ -3050,12 +3250,13 @@
             <w:tcW w:type="dxa" w:w="3312"/>
             <w:vAlign w:val="center"/>
             <w:tcBorders>
-              <w:top w:val="single" w:sz="4" w:color="D9D9D9"/>
-              <w:left w:val="single" w:sz="4" w:color="D9D9D9"/>
-              <w:bottom w:val="single" w:sz="4" w:color="D9D9D9"/>
-              <w:right w:val="single" w:sz="4" w:color="D9D9D9"/>
+              <w:top w:val="single" w:sz="4" w:color="000000" w:space="0"/>
+              <w:left w:val="single" w:sz="4" w:color="000000" w:space="0"/>
+              <w:bottom w:val="single" w:sz="4" w:color="000000" w:space="0"/>
+              <w:right w:val="single" w:sz="4" w:color="000000" w:space="0"/>
+              <w:insideH w:val="single" w:sz="4" w:space="0" w:color="000000"/>
+              <w:insideV w:val="single" w:sz="4" w:space="0" w:color="000000"/>
             </w:tcBorders>
-            <w:shd w:fill="FFFFFF"/>
             <w:tcMar>
               <w:top w:w="90" w:type="dxa"/>
               <w:left w:w="90" w:type="dxa"/>
@@ -3070,6 +3271,7 @@
             <w:r>
               <w:rPr>
                 <w:b w:val="0"/>
+                <w:color w:val="000000"/>
                 <w:sz w:val="18"/>
               </w:rPr>
               <w:t>Conservative routing and unsubmitted drafts</w:t>
@@ -3081,12 +3283,13 @@
             <w:tcW w:type="dxa" w:w="3960"/>
             <w:vAlign w:val="center"/>
             <w:tcBorders>
-              <w:top w:val="single" w:sz="4" w:color="D9D9D9"/>
-              <w:left w:val="single" w:sz="4" w:color="D9D9D9"/>
-              <w:bottom w:val="single" w:sz="4" w:color="D9D9D9"/>
-              <w:right w:val="single" w:sz="4" w:color="D9D9D9"/>
+              <w:top w:val="single" w:sz="4" w:color="000000" w:space="0"/>
+              <w:left w:val="single" w:sz="4" w:color="000000" w:space="0"/>
+              <w:bottom w:val="single" w:sz="4" w:color="000000" w:space="0"/>
+              <w:right w:val="single" w:sz="4" w:color="000000" w:space="0"/>
+              <w:insideH w:val="single" w:sz="4" w:space="0" w:color="000000"/>
+              <w:insideV w:val="single" w:sz="4" w:space="0" w:color="000000"/>
             </w:tcBorders>
-            <w:shd w:fill="FFFFFF"/>
             <w:tcMar>
               <w:top w:w="90" w:type="dxa"/>
               <w:left w:w="90" w:type="dxa"/>
@@ -3101,6 +3304,7 @@
             <w:r>
               <w:rPr>
                 <w:b w:val="0"/>
+                <w:color w:val="000000"/>
                 <w:sz w:val="18"/>
               </w:rPr>
               <w:t>No authenticated production confirmation or HR connector.</w:t>
@@ -3114,12 +3318,13 @@
             <w:tcW w:type="dxa" w:w="1944"/>
             <w:vAlign w:val="center"/>
             <w:tcBorders>
-              <w:top w:val="single" w:sz="4" w:color="D9D9D9"/>
-              <w:left w:val="single" w:sz="4" w:color="D9D9D9"/>
-              <w:bottom w:val="single" w:sz="4" w:color="D9D9D9"/>
-              <w:right w:val="single" w:sz="4" w:color="D9D9D9"/>
+              <w:top w:val="single" w:sz="4" w:color="000000" w:space="0"/>
+              <w:left w:val="single" w:sz="4" w:color="000000" w:space="0"/>
+              <w:bottom w:val="single" w:sz="4" w:color="000000" w:space="0"/>
+              <w:right w:val="single" w:sz="4" w:color="000000" w:space="0"/>
+              <w:insideH w:val="single" w:sz="4" w:space="0" w:color="000000"/>
+              <w:insideV w:val="single" w:sz="4" w:space="0" w:color="000000"/>
             </w:tcBorders>
-            <w:shd w:fill="FFFFFF"/>
             <w:tcMar>
               <w:top w:w="90" w:type="dxa"/>
               <w:left w:w="90" w:type="dxa"/>
@@ -3134,6 +3339,7 @@
             <w:r>
               <w:rPr>
                 <w:b w:val="0"/>
+                <w:color w:val="000000"/>
                 <w:sz w:val="18"/>
               </w:rPr>
               <w:t>Invented personal fields</w:t>
@@ -3145,12 +3351,13 @@
             <w:tcW w:type="dxa" w:w="3312"/>
             <w:vAlign w:val="center"/>
             <w:tcBorders>
-              <w:top w:val="single" w:sz="4" w:color="D9D9D9"/>
-              <w:left w:val="single" w:sz="4" w:color="D9D9D9"/>
-              <w:bottom w:val="single" w:sz="4" w:color="D9D9D9"/>
-              <w:right w:val="single" w:sz="4" w:color="D9D9D9"/>
+              <w:top w:val="single" w:sz="4" w:color="000000" w:space="0"/>
+              <w:left w:val="single" w:sz="4" w:color="000000" w:space="0"/>
+              <w:bottom w:val="single" w:sz="4" w:color="000000" w:space="0"/>
+              <w:right w:val="single" w:sz="4" w:color="000000" w:space="0"/>
+              <w:insideH w:val="single" w:sz="4" w:space="0" w:color="000000"/>
+              <w:insideV w:val="single" w:sz="4" w:space="0" w:color="000000"/>
             </w:tcBorders>
-            <w:shd w:fill="FFFFFF"/>
             <w:tcMar>
               <w:top w:w="90" w:type="dxa"/>
               <w:left w:w="90" w:type="dxa"/>
@@ -3165,6 +3372,7 @@
             <w:r>
               <w:rPr>
                 <w:b w:val="0"/>
+                <w:color w:val="000000"/>
                 <w:sz w:val="18"/>
               </w:rPr>
               <w:t>Explicit extraction, nulls and format checks</w:t>
@@ -3176,12 +3384,13 @@
             <w:tcW w:type="dxa" w:w="3960"/>
             <w:vAlign w:val="center"/>
             <w:tcBorders>
-              <w:top w:val="single" w:sz="4" w:color="D9D9D9"/>
-              <w:left w:val="single" w:sz="4" w:color="D9D9D9"/>
-              <w:bottom w:val="single" w:sz="4" w:color="D9D9D9"/>
-              <w:right w:val="single" w:sz="4" w:color="D9D9D9"/>
+              <w:top w:val="single" w:sz="4" w:color="000000" w:space="0"/>
+              <w:left w:val="single" w:sz="4" w:color="000000" w:space="0"/>
+              <w:bottom w:val="single" w:sz="4" w:color="000000" w:space="0"/>
+              <w:right w:val="single" w:sz="4" w:color="000000" w:space="0"/>
+              <w:insideH w:val="single" w:sz="4" w:space="0" w:color="000000"/>
+              <w:insideV w:val="single" w:sz="4" w:space="0" w:color="000000"/>
             </w:tcBorders>
-            <w:shd w:fill="FFFFFF"/>
             <w:tcMar>
               <w:top w:w="90" w:type="dxa"/>
               <w:left w:w="90" w:type="dxa"/>
@@ -3196,6 +3405,7 @@
             <w:r>
               <w:rPr>
                 <w:b w:val="0"/>
+                <w:color w:val="000000"/>
                 <w:sz w:val="18"/>
               </w:rPr>
               <w:t>Narrow input patterns; no guided collection of missing fields.</w:t>
@@ -3209,12 +3419,13 @@
             <w:tcW w:type="dxa" w:w="1944"/>
             <w:vAlign w:val="center"/>
             <w:tcBorders>
-              <w:top w:val="single" w:sz="4" w:color="D9D9D9"/>
-              <w:left w:val="single" w:sz="4" w:color="D9D9D9"/>
-              <w:bottom w:val="single" w:sz="4" w:color="D9D9D9"/>
-              <w:right w:val="single" w:sz="4" w:color="D9D9D9"/>
+              <w:top w:val="single" w:sz="4" w:color="000000" w:space="0"/>
+              <w:left w:val="single" w:sz="4" w:color="000000" w:space="0"/>
+              <w:bottom w:val="single" w:sz="4" w:color="000000" w:space="0"/>
+              <w:right w:val="single" w:sz="4" w:color="000000" w:space="0"/>
+              <w:insideH w:val="single" w:sz="4" w:space="0" w:color="000000"/>
+              <w:insideV w:val="single" w:sz="4" w:space="0" w:color="000000"/>
             </w:tcBorders>
-            <w:shd w:fill="FFFFFF"/>
             <w:tcMar>
               <w:top w:w="90" w:type="dxa"/>
               <w:left w:w="90" w:type="dxa"/>
@@ -3229,6 +3440,7 @@
             <w:r>
               <w:rPr>
                 <w:b w:val="0"/>
+                <w:color w:val="000000"/>
                 <w:sz w:val="18"/>
               </w:rPr>
               <w:t>Prompt injection</w:t>
@@ -3240,12 +3452,13 @@
             <w:tcW w:type="dxa" w:w="3312"/>
             <w:vAlign w:val="center"/>
             <w:tcBorders>
-              <w:top w:val="single" w:sz="4" w:color="D9D9D9"/>
-              <w:left w:val="single" w:sz="4" w:color="D9D9D9"/>
-              <w:bottom w:val="single" w:sz="4" w:color="D9D9D9"/>
-              <w:right w:val="single" w:sz="4" w:color="D9D9D9"/>
+              <w:top w:val="single" w:sz="4" w:color="000000" w:space="0"/>
+              <w:left w:val="single" w:sz="4" w:color="000000" w:space="0"/>
+              <w:bottom w:val="single" w:sz="4" w:color="000000" w:space="0"/>
+              <w:right w:val="single" w:sz="4" w:color="000000" w:space="0"/>
+              <w:insideH w:val="single" w:sz="4" w:space="0" w:color="000000"/>
+              <w:insideV w:val="single" w:sz="4" w:space="0" w:color="000000"/>
             </w:tcBorders>
-            <w:shd w:fill="FFFFFF"/>
             <w:tcMar>
               <w:top w:w="90" w:type="dxa"/>
               <w:left w:w="90" w:type="dxa"/>
@@ -3260,6 +3473,7 @@
             <w:r>
               <w:rPr>
                 <w:b w:val="0"/>
+                <w:color w:val="000000"/>
                 <w:sz w:val="18"/>
               </w:rPr>
               <w:t>Instruction boundary and blocked patterns</w:t>
@@ -3271,12 +3485,13 @@
             <w:tcW w:type="dxa" w:w="3960"/>
             <w:vAlign w:val="center"/>
             <w:tcBorders>
-              <w:top w:val="single" w:sz="4" w:color="D9D9D9"/>
-              <w:left w:val="single" w:sz="4" w:color="D9D9D9"/>
-              <w:bottom w:val="single" w:sz="4" w:color="D9D9D9"/>
-              <w:right w:val="single" w:sz="4" w:color="D9D9D9"/>
+              <w:top w:val="single" w:sz="4" w:color="000000" w:space="0"/>
+              <w:left w:val="single" w:sz="4" w:color="000000" w:space="0"/>
+              <w:bottom w:val="single" w:sz="4" w:color="000000" w:space="0"/>
+              <w:right w:val="single" w:sz="4" w:color="000000" w:space="0"/>
+              <w:insideH w:val="single" w:sz="4" w:space="0" w:color="000000"/>
+              <w:insideV w:val="single" w:sz="4" w:space="0" w:color="000000"/>
             </w:tcBorders>
-            <w:shd w:fill="FFFFFF"/>
             <w:tcMar>
               <w:top w:w="90" w:type="dxa"/>
               <w:left w:w="90" w:type="dxa"/>
@@ -3291,6 +3506,7 @@
             <w:r>
               <w:rPr>
                 <w:b w:val="0"/>
+                <w:color w:val="000000"/>
                 <w:sz w:val="18"/>
               </w:rPr>
               <w:t>Not exhaustive; no penetration test or hostile-document study.</w:t>
@@ -3304,12 +3520,13 @@
             <w:tcW w:type="dxa" w:w="1944"/>
             <w:vAlign w:val="center"/>
             <w:tcBorders>
-              <w:top w:val="single" w:sz="4" w:color="D9D9D9"/>
-              <w:left w:val="single" w:sz="4" w:color="D9D9D9"/>
-              <w:bottom w:val="single" w:sz="4" w:color="D9D9D9"/>
-              <w:right w:val="single" w:sz="4" w:color="D9D9D9"/>
+              <w:top w:val="single" w:sz="4" w:color="000000" w:space="0"/>
+              <w:left w:val="single" w:sz="4" w:color="000000" w:space="0"/>
+              <w:bottom w:val="single" w:sz="4" w:color="000000" w:space="0"/>
+              <w:right w:val="single" w:sz="4" w:color="000000" w:space="0"/>
+              <w:insideH w:val="single" w:sz="4" w:space="0" w:color="000000"/>
+              <w:insideV w:val="single" w:sz="4" w:space="0" w:color="000000"/>
             </w:tcBorders>
-            <w:shd w:fill="FFFFFF"/>
             <w:tcMar>
               <w:top w:w="90" w:type="dxa"/>
               <w:left w:w="90" w:type="dxa"/>
@@ -3324,6 +3541,7 @@
             <w:r>
               <w:rPr>
                 <w:b w:val="0"/>
+                <w:color w:val="000000"/>
                 <w:sz w:val="18"/>
               </w:rPr>
               <w:t>Sensitive information</w:t>
@@ -3335,12 +3553,13 @@
             <w:tcW w:type="dxa" w:w="3312"/>
             <w:vAlign w:val="center"/>
             <w:tcBorders>
-              <w:top w:val="single" w:sz="4" w:color="D9D9D9"/>
-              <w:left w:val="single" w:sz="4" w:color="D9D9D9"/>
-              <w:bottom w:val="single" w:sz="4" w:color="D9D9D9"/>
-              <w:right w:val="single" w:sz="4" w:color="D9D9D9"/>
+              <w:top w:val="single" w:sz="4" w:color="000000" w:space="0"/>
+              <w:left w:val="single" w:sz="4" w:color="000000" w:space="0"/>
+              <w:bottom w:val="single" w:sz="4" w:color="000000" w:space="0"/>
+              <w:right w:val="single" w:sz="4" w:color="000000" w:space="0"/>
+              <w:insideH w:val="single" w:sz="4" w:space="0" w:color="000000"/>
+              <w:insideV w:val="single" w:sz="4" w:space="0" w:color="000000"/>
             </w:tcBorders>
-            <w:shd w:fill="FFFFFF"/>
             <w:tcMar>
               <w:top w:w="90" w:type="dxa"/>
               <w:left w:w="90" w:type="dxa"/>
@@ -3355,6 +3574,7 @@
             <w:r>
               <w:rPr>
                 <w:b w:val="0"/>
+                <w:color w:val="000000"/>
                 <w:sz w:val="18"/>
               </w:rPr>
               <w:t>Fictional data and visible input warning</w:t>
@@ -3366,12 +3586,13 @@
             <w:tcW w:type="dxa" w:w="3960"/>
             <w:vAlign w:val="center"/>
             <w:tcBorders>
-              <w:top w:val="single" w:sz="4" w:color="D9D9D9"/>
-              <w:left w:val="single" w:sz="4" w:color="D9D9D9"/>
-              <w:bottom w:val="single" w:sz="4" w:color="D9D9D9"/>
-              <w:right w:val="single" w:sz="4" w:color="D9D9D9"/>
+              <w:top w:val="single" w:sz="4" w:color="000000" w:space="0"/>
+              <w:left w:val="single" w:sz="4" w:color="000000" w:space="0"/>
+              <w:bottom w:val="single" w:sz="4" w:color="000000" w:space="0"/>
+              <w:right w:val="single" w:sz="4" w:color="000000" w:space="0"/>
+              <w:insideH w:val="single" w:sz="4" w:space="0" w:color="000000"/>
+              <w:insideV w:val="single" w:sz="4" w:space="0" w:color="000000"/>
             </w:tcBorders>
-            <w:shd w:fill="FFFFFF"/>
             <w:tcMar>
               <w:top w:w="90" w:type="dxa"/>
               <w:left w:w="90" w:type="dxa"/>
@@ -3386,6 +3607,7 @@
             <w:r>
               <w:rPr>
                 <w:b w:val="0"/>
+                <w:color w:val="000000"/>
                 <w:sz w:val="18"/>
               </w:rPr>
               <w:t>Questions and excerpts are sent to the selected API provider; no comprehensive redaction.</w:t>
@@ -3399,12 +3621,13 @@
             <w:tcW w:type="dxa" w:w="1944"/>
             <w:vAlign w:val="center"/>
             <w:tcBorders>
-              <w:top w:val="single" w:sz="4" w:color="D9D9D9"/>
-              <w:left w:val="single" w:sz="4" w:color="D9D9D9"/>
-              <w:bottom w:val="single" w:sz="4" w:color="D9D9D9"/>
-              <w:right w:val="single" w:sz="4" w:color="D9D9D9"/>
+              <w:top w:val="single" w:sz="4" w:color="000000" w:space="0"/>
+              <w:left w:val="single" w:sz="4" w:color="000000" w:space="0"/>
+              <w:bottom w:val="single" w:sz="4" w:color="000000" w:space="0"/>
+              <w:right w:val="single" w:sz="4" w:color="000000" w:space="0"/>
+              <w:insideH w:val="single" w:sz="4" w:space="0" w:color="000000"/>
+              <w:insideV w:val="single" w:sz="4" w:space="0" w:color="000000"/>
             </w:tcBorders>
-            <w:shd w:fill="FFFFFF"/>
             <w:tcMar>
               <w:top w:w="90" w:type="dxa"/>
               <w:left w:w="90" w:type="dxa"/>
@@ -3419,6 +3642,7 @@
             <w:r>
               <w:rPr>
                 <w:b w:val="0"/>
+                <w:color w:val="000000"/>
                 <w:sz w:val="18"/>
               </w:rPr>
               <w:t>Provider failure</w:t>
@@ -3430,12 +3654,13 @@
             <w:tcW w:type="dxa" w:w="3312"/>
             <w:vAlign w:val="center"/>
             <w:tcBorders>
-              <w:top w:val="single" w:sz="4" w:color="D9D9D9"/>
-              <w:left w:val="single" w:sz="4" w:color="D9D9D9"/>
-              <w:bottom w:val="single" w:sz="4" w:color="D9D9D9"/>
-              <w:right w:val="single" w:sz="4" w:color="D9D9D9"/>
+              <w:top w:val="single" w:sz="4" w:color="000000" w:space="0"/>
+              <w:left w:val="single" w:sz="4" w:color="000000" w:space="0"/>
+              <w:bottom w:val="single" w:sz="4" w:color="000000" w:space="0"/>
+              <w:right w:val="single" w:sz="4" w:color="000000" w:space="0"/>
+              <w:insideH w:val="single" w:sz="4" w:space="0" w:color="000000"/>
+              <w:insideV w:val="single" w:sz="4" w:space="0" w:color="000000"/>
             </w:tcBorders>
-            <w:shd w:fill="FFFFFF"/>
             <w:tcMar>
               <w:top w:w="90" w:type="dxa"/>
               <w:left w:w="90" w:type="dxa"/>
@@ -3450,6 +3675,7 @@
             <w:r>
               <w:rPr>
                 <w:b w:val="0"/>
+                <w:color w:val="000000"/>
                 <w:sz w:val="18"/>
               </w:rPr>
               <w:t>Visible API errors and local fallback</w:t>
@@ -3461,12 +3687,13 @@
             <w:tcW w:type="dxa" w:w="3960"/>
             <w:vAlign w:val="center"/>
             <w:tcBorders>
-              <w:top w:val="single" w:sz="4" w:color="D9D9D9"/>
-              <w:left w:val="single" w:sz="4" w:color="D9D9D9"/>
-              <w:bottom w:val="single" w:sz="4" w:color="D9D9D9"/>
-              <w:right w:val="single" w:sz="4" w:color="D9D9D9"/>
+              <w:top w:val="single" w:sz="4" w:color="000000" w:space="0"/>
+              <w:left w:val="single" w:sz="4" w:color="000000" w:space="0"/>
+              <w:bottom w:val="single" w:sz="4" w:color="000000" w:space="0"/>
+              <w:right w:val="single" w:sz="4" w:color="000000" w:space="0"/>
+              <w:insideH w:val="single" w:sz="4" w:space="0" w:color="000000"/>
+              <w:insideV w:val="single" w:sz="4" w:space="0" w:color="000000"/>
             </w:tcBorders>
-            <w:shd w:fill="FFFFFF"/>
             <w:tcMar>
               <w:top w:w="90" w:type="dxa"/>
               <w:left w:w="90" w:type="dxa"/>
@@ -3481,6 +3708,7 @@
             <w:r>
               <w:rPr>
                 <w:b w:val="0"/>
+                <w:color w:val="000000"/>
                 <w:sz w:val="18"/>
               </w:rPr>
               <w:t>No outage, concurrency or sustained-load study.</w:t>
@@ -3494,12 +3722,13 @@
             <w:tcW w:type="dxa" w:w="1944"/>
             <w:vAlign w:val="center"/>
             <w:tcBorders>
-              <w:top w:val="single" w:sz="4" w:color="D9D9D9"/>
-              <w:left w:val="single" w:sz="4" w:color="D9D9D9"/>
-              <w:bottom w:val="single" w:sz="4" w:color="D9D9D9"/>
-              <w:right w:val="single" w:sz="4" w:color="D9D9D9"/>
+              <w:top w:val="single" w:sz="4" w:color="000000" w:space="0"/>
+              <w:left w:val="single" w:sz="4" w:color="000000" w:space="0"/>
+              <w:bottom w:val="single" w:sz="4" w:color="000000" w:space="0"/>
+              <w:right w:val="single" w:sz="4" w:color="000000" w:space="0"/>
+              <w:insideH w:val="single" w:sz="4" w:space="0" w:color="000000"/>
+              <w:insideV w:val="single" w:sz="4" w:space="0" w:color="000000"/>
             </w:tcBorders>
-            <w:shd w:fill="FFFFFF"/>
             <w:tcMar>
               <w:top w:w="90" w:type="dxa"/>
               <w:left w:w="90" w:type="dxa"/>
@@ -3514,6 +3743,7 @@
             <w:r>
               <w:rPr>
                 <w:b w:val="0"/>
+                <w:color w:val="000000"/>
                 <w:sz w:val="18"/>
               </w:rPr>
               <w:t>Automation bias</w:t>
@@ -3525,12 +3755,13 @@
             <w:tcW w:type="dxa" w:w="3312"/>
             <w:vAlign w:val="center"/>
             <w:tcBorders>
-              <w:top w:val="single" w:sz="4" w:color="D9D9D9"/>
-              <w:left w:val="single" w:sz="4" w:color="D9D9D9"/>
-              <w:bottom w:val="single" w:sz="4" w:color="D9D9D9"/>
-              <w:right w:val="single" w:sz="4" w:color="D9D9D9"/>
+              <w:top w:val="single" w:sz="4" w:color="000000" w:space="0"/>
+              <w:left w:val="single" w:sz="4" w:color="000000" w:space="0"/>
+              <w:bottom w:val="single" w:sz="4" w:color="000000" w:space="0"/>
+              <w:right w:val="single" w:sz="4" w:color="000000" w:space="0"/>
+              <w:insideH w:val="single" w:sz="4" w:space="0" w:color="000000"/>
+              <w:insideV w:val="single" w:sz="4" w:space="0" w:color="000000"/>
             </w:tcBorders>
-            <w:shd w:fill="FFFFFF"/>
             <w:tcMar>
               <w:top w:w="90" w:type="dxa"/>
               <w:left w:w="90" w:type="dxa"/>
@@ -3545,6 +3776,7 @@
             <w:r>
               <w:rPr>
                 <w:b w:val="0"/>
+                <w:color w:val="000000"/>
                 <w:sz w:val="18"/>
               </w:rPr>
               <w:t>Draft notices and explicit limits</w:t>
@@ -3556,12 +3788,13 @@
             <w:tcW w:type="dxa" w:w="3960"/>
             <w:vAlign w:val="center"/>
             <w:tcBorders>
-              <w:top w:val="single" w:sz="4" w:color="D9D9D9"/>
-              <w:left w:val="single" w:sz="4" w:color="D9D9D9"/>
-              <w:bottom w:val="single" w:sz="4" w:color="D9D9D9"/>
-              <w:right w:val="single" w:sz="4" w:color="D9D9D9"/>
+              <w:top w:val="single" w:sz="4" w:color="000000" w:space="0"/>
+              <w:left w:val="single" w:sz="4" w:color="000000" w:space="0"/>
+              <w:bottom w:val="single" w:sz="4" w:color="000000" w:space="0"/>
+              <w:right w:val="single" w:sz="4" w:color="000000" w:space="0"/>
+              <w:insideH w:val="single" w:sz="4" w:space="0" w:color="000000"/>
+              <w:insideV w:val="single" w:sz="4" w:space="0" w:color="000000"/>
             </w:tcBorders>
-            <w:shd w:fill="FFFFFF"/>
             <w:tcMar>
               <w:top w:w="90" w:type="dxa"/>
               <w:left w:w="90" w:type="dxa"/>
@@ -3576,6 +3809,7 @@
             <w:r>
               <w:rPr>
                 <w:b w:val="0"/>
+                <w:color w:val="000000"/>
                 <w:sz w:val="18"/>
               </w:rPr>
               <w:t>Complete structured fields may coexist with misleading answer text.</w:t>
@@ -3665,7 +3899,7 @@
       <w:tblPr>
         <w:tblW w:type="auto" w:w="0"/>
         <w:tblLayout w:type="fixed"/>
-        <w:tblLook w:firstColumn="1" w:firstRow="1" w:lastColumn="0" w:lastRow="0" w:noHBand="0" w:noVBand="1" w:val="04A0"/>
+        <w:tblLook w:firstColumn="1" w:firstRow="1" w:lastColumn="0" w:lastRow="0" w:noHBand="1" w:noVBand="1" w:val="04A0"/>
       </w:tblPr>
       <w:tblGrid>
         <w:gridCol w:w="2376"/>
@@ -3680,12 +3914,13 @@
             <w:tcW w:type="dxa" w:w="2376"/>
             <w:vAlign w:val="center"/>
             <w:tcBorders>
-              <w:top w:val="single" w:sz="4" w:color="D9D9D9"/>
-              <w:left w:val="single" w:sz="4" w:color="D9D9D9"/>
-              <w:bottom w:val="single" w:sz="4" w:color="D9D9D9"/>
-              <w:right w:val="single" w:sz="4" w:color="D9D9D9"/>
+              <w:top w:val="single" w:sz="4" w:color="000000" w:space="0"/>
+              <w:left w:val="single" w:sz="4" w:color="000000" w:space="0"/>
+              <w:bottom w:val="single" w:sz="4" w:color="000000" w:space="0"/>
+              <w:right w:val="single" w:sz="4" w:color="000000" w:space="0"/>
+              <w:insideH w:val="single" w:sz="4" w:space="0" w:color="000000"/>
+              <w:insideV w:val="single" w:sz="4" w:space="0" w:color="000000"/>
             </w:tcBorders>
-            <w:shd w:fill="E4EBF0"/>
             <w:tcMar>
               <w:top w:w="90" w:type="dxa"/>
               <w:left w:w="90" w:type="dxa"/>
@@ -3700,6 +3935,7 @@
             <w:r>
               <w:rPr>
                 <w:b/>
+                <w:color w:val="000000"/>
                 <w:sz w:val="18"/>
               </w:rPr>
               <w:t>Item</w:t>
@@ -3711,12 +3947,13 @@
             <w:tcW w:type="dxa" w:w="6840"/>
             <w:vAlign w:val="center"/>
             <w:tcBorders>
-              <w:top w:val="single" w:sz="4" w:color="D9D9D9"/>
-              <w:left w:val="single" w:sz="4" w:color="D9D9D9"/>
-              <w:bottom w:val="single" w:sz="4" w:color="D9D9D9"/>
-              <w:right w:val="single" w:sz="4" w:color="D9D9D9"/>
+              <w:top w:val="single" w:sz="4" w:color="000000" w:space="0"/>
+              <w:left w:val="single" w:sz="4" w:color="000000" w:space="0"/>
+              <w:bottom w:val="single" w:sz="4" w:color="000000" w:space="0"/>
+              <w:right w:val="single" w:sz="4" w:color="000000" w:space="0"/>
+              <w:insideH w:val="single" w:sz="4" w:space="0" w:color="000000"/>
+              <w:insideV w:val="single" w:sz="4" w:space="0" w:color="000000"/>
             </w:tcBorders>
-            <w:shd w:fill="E4EBF0"/>
             <w:tcMar>
               <w:top w:w="90" w:type="dxa"/>
               <w:left w:w="90" w:type="dxa"/>
@@ -3731,6 +3968,7 @@
             <w:r>
               <w:rPr>
                 <w:b/>
+                <w:color w:val="000000"/>
                 <w:sz w:val="18"/>
               </w:rPr>
               <w:t>Location or status</w:t>
@@ -3744,12 +3982,13 @@
             <w:tcW w:type="dxa" w:w="2376"/>
             <w:vAlign w:val="center"/>
             <w:tcBorders>
-              <w:top w:val="single" w:sz="4" w:color="D9D9D9"/>
-              <w:left w:val="single" w:sz="4" w:color="D9D9D9"/>
-              <w:bottom w:val="single" w:sz="4" w:color="D9D9D9"/>
-              <w:right w:val="single" w:sz="4" w:color="D9D9D9"/>
+              <w:top w:val="single" w:sz="4" w:color="000000" w:space="0"/>
+              <w:left w:val="single" w:sz="4" w:color="000000" w:space="0"/>
+              <w:bottom w:val="single" w:sz="4" w:color="000000" w:space="0"/>
+              <w:right w:val="single" w:sz="4" w:color="000000" w:space="0"/>
+              <w:insideH w:val="single" w:sz="4" w:space="0" w:color="000000"/>
+              <w:insideV w:val="single" w:sz="4" w:space="0" w:color="000000"/>
             </w:tcBorders>
-            <w:shd w:fill="FFFFFF"/>
             <w:tcMar>
               <w:top w:w="90" w:type="dxa"/>
               <w:left w:w="90" w:type="dxa"/>
@@ -3764,6 +4003,7 @@
             <w:r>
               <w:rPr>
                 <w:b w:val="0"/>
+                <w:color w:val="000000"/>
                 <w:sz w:val="18"/>
               </w:rPr>
               <w:t>Current report</w:t>
@@ -3775,12 +4015,13 @@
             <w:tcW w:type="dxa" w:w="6840"/>
             <w:vAlign w:val="center"/>
             <w:tcBorders>
-              <w:top w:val="single" w:sz="4" w:color="D9D9D9"/>
-              <w:left w:val="single" w:sz="4" w:color="D9D9D9"/>
-              <w:bottom w:val="single" w:sz="4" w:color="D9D9D9"/>
-              <w:right w:val="single" w:sz="4" w:color="D9D9D9"/>
+              <w:top w:val="single" w:sz="4" w:color="000000" w:space="0"/>
+              <w:left w:val="single" w:sz="4" w:color="000000" w:space="0"/>
+              <w:bottom w:val="single" w:sz="4" w:color="000000" w:space="0"/>
+              <w:right w:val="single" w:sz="4" w:color="000000" w:space="0"/>
+              <w:insideH w:val="single" w:sz="4" w:space="0" w:color="000000"/>
+              <w:insideV w:val="single" w:sz="4" w:space="0" w:color="000000"/>
             </w:tcBorders>
-            <w:shd w:fill="FFFFFF"/>
             <w:tcMar>
               <w:top w:w="90" w:type="dxa"/>
               <w:left w:w="90" w:type="dxa"/>
@@ -3794,6 +4035,7 @@
             </w:pPr>
             <w:r>
               <w:rPr>
+                <w:color w:val="000000"/>
                 <w:sz w:val="18"/>
               </w:rPr>
               <w:t>docs/Final_Report.docx; the single current report in this package.</w:t>
@@ -3807,12 +4049,13 @@
             <w:tcW w:type="dxa" w:w="2376"/>
             <w:vAlign w:val="center"/>
             <w:tcBorders>
-              <w:top w:val="single" w:sz="4" w:color="D9D9D9"/>
-              <w:left w:val="single" w:sz="4" w:color="D9D9D9"/>
-              <w:bottom w:val="single" w:sz="4" w:color="D9D9D9"/>
-              <w:right w:val="single" w:sz="4" w:color="D9D9D9"/>
+              <w:top w:val="single" w:sz="4" w:color="000000" w:space="0"/>
+              <w:left w:val="single" w:sz="4" w:color="000000" w:space="0"/>
+              <w:bottom w:val="single" w:sz="4" w:color="000000" w:space="0"/>
+              <w:right w:val="single" w:sz="4" w:color="000000" w:space="0"/>
+              <w:insideH w:val="single" w:sz="4" w:space="0" w:color="000000"/>
+              <w:insideV w:val="single" w:sz="4" w:space="0" w:color="000000"/>
             </w:tcBorders>
-            <w:shd w:fill="FFFFFF"/>
             <w:tcMar>
               <w:top w:w="90" w:type="dxa"/>
               <w:left w:w="90" w:type="dxa"/>
@@ -3827,6 +4070,7 @@
             <w:r>
               <w:rPr>
                 <w:b w:val="0"/>
+                <w:color w:val="000000"/>
                 <w:sz w:val="18"/>
               </w:rPr>
               <w:t>Live results</w:t>
@@ -3838,12 +4082,13 @@
             <w:tcW w:type="dxa" w:w="6840"/>
             <w:vAlign w:val="center"/>
             <w:tcBorders>
-              <w:top w:val="single" w:sz="4" w:color="D9D9D9"/>
-              <w:left w:val="single" w:sz="4" w:color="D9D9D9"/>
-              <w:bottom w:val="single" w:sz="4" w:color="D9D9D9"/>
-              <w:right w:val="single" w:sz="4" w:color="D9D9D9"/>
+              <w:top w:val="single" w:sz="4" w:color="000000" w:space="0"/>
+              <w:left w:val="single" w:sz="4" w:color="000000" w:space="0"/>
+              <w:bottom w:val="single" w:sz="4" w:color="000000" w:space="0"/>
+              <w:right w:val="single" w:sz="4" w:color="000000" w:space="0"/>
+              <w:insideH w:val="single" w:sz="4" w:space="0" w:color="000000"/>
+              <w:insideV w:val="single" w:sz="4" w:space="0" w:color="000000"/>
             </w:tcBorders>
-            <w:shd w:fill="FFFFFF"/>
             <w:tcMar>
               <w:top w:w="90" w:type="dxa"/>
               <w:left w:w="90" w:type="dxa"/>
@@ -3858,6 +4103,7 @@
             <w:r>
               <w:rPr>
                 <w:b w:val="0"/>
+                <w:color w:val="000000"/>
                 <w:sz w:val="18"/>
               </w:rPr>
               <w:t>results/openrouter.json and openrouter_before_prompt_v2.json</w:t>
@@ -3871,12 +4117,13 @@
             <w:tcW w:type="dxa" w:w="2376"/>
             <w:vAlign w:val="center"/>
             <w:tcBorders>
-              <w:top w:val="single" w:sz="4" w:color="D9D9D9"/>
-              <w:left w:val="single" w:sz="4" w:color="D9D9D9"/>
-              <w:bottom w:val="single" w:sz="4" w:color="D9D9D9"/>
-              <w:right w:val="single" w:sz="4" w:color="D9D9D9"/>
+              <w:top w:val="single" w:sz="4" w:color="000000" w:space="0"/>
+              <w:left w:val="single" w:sz="4" w:color="000000" w:space="0"/>
+              <w:bottom w:val="single" w:sz="4" w:color="000000" w:space="0"/>
+              <w:right w:val="single" w:sz="4" w:color="000000" w:space="0"/>
+              <w:insideH w:val="single" w:sz="4" w:space="0" w:color="000000"/>
+              <w:insideV w:val="single" w:sz="4" w:space="0" w:color="000000"/>
             </w:tcBorders>
-            <w:shd w:fill="FFFFFF"/>
             <w:tcMar>
               <w:top w:w="90" w:type="dxa"/>
               <w:left w:w="90" w:type="dxa"/>
@@ -3891,6 +4138,7 @@
             <w:r>
               <w:rPr>
                 <w:b w:val="0"/>
+                <w:color w:val="000000"/>
                 <w:sz w:val="18"/>
               </w:rPr>
               <w:t>Baseline and cost evidence</w:t>
@@ -3902,12 +4150,13 @@
             <w:tcW w:type="dxa" w:w="6840"/>
             <w:vAlign w:val="center"/>
             <w:tcBorders>
-              <w:top w:val="single" w:sz="4" w:color="D9D9D9"/>
-              <w:left w:val="single" w:sz="4" w:color="D9D9D9"/>
-              <w:bottom w:val="single" w:sz="4" w:color="D9D9D9"/>
-              <w:right w:val="single" w:sz="4" w:color="D9D9D9"/>
+              <w:top w:val="single" w:sz="4" w:color="000000" w:space="0"/>
+              <w:left w:val="single" w:sz="4" w:color="000000" w:space="0"/>
+              <w:bottom w:val="single" w:sz="4" w:color="000000" w:space="0"/>
+              <w:right w:val="single" w:sz="4" w:color="000000" w:space="0"/>
+              <w:insideH w:val="single" w:sz="4" w:space="0" w:color="000000"/>
+              <w:insideV w:val="single" w:sz="4" w:space="0" w:color="000000"/>
             </w:tcBorders>
-            <w:shd w:fill="FFFFFF"/>
             <w:tcMar>
               <w:top w:w="90" w:type="dxa"/>
               <w:left w:w="90" w:type="dxa"/>
@@ -3917,6 +4166,9 @@
           </w:tcPr>
           <w:p>
             <w:r>
+              <w:rPr>
+                <w:color w:val="000000"/>
+              </w:rPr>
               <w:t>results/comparison.json, challenge.json, report_cost_summary.json and manual_answer_spot_check.json</w:t>
             </w:r>
           </w:p>
@@ -3928,12 +4180,13 @@
             <w:tcW w:type="dxa" w:w="2376"/>
             <w:vAlign w:val="center"/>
             <w:tcBorders>
-              <w:top w:val="single" w:sz="4" w:color="D9D9D9"/>
-              <w:left w:val="single" w:sz="4" w:color="D9D9D9"/>
-              <w:bottom w:val="single" w:sz="4" w:color="D9D9D9"/>
-              <w:right w:val="single" w:sz="4" w:color="D9D9D9"/>
+              <w:top w:val="single" w:sz="4" w:color="000000" w:space="0"/>
+              <w:left w:val="single" w:sz="4" w:color="000000" w:space="0"/>
+              <w:bottom w:val="single" w:sz="4" w:color="000000" w:space="0"/>
+              <w:right w:val="single" w:sz="4" w:color="000000" w:space="0"/>
+              <w:insideH w:val="single" w:sz="4" w:space="0" w:color="000000"/>
+              <w:insideV w:val="single" w:sz="4" w:space="0" w:color="000000"/>
             </w:tcBorders>
-            <w:shd w:fill="FFFFFF"/>
             <w:tcMar>
               <w:top w:w="90" w:type="dxa"/>
               <w:left w:w="90" w:type="dxa"/>
@@ -3948,6 +4201,7 @@
             <w:r>
               <w:rPr>
                 <w:b w:val="0"/>
+                <w:color w:val="000000"/>
                 <w:sz w:val="18"/>
               </w:rPr>
               <w:t>Code and tests</w:t>
@@ -3959,12 +4213,13 @@
             <w:tcW w:type="dxa" w:w="6840"/>
             <w:vAlign w:val="center"/>
             <w:tcBorders>
-              <w:top w:val="single" w:sz="4" w:color="D9D9D9"/>
-              <w:left w:val="single" w:sz="4" w:color="D9D9D9"/>
-              <w:bottom w:val="single" w:sz="4" w:color="D9D9D9"/>
-              <w:right w:val="single" w:sz="4" w:color="D9D9D9"/>
+              <w:top w:val="single" w:sz="4" w:color="000000" w:space="0"/>
+              <w:left w:val="single" w:sz="4" w:color="000000" w:space="0"/>
+              <w:bottom w:val="single" w:sz="4" w:color="000000" w:space="0"/>
+              <w:right w:val="single" w:sz="4" w:color="000000" w:space="0"/>
+              <w:insideH w:val="single" w:sz="4" w:space="0" w:color="000000"/>
+              <w:insideV w:val="single" w:sz="4" w:space="0" w:color="000000"/>
             </w:tcBorders>
-            <w:shd w:fill="FFFFFF"/>
             <w:tcMar>
               <w:top w:w="90" w:type="dxa"/>
               <w:left w:w="90" w:type="dxa"/>
@@ -3974,6 +4229,9 @@
           </w:tcPr>
           <w:p>
             <w:r>
+              <w:rPr>
+                <w:color w:val="000000"/>
+              </w:rPr>
               <w:t>src/hrask.py, evaluate.py, server.py, policies/ and tests/; GitHub: github.com/kxy-creator/PE6201-End-of-project.</w:t>
             </w:r>
           </w:p>
@@ -3985,12 +4243,13 @@
             <w:tcW w:type="dxa" w:w="2376"/>
             <w:vAlign w:val="center"/>
             <w:tcBorders>
-              <w:top w:val="single" w:sz="4" w:color="D9D9D9"/>
-              <w:left w:val="single" w:sz="4" w:color="D9D9D9"/>
-              <w:bottom w:val="single" w:sz="4" w:color="D9D9D9"/>
-              <w:right w:val="single" w:sz="4" w:color="D9D9D9"/>
+              <w:top w:val="single" w:sz="4" w:color="000000" w:space="0"/>
+              <w:left w:val="single" w:sz="4" w:color="000000" w:space="0"/>
+              <w:bottom w:val="single" w:sz="4" w:color="000000" w:space="0"/>
+              <w:right w:val="single" w:sz="4" w:color="000000" w:space="0"/>
+              <w:insideH w:val="single" w:sz="4" w:space="0" w:color="000000"/>
+              <w:insideV w:val="single" w:sz="4" w:space="0" w:color="000000"/>
             </w:tcBorders>
-            <w:shd w:fill="FFFFFF"/>
             <w:tcMar>
               <w:top w:w="90" w:type="dxa"/>
               <w:left w:w="90" w:type="dxa"/>
@@ -4005,6 +4264,7 @@
             <w:r>
               <w:rPr>
                 <w:b w:val="0"/>
+                <w:color w:val="000000"/>
                 <w:sz w:val="18"/>
               </w:rPr>
               <w:t>English demonstration</w:t>
@@ -4016,12 +4276,13 @@
             <w:tcW w:type="dxa" w:w="6840"/>
             <w:vAlign w:val="center"/>
             <w:tcBorders>
-              <w:top w:val="single" w:sz="4" w:color="D9D9D9"/>
-              <w:left w:val="single" w:sz="4" w:color="D9D9D9"/>
-              <w:bottom w:val="single" w:sz="4" w:color="D9D9D9"/>
-              <w:right w:val="single" w:sz="4" w:color="D9D9D9"/>
+              <w:top w:val="single" w:sz="4" w:color="000000" w:space="0"/>
+              <w:left w:val="single" w:sz="4" w:color="000000" w:space="0"/>
+              <w:bottom w:val="single" w:sz="4" w:color="000000" w:space="0"/>
+              <w:right w:val="single" w:sz="4" w:color="000000" w:space="0"/>
+              <w:insideH w:val="single" w:sz="4" w:space="0" w:color="000000"/>
+              <w:insideV w:val="single" w:sz="4" w:space="0" w:color="000000"/>
             </w:tcBorders>
-            <w:shd w:fill="FFFFFF"/>
             <w:tcMar>
               <w:top w:w="90" w:type="dxa"/>
               <w:left w:w="90" w:type="dxa"/>
@@ -4035,6 +4296,7 @@
             </w:pPr>
             <w:r>
               <w:rPr>
+                <w:color w:val="000000"/>
                 <w:sz w:val="18"/>
               </w:rPr>
               <w:t>docs/HR_Ask_English_Demo.mp4; actual application screenshots with synthetic English narration and subtitles; updated assessment segment.</w:t>
@@ -4048,12 +4310,13 @@
             <w:tcW w:type="dxa" w:w="2376"/>
             <w:vAlign w:val="center"/>
             <w:tcBorders>
-              <w:top w:val="single" w:sz="4" w:color="D9D9D9"/>
-              <w:left w:val="single" w:sz="4" w:color="D9D9D9"/>
-              <w:bottom w:val="single" w:sz="4" w:color="D9D9D9"/>
-              <w:right w:val="single" w:sz="4" w:color="D9D9D9"/>
+              <w:top w:val="single" w:sz="4" w:color="000000" w:space="0"/>
+              <w:left w:val="single" w:sz="4" w:color="000000" w:space="0"/>
+              <w:bottom w:val="single" w:sz="4" w:color="000000" w:space="0"/>
+              <w:right w:val="single" w:sz="4" w:color="000000" w:space="0"/>
+              <w:insideH w:val="single" w:sz="4" w:space="0" w:color="000000"/>
+              <w:insideV w:val="single" w:sz="4" w:space="0" w:color="000000"/>
             </w:tcBorders>
-            <w:shd w:fill="FFFFFF"/>
             <w:tcMar>
               <w:top w:w="90" w:type="dxa"/>
               <w:left w:w="90" w:type="dxa"/>
@@ -4068,6 +4331,7 @@
             <w:r>
               <w:rPr>
                 <w:b w:val="0"/>
+                <w:color w:val="000000"/>
                 <w:sz w:val="18"/>
               </w:rPr>
               <w:t>Self appraisal</w:t>
@@ -4079,12 +4343,13 @@
             <w:tcW w:type="dxa" w:w="6840"/>
             <w:vAlign w:val="center"/>
             <w:tcBorders>
-              <w:top w:val="single" w:sz="4" w:color="D9D9D9"/>
-              <w:left w:val="single" w:sz="4" w:color="D9D9D9"/>
-              <w:bottom w:val="single" w:sz="4" w:color="D9D9D9"/>
-              <w:right w:val="single" w:sz="4" w:color="D9D9D9"/>
+              <w:top w:val="single" w:sz="4" w:color="000000" w:space="0"/>
+              <w:left w:val="single" w:sz="4" w:color="000000" w:space="0"/>
+              <w:bottom w:val="single" w:sz="4" w:color="000000" w:space="0"/>
+              <w:right w:val="single" w:sz="4" w:color="000000" w:space="0"/>
+              <w:insideH w:val="single" w:sz="4" w:space="0" w:color="000000"/>
+              <w:insideV w:val="single" w:sz="4" w:space="0" w:color="000000"/>
             </w:tcBorders>
-            <w:shd w:fill="FFFFFF"/>
             <w:tcMar>
               <w:top w:w="90" w:type="dxa"/>
               <w:left w:w="90" w:type="dxa"/>
@@ -4098,6 +4363,7 @@
             </w:pPr>
             <w:r>
               <w:rPr>
+                <w:color w:val="000000"/>
                 <w:sz w:val="18"/>
               </w:rPr>
               <w:t>docs/Self_Appraisal.docx; evidence-based cover updated for this package; personal review and confirmation still required.</w:t>
@@ -4154,7 +4420,7 @@
       <w:tblPr>
         <w:tblW w:type="auto" w:w="0"/>
         <w:tblLayout w:type="fixed"/>
-        <w:tblLook w:firstColumn="1" w:firstRow="1" w:lastColumn="0" w:lastRow="0" w:noHBand="0" w:noVBand="1" w:val="04A0"/>
+        <w:tblLook w:firstColumn="1" w:firstRow="1" w:lastColumn="0" w:lastRow="0" w:noHBand="1" w:noVBand="1" w:val="04A0"/>
       </w:tblPr>
       <w:tblGrid>
         <w:gridCol w:w="2952"/>
@@ -4170,12 +4436,13 @@
             <w:tcW w:type="dxa" w:w="2952"/>
             <w:vAlign w:val="center"/>
             <w:tcBorders>
-              <w:top w:val="single" w:sz="4" w:color="D9D9D9"/>
-              <w:left w:val="single" w:sz="4" w:color="D9D9D9"/>
-              <w:bottom w:val="single" w:sz="4" w:color="D9D9D9"/>
-              <w:right w:val="single" w:sz="4" w:color="D9D9D9"/>
+              <w:top w:val="single" w:sz="4" w:color="000000" w:space="0"/>
+              <w:left w:val="single" w:sz="4" w:color="000000" w:space="0"/>
+              <w:bottom w:val="single" w:sz="4" w:color="000000" w:space="0"/>
+              <w:right w:val="single" w:sz="4" w:color="000000" w:space="0"/>
+              <w:insideH w:val="single" w:sz="4" w:space="0" w:color="000000"/>
+              <w:insideV w:val="single" w:sz="4" w:space="0" w:color="000000"/>
             </w:tcBorders>
-            <w:shd w:fill="E4EBF0"/>
             <w:tcMar>
               <w:top w:w="90" w:type="dxa"/>
               <w:left w:w="90" w:type="dxa"/>
@@ -4190,6 +4457,7 @@
             <w:r>
               <w:rPr>
                 <w:b/>
+                <w:color w:val="000000"/>
                 <w:sz w:val="18"/>
               </w:rPr>
               <w:t>Separate measure</w:t>
@@ -4201,12 +4469,13 @@
             <w:tcW w:type="dxa" w:w="1584"/>
             <w:vAlign w:val="center"/>
             <w:tcBorders>
-              <w:top w:val="single" w:sz="4" w:color="D9D9D9"/>
-              <w:left w:val="single" w:sz="4" w:color="D9D9D9"/>
-              <w:bottom w:val="single" w:sz="4" w:color="D9D9D9"/>
-              <w:right w:val="single" w:sz="4" w:color="D9D9D9"/>
+              <w:top w:val="single" w:sz="4" w:color="000000" w:space="0"/>
+              <w:left w:val="single" w:sz="4" w:color="000000" w:space="0"/>
+              <w:bottom w:val="single" w:sz="4" w:color="000000" w:space="0"/>
+              <w:right w:val="single" w:sz="4" w:color="000000" w:space="0"/>
+              <w:insideH w:val="single" w:sz="4" w:space="0" w:color="000000"/>
+              <w:insideV w:val="single" w:sz="4" w:space="0" w:color="000000"/>
             </w:tcBorders>
-            <w:shd w:fill="E4EBF0"/>
             <w:tcMar>
               <w:top w:w="90" w:type="dxa"/>
               <w:left w:w="90" w:type="dxa"/>
@@ -4221,6 +4490,7 @@
             <w:r>
               <w:rPr>
                 <w:b/>
+                <w:color w:val="000000"/>
                 <w:sz w:val="18"/>
               </w:rPr>
               <w:t>Result</w:t>
@@ -4232,12 +4502,13 @@
             <w:tcW w:type="dxa" w:w="4680"/>
             <w:vAlign w:val="center"/>
             <w:tcBorders>
-              <w:top w:val="single" w:sz="4" w:color="D9D9D9"/>
-              <w:left w:val="single" w:sz="4" w:color="D9D9D9"/>
-              <w:bottom w:val="single" w:sz="4" w:color="D9D9D9"/>
-              <w:right w:val="single" w:sz="4" w:color="D9D9D9"/>
+              <w:top w:val="single" w:sz="4" w:color="000000" w:space="0"/>
+              <w:left w:val="single" w:sz="4" w:color="000000" w:space="0"/>
+              <w:bottom w:val="single" w:sz="4" w:color="000000" w:space="0"/>
+              <w:right w:val="single" w:sz="4" w:color="000000" w:space="0"/>
+              <w:insideH w:val="single" w:sz="4" w:space="0" w:color="000000"/>
+              <w:insideV w:val="single" w:sz="4" w:space="0" w:color="000000"/>
             </w:tcBorders>
-            <w:shd w:fill="E4EBF0"/>
             <w:tcMar>
               <w:top w:w="90" w:type="dxa"/>
               <w:left w:w="90" w:type="dxa"/>
@@ -4252,6 +4523,7 @@
             <w:r>
               <w:rPr>
                 <w:b/>
+                <w:color w:val="000000"/>
                 <w:sz w:val="18"/>
               </w:rPr>
               <w:t>Scope</w:t>
@@ -4265,12 +4537,13 @@
             <w:tcW w:type="dxa" w:w="2952"/>
             <w:vAlign w:val="center"/>
             <w:tcBorders>
-              <w:top w:val="single" w:sz="4" w:color="D9D9D9"/>
-              <w:left w:val="single" w:sz="4" w:color="D9D9D9"/>
-              <w:bottom w:val="single" w:sz="4" w:color="D9D9D9"/>
-              <w:right w:val="single" w:sz="4" w:color="D9D9D9"/>
+              <w:top w:val="single" w:sz="4" w:color="000000" w:space="0"/>
+              <w:left w:val="single" w:sz="4" w:color="000000" w:space="0"/>
+              <w:bottom w:val="single" w:sz="4" w:color="000000" w:space="0"/>
+              <w:right w:val="single" w:sz="4" w:color="000000" w:space="0"/>
+              <w:insideH w:val="single" w:sz="4" w:space="0" w:color="000000"/>
+              <w:insideV w:val="single" w:sz="4" w:space="0" w:color="000000"/>
             </w:tcBorders>
-            <w:shd w:fill="FFFFFF"/>
             <w:tcMar>
               <w:top w:w="90" w:type="dxa"/>
               <w:left w:w="90" w:type="dxa"/>
@@ -4280,6 +4553,9 @@
           </w:tcPr>
           <w:p>
             <w:r>
+              <w:rPr>
+                <w:color w:val="000000"/>
+              </w:rPr>
               <w:t>Answer-quality reviews</w:t>
             </w:r>
           </w:p>
@@ -4289,12 +4565,13 @@
             <w:tcW w:type="dxa" w:w="1584"/>
             <w:vAlign w:val="center"/>
             <w:tcBorders>
-              <w:top w:val="single" w:sz="4" w:color="D9D9D9"/>
-              <w:left w:val="single" w:sz="4" w:color="D9D9D9"/>
-              <w:bottom w:val="single" w:sz="4" w:color="D9D9D9"/>
-              <w:right w:val="single" w:sz="4" w:color="D9D9D9"/>
+              <w:top w:val="single" w:sz="4" w:color="000000" w:space="0"/>
+              <w:left w:val="single" w:sz="4" w:color="000000" w:space="0"/>
+              <w:bottom w:val="single" w:sz="4" w:color="000000" w:space="0"/>
+              <w:right w:val="single" w:sz="4" w:color="000000" w:space="0"/>
+              <w:insideH w:val="single" w:sz="4" w:space="0" w:color="000000"/>
+              <w:insideV w:val="single" w:sz="4" w:space="0" w:color="000000"/>
             </w:tcBorders>
-            <w:shd w:fill="FFFFFF"/>
             <w:tcMar>
               <w:top w:w="90" w:type="dxa"/>
               <w:left w:w="90" w:type="dxa"/>
@@ -4304,6 +4581,9 @@
           </w:tcPr>
           <w:p>
             <w:r>
+              <w:rPr>
+                <w:color w:val="000000"/>
+              </w:rPr>
               <w:t>22/25 (88%) AI-assisted; 8/10 (80%) manual</w:t>
             </w:r>
           </w:p>
@@ -4313,12 +4593,13 @@
             <w:tcW w:type="dxa" w:w="4680"/>
             <w:vAlign w:val="center"/>
             <w:tcBorders>
-              <w:top w:val="single" w:sz="4" w:color="D9D9D9"/>
-              <w:left w:val="single" w:sz="4" w:color="D9D9D9"/>
-              <w:bottom w:val="single" w:sz="4" w:color="D9D9D9"/>
-              <w:right w:val="single" w:sz="4" w:color="D9D9D9"/>
+              <w:top w:val="single" w:sz="4" w:color="000000" w:space="0"/>
+              <w:left w:val="single" w:sz="4" w:color="000000" w:space="0"/>
+              <w:bottom w:val="single" w:sz="4" w:color="000000" w:space="0"/>
+              <w:right w:val="single" w:sz="4" w:color="000000" w:space="0"/>
+              <w:insideH w:val="single" w:sz="4" w:space="0" w:color="000000"/>
+              <w:insideV w:val="single" w:sz="4" w:space="0" w:color="000000"/>
             </w:tcBorders>
-            <w:shd w:fill="FFFFFF"/>
             <w:tcMar>
               <w:top w:w="90" w:type="dxa"/>
               <w:left w:w="90" w:type="dxa"/>
@@ -4328,6 +4609,9 @@
           </w:tcPr>
           <w:p>
             <w:r>
+              <w:rPr>
+                <w:color w:val="000000"/>
+              </w:rPr>
               <w:t>Retrospective AI-assisted review; manual student sample uses seed 20260925 and is not independent HR review</w:t>
             </w:r>
           </w:p>
@@ -4339,12 +4623,13 @@
             <w:tcW w:type="dxa" w:w="2952"/>
             <w:vAlign w:val="center"/>
             <w:tcBorders>
-              <w:top w:val="single" w:sz="4" w:color="D9D9D9"/>
-              <w:left w:val="single" w:sz="4" w:color="D9D9D9"/>
-              <w:bottom w:val="single" w:sz="4" w:color="D9D9D9"/>
-              <w:right w:val="single" w:sz="4" w:color="D9D9D9"/>
+              <w:top w:val="single" w:sz="4" w:color="000000" w:space="0"/>
+              <w:left w:val="single" w:sz="4" w:color="000000" w:space="0"/>
+              <w:bottom w:val="single" w:sz="4" w:color="000000" w:space="0"/>
+              <w:right w:val="single" w:sz="4" w:color="000000" w:space="0"/>
+              <w:insideH w:val="single" w:sz="4" w:space="0" w:color="000000"/>
+              <w:insideV w:val="single" w:sz="4" w:space="0" w:color="000000"/>
             </w:tcBorders>
-            <w:shd w:fill="FFFFFF"/>
             <w:tcMar>
               <w:top w:w="90" w:type="dxa"/>
               <w:left w:w="90" w:type="dxa"/>
@@ -4354,6 +4639,9 @@
           </w:tcPr>
           <w:p>
             <w:r>
+              <w:rPr>
+                <w:color w:val="000000"/>
+              </w:rPr>
               <w:t>Ticket structural pass rate</w:t>
             </w:r>
           </w:p>
@@ -4363,12 +4651,13 @@
             <w:tcW w:type="dxa" w:w="1584"/>
             <w:vAlign w:val="center"/>
             <w:tcBorders>
-              <w:top w:val="single" w:sz="4" w:color="D9D9D9"/>
-              <w:left w:val="single" w:sz="4" w:color="D9D9D9"/>
-              <w:bottom w:val="single" w:sz="4" w:color="D9D9D9"/>
-              <w:right w:val="single" w:sz="4" w:color="D9D9D9"/>
+              <w:top w:val="single" w:sz="4" w:color="000000" w:space="0"/>
+              <w:left w:val="single" w:sz="4" w:color="000000" w:space="0"/>
+              <w:bottom w:val="single" w:sz="4" w:color="000000" w:space="0"/>
+              <w:right w:val="single" w:sz="4" w:color="000000" w:space="0"/>
+              <w:insideH w:val="single" w:sz="4" w:space="0" w:color="000000"/>
+              <w:insideV w:val="single" w:sz="4" w:space="0" w:color="000000"/>
             </w:tcBorders>
-            <w:shd w:fill="FFFFFF"/>
             <w:tcMar>
               <w:top w:w="90" w:type="dxa"/>
               <w:left w:w="90" w:type="dxa"/>
@@ -4378,6 +4667,9 @@
           </w:tcPr>
           <w:p>
             <w:r>
+              <w:rPr>
+                <w:color w:val="000000"/>
+              </w:rPr>
               <w:t>8/8 (100%)</w:t>
             </w:r>
           </w:p>
@@ -4387,12 +4679,13 @@
             <w:tcW w:type="dxa" w:w="4680"/>
             <w:vAlign w:val="center"/>
             <w:tcBorders>
-              <w:top w:val="single" w:sz="4" w:color="D9D9D9"/>
-              <w:left w:val="single" w:sz="4" w:color="D9D9D9"/>
-              <w:bottom w:val="single" w:sz="4" w:color="D9D9D9"/>
-              <w:right w:val="single" w:sz="4" w:color="D9D9D9"/>
+              <w:top w:val="single" w:sz="4" w:color="000000" w:space="0"/>
+              <w:left w:val="single" w:sz="4" w:color="000000" w:space="0"/>
+              <w:bottom w:val="single" w:sz="4" w:color="000000" w:space="0"/>
+              <w:right w:val="single" w:sz="4" w:color="000000" w:space="0"/>
+              <w:insideH w:val="single" w:sz="4" w:space="0" w:color="000000"/>
+              <w:insideV w:val="single" w:sz="4" w:space="0" w:color="000000"/>
             </w:tcBorders>
-            <w:shd w:fill="FFFFFF"/>
             <w:tcMar>
               <w:top w:w="90" w:type="dxa"/>
               <w:left w:w="90" w:type="dxa"/>
@@ -4402,6 +4695,9 @@
           </w:tcPr>
           <w:p>
             <w:r>
+              <w:rPr>
+                <w:color w:val="000000"/>
+              </w:rPr>
               <w:t>Valid JSON, five fields and correct request type; first-turn completion is separately 5/8</w:t>
             </w:r>
           </w:p>
@@ -4413,12 +4709,13 @@
             <w:tcW w:type="dxa" w:w="2952"/>
             <w:vAlign w:val="center"/>
             <w:tcBorders>
-              <w:top w:val="single" w:sz="4" w:color="D9D9D9"/>
-              <w:left w:val="single" w:sz="4" w:color="D9D9D9"/>
-              <w:bottom w:val="single" w:sz="4" w:color="D9D9D9"/>
-              <w:right w:val="single" w:sz="4" w:color="D9D9D9"/>
+              <w:top w:val="single" w:sz="4" w:color="000000" w:space="0"/>
+              <w:left w:val="single" w:sz="4" w:color="000000" w:space="0"/>
+              <w:bottom w:val="single" w:sz="4" w:color="000000" w:space="0"/>
+              <w:right w:val="single" w:sz="4" w:color="000000" w:space="0"/>
+              <w:insideH w:val="single" w:sz="4" w:space="0" w:color="000000"/>
+              <w:insideV w:val="single" w:sz="4" w:space="0" w:color="000000"/>
             </w:tcBorders>
-            <w:shd w:fill="FFFFFF"/>
             <w:tcMar>
               <w:top w:w="90" w:type="dxa"/>
               <w:left w:w="90" w:type="dxa"/>
@@ -4433,6 +4730,7 @@
             <w:r>
               <w:rPr>
                 <w:b w:val="0"/>
+                <w:color w:val="000000"/>
                 <w:sz w:val="18"/>
               </w:rPr>
               <w:t>Intent accuracy</w:t>
@@ -4444,12 +4742,13 @@
             <w:tcW w:type="dxa" w:w="1584"/>
             <w:vAlign w:val="center"/>
             <w:tcBorders>
-              <w:top w:val="single" w:sz="4" w:color="D9D9D9"/>
-              <w:left w:val="single" w:sz="4" w:color="D9D9D9"/>
-              <w:bottom w:val="single" w:sz="4" w:color="D9D9D9"/>
-              <w:right w:val="single" w:sz="4" w:color="D9D9D9"/>
+              <w:top w:val="single" w:sz="4" w:color="000000" w:space="0"/>
+              <w:left w:val="single" w:sz="4" w:color="000000" w:space="0"/>
+              <w:bottom w:val="single" w:sz="4" w:color="000000" w:space="0"/>
+              <w:right w:val="single" w:sz="4" w:color="000000" w:space="0"/>
+              <w:insideH w:val="single" w:sz="4" w:space="0" w:color="000000"/>
+              <w:insideV w:val="single" w:sz="4" w:space="0" w:color="000000"/>
             </w:tcBorders>
-            <w:shd w:fill="FFFFFF"/>
             <w:tcMar>
               <w:top w:w="90" w:type="dxa"/>
               <w:left w:w="90" w:type="dxa"/>
@@ -4464,6 +4763,7 @@
             <w:r>
               <w:rPr>
                 <w:b w:val="0"/>
+                <w:color w:val="000000"/>
                 <w:sz w:val="18"/>
               </w:rPr>
               <w:t>30/30</w:t>
@@ -4475,12 +4775,13 @@
             <w:tcW w:type="dxa" w:w="4680"/>
             <w:vAlign w:val="center"/>
             <w:tcBorders>
-              <w:top w:val="single" w:sz="4" w:color="D9D9D9"/>
-              <w:left w:val="single" w:sz="4" w:color="D9D9D9"/>
-              <w:bottom w:val="single" w:sz="4" w:color="D9D9D9"/>
-              <w:right w:val="single" w:sz="4" w:color="D9D9D9"/>
+              <w:top w:val="single" w:sz="4" w:color="000000" w:space="0"/>
+              <w:left w:val="single" w:sz="4" w:color="000000" w:space="0"/>
+              <w:bottom w:val="single" w:sz="4" w:color="000000" w:space="0"/>
+              <w:right w:val="single" w:sz="4" w:color="000000" w:space="0"/>
+              <w:insideH w:val="single" w:sz="4" w:space="0" w:color="000000"/>
+              <w:insideV w:val="single" w:sz="4" w:space="0" w:color="000000"/>
             </w:tcBorders>
-            <w:shd w:fill="FFFFFF"/>
             <w:tcMar>
               <w:top w:w="90" w:type="dxa"/>
               <w:left w:w="90" w:type="dxa"/>
@@ -4495,6 +4796,7 @@
             <w:r>
               <w:rPr>
                 <w:b w:val="0"/>
+                <w:color w:val="000000"/>
                 <w:sz w:val="18"/>
               </w:rPr>
               <w:t>Known development cases; model and local gate combined</w:t>
@@ -4508,12 +4810,13 @@
             <w:tcW w:type="dxa" w:w="2952"/>
             <w:vAlign w:val="center"/>
             <w:tcBorders>
-              <w:top w:val="single" w:sz="4" w:color="D9D9D9"/>
-              <w:left w:val="single" w:sz="4" w:color="D9D9D9"/>
-              <w:bottom w:val="single" w:sz="4" w:color="D9D9D9"/>
-              <w:right w:val="single" w:sz="4" w:color="D9D9D9"/>
+              <w:top w:val="single" w:sz="4" w:color="000000" w:space="0"/>
+              <w:left w:val="single" w:sz="4" w:color="000000" w:space="0"/>
+              <w:bottom w:val="single" w:sz="4" w:color="000000" w:space="0"/>
+              <w:right w:val="single" w:sz="4" w:color="000000" w:space="0"/>
+              <w:insideH w:val="single" w:sz="4" w:space="0" w:color="000000"/>
+              <w:insideV w:val="single" w:sz="4" w:space="0" w:color="000000"/>
             </w:tcBorders>
-            <w:shd w:fill="FFFFFF"/>
             <w:tcMar>
               <w:top w:w="90" w:type="dxa"/>
               <w:left w:w="90" w:type="dxa"/>
@@ -4528,6 +4831,7 @@
             <w:r>
               <w:rPr>
                 <w:b w:val="0"/>
+                <w:color w:val="000000"/>
                 <w:sz w:val="18"/>
               </w:rPr>
               <w:t>Escalation rate</w:t>
@@ -4539,12 +4843,13 @@
             <w:tcW w:type="dxa" w:w="1584"/>
             <w:vAlign w:val="center"/>
             <w:tcBorders>
-              <w:top w:val="single" w:sz="4" w:color="D9D9D9"/>
-              <w:left w:val="single" w:sz="4" w:color="D9D9D9"/>
-              <w:bottom w:val="single" w:sz="4" w:color="D9D9D9"/>
-              <w:right w:val="single" w:sz="4" w:color="D9D9D9"/>
+              <w:top w:val="single" w:sz="4" w:color="000000" w:space="0"/>
+              <w:left w:val="single" w:sz="4" w:color="000000" w:space="0"/>
+              <w:bottom w:val="single" w:sz="4" w:color="000000" w:space="0"/>
+              <w:right w:val="single" w:sz="4" w:color="000000" w:space="0"/>
+              <w:insideH w:val="single" w:sz="4" w:space="0" w:color="000000"/>
+              <w:insideV w:val="single" w:sz="4" w:space="0" w:color="000000"/>
             </w:tcBorders>
-            <w:shd w:fill="FFFFFF"/>
             <w:tcMar>
               <w:top w:w="90" w:type="dxa"/>
               <w:left w:w="90" w:type="dxa"/>
@@ -4559,6 +4864,7 @@
             <w:r>
               <w:rPr>
                 <w:b w:val="0"/>
+                <w:color w:val="000000"/>
                 <w:sz w:val="18"/>
               </w:rPr>
               <w:t>3/30 (10%)</w:t>
@@ -4570,12 +4876,13 @@
             <w:tcW w:type="dxa" w:w="4680"/>
             <w:vAlign w:val="center"/>
             <w:tcBorders>
-              <w:top w:val="single" w:sz="4" w:color="D9D9D9"/>
-              <w:left w:val="single" w:sz="4" w:color="D9D9D9"/>
-              <w:bottom w:val="single" w:sz="4" w:color="D9D9D9"/>
-              <w:right w:val="single" w:sz="4" w:color="D9D9D9"/>
+              <w:top w:val="single" w:sz="4" w:color="000000" w:space="0"/>
+              <w:left w:val="single" w:sz="4" w:color="000000" w:space="0"/>
+              <w:bottom w:val="single" w:sz="4" w:color="000000" w:space="0"/>
+              <w:right w:val="single" w:sz="4" w:color="000000" w:space="0"/>
+              <w:insideH w:val="single" w:sz="4" w:space="0" w:color="000000"/>
+              <w:insideV w:val="single" w:sz="4" w:space="0" w:color="000000"/>
             </w:tcBorders>
-            <w:shd w:fill="FFFFFF"/>
             <w:tcMar>
               <w:top w:w="90" w:type="dxa"/>
               <w:left w:w="90" w:type="dxa"/>
@@ -4590,6 +4897,7 @@
             <w:r>
               <w:rPr>
                 <w:b w:val="0"/>
+                <w:color w:val="000000"/>
                 <w:sz w:val="18"/>
               </w:rPr>
               <w:t>T28, T29, T30; no API errors</w:t>
@@ -4603,12 +4911,13 @@
             <w:tcW w:type="dxa" w:w="2952"/>
             <w:vAlign w:val="center"/>
             <w:tcBorders>
-              <w:top w:val="single" w:sz="4" w:color="D9D9D9"/>
-              <w:left w:val="single" w:sz="4" w:color="D9D9D9"/>
-              <w:bottom w:val="single" w:sz="4" w:color="D9D9D9"/>
-              <w:right w:val="single" w:sz="4" w:color="D9D9D9"/>
+              <w:top w:val="single" w:sz="4" w:color="000000" w:space="0"/>
+              <w:left w:val="single" w:sz="4" w:color="000000" w:space="0"/>
+              <w:bottom w:val="single" w:sz="4" w:color="000000" w:space="0"/>
+              <w:right w:val="single" w:sz="4" w:color="000000" w:space="0"/>
+              <w:insideH w:val="single" w:sz="4" w:space="0" w:color="000000"/>
+              <w:insideV w:val="single" w:sz="4" w:space="0" w:color="000000"/>
             </w:tcBorders>
-            <w:shd w:fill="FFFFFF"/>
             <w:tcMar>
               <w:top w:w="90" w:type="dxa"/>
               <w:left w:w="90" w:type="dxa"/>
@@ -4623,6 +4932,7 @@
             <w:r>
               <w:rPr>
                 <w:b w:val="0"/>
+                <w:color w:val="000000"/>
                 <w:sz w:val="18"/>
               </w:rPr>
               <w:t>Clarification rate</w:t>
@@ -4634,12 +4944,13 @@
             <w:tcW w:type="dxa" w:w="1584"/>
             <w:vAlign w:val="center"/>
             <w:tcBorders>
-              <w:top w:val="single" w:sz="4" w:color="D9D9D9"/>
-              <w:left w:val="single" w:sz="4" w:color="D9D9D9"/>
-              <w:bottom w:val="single" w:sz="4" w:color="D9D9D9"/>
-              <w:right w:val="single" w:sz="4" w:color="D9D9D9"/>
+              <w:top w:val="single" w:sz="4" w:color="000000" w:space="0"/>
+              <w:left w:val="single" w:sz="4" w:color="000000" w:space="0"/>
+              <w:bottom w:val="single" w:sz="4" w:color="000000" w:space="0"/>
+              <w:right w:val="single" w:sz="4" w:color="000000" w:space="0"/>
+              <w:insideH w:val="single" w:sz="4" w:space="0" w:color="000000"/>
+              <w:insideV w:val="single" w:sz="4" w:space="0" w:color="000000"/>
             </w:tcBorders>
-            <w:shd w:fill="FFFFFF"/>
             <w:tcMar>
               <w:top w:w="90" w:type="dxa"/>
               <w:left w:w="90" w:type="dxa"/>
@@ -4654,6 +4965,7 @@
             <w:r>
               <w:rPr>
                 <w:b w:val="0"/>
+                <w:color w:val="000000"/>
                 <w:sz w:val="18"/>
               </w:rPr>
               <w:t>2/30 (6.67%)</w:t>
@@ -4665,12 +4977,13 @@
             <w:tcW w:type="dxa" w:w="4680"/>
             <w:vAlign w:val="center"/>
             <w:tcBorders>
-              <w:top w:val="single" w:sz="4" w:color="D9D9D9"/>
-              <w:left w:val="single" w:sz="4" w:color="D9D9D9"/>
-              <w:bottom w:val="single" w:sz="4" w:color="D9D9D9"/>
-              <w:right w:val="single" w:sz="4" w:color="D9D9D9"/>
+              <w:top w:val="single" w:sz="4" w:color="000000" w:space="0"/>
+              <w:left w:val="single" w:sz="4" w:color="000000" w:space="0"/>
+              <w:bottom w:val="single" w:sz="4" w:color="000000" w:space="0"/>
+              <w:right w:val="single" w:sz="4" w:color="000000" w:space="0"/>
+              <w:insideH w:val="single" w:sz="4" w:space="0" w:color="000000"/>
+              <w:insideV w:val="single" w:sz="4" w:space="0" w:color="000000"/>
             </w:tcBorders>
-            <w:shd w:fill="FFFFFF"/>
             <w:tcMar>
               <w:top w:w="90" w:type="dxa"/>
               <w:left w:w="90" w:type="dxa"/>
@@ -4685,6 +4998,7 @@
             <w:r>
               <w:rPr>
                 <w:b w:val="0"/>
+                <w:color w:val="000000"/>
                 <w:sz w:val="18"/>
               </w:rPr>
               <w:t>T11, T19; separate from escalation</w:t>
@@ -4698,12 +5012,13 @@
             <w:tcW w:type="dxa" w:w="2952"/>
             <w:vAlign w:val="center"/>
             <w:tcBorders>
-              <w:top w:val="single" w:sz="4" w:color="D9D9D9"/>
-              <w:left w:val="single" w:sz="4" w:color="D9D9D9"/>
-              <w:bottom w:val="single" w:sz="4" w:color="D9D9D9"/>
-              <w:right w:val="single" w:sz="4" w:color="D9D9D9"/>
+              <w:top w:val="single" w:sz="4" w:color="000000" w:space="0"/>
+              <w:left w:val="single" w:sz="4" w:color="000000" w:space="0"/>
+              <w:bottom w:val="single" w:sz="4" w:color="000000" w:space="0"/>
+              <w:right w:val="single" w:sz="4" w:color="000000" w:space="0"/>
+              <w:insideH w:val="single" w:sz="4" w:space="0" w:color="000000"/>
+              <w:insideV w:val="single" w:sz="4" w:space="0" w:color="000000"/>
             </w:tcBorders>
-            <w:shd w:fill="FFFFFF"/>
             <w:tcMar>
               <w:top w:w="90" w:type="dxa"/>
               <w:left w:w="90" w:type="dxa"/>
@@ -4718,6 +5033,7 @@
             <w:r>
               <w:rPr>
                 <w:b w:val="0"/>
+                <w:color w:val="000000"/>
                 <w:sz w:val="18"/>
               </w:rPr>
               <w:t>Informal diagnostics</w:t>
@@ -4729,12 +5045,13 @@
             <w:tcW w:type="dxa" w:w="1584"/>
             <w:vAlign w:val="center"/>
             <w:tcBorders>
-              <w:top w:val="single" w:sz="4" w:color="D9D9D9"/>
-              <w:left w:val="single" w:sz="4" w:color="D9D9D9"/>
-              <w:bottom w:val="single" w:sz="4" w:color="D9D9D9"/>
-              <w:right w:val="single" w:sz="4" w:color="D9D9D9"/>
+              <w:top w:val="single" w:sz="4" w:color="000000" w:space="0"/>
+              <w:left w:val="single" w:sz="4" w:color="000000" w:space="0"/>
+              <w:bottom w:val="single" w:sz="4" w:color="000000" w:space="0"/>
+              <w:right w:val="single" w:sz="4" w:color="000000" w:space="0"/>
+              <w:insideH w:val="single" w:sz="4" w:space="0" w:color="000000"/>
+              <w:insideV w:val="single" w:sz="4" w:space="0" w:color="000000"/>
             </w:tcBorders>
-            <w:shd w:fill="FFFFFF"/>
             <w:tcMar>
               <w:top w:w="90" w:type="dxa"/>
               <w:left w:w="90" w:type="dxa"/>
@@ -4749,6 +5066,7 @@
             <w:r>
               <w:rPr>
                 <w:b w:val="0"/>
+                <w:color w:val="000000"/>
                 <w:sz w:val="18"/>
               </w:rPr>
               <w:t>7/12</w:t>
@@ -4760,12 +5078,13 @@
             <w:tcW w:type="dxa" w:w="4680"/>
             <w:vAlign w:val="center"/>
             <w:tcBorders>
-              <w:top w:val="single" w:sz="4" w:color="D9D9D9"/>
-              <w:left w:val="single" w:sz="4" w:color="D9D9D9"/>
-              <w:bottom w:val="single" w:sz="4" w:color="D9D9D9"/>
-              <w:right w:val="single" w:sz="4" w:color="D9D9D9"/>
+              <w:top w:val="single" w:sz="4" w:color="000000" w:space="0"/>
+              <w:left w:val="single" w:sz="4" w:color="000000" w:space="0"/>
+              <w:bottom w:val="single" w:sz="4" w:color="000000" w:space="0"/>
+              <w:right w:val="single" w:sz="4" w:color="000000" w:space="0"/>
+              <w:insideH w:val="single" w:sz="4" w:space="0" w:color="000000"/>
+              <w:insideV w:val="single" w:sz="4" w:space="0" w:color="000000"/>
             </w:tcBorders>
-            <w:shd w:fill="FFFFFF"/>
             <w:tcMar>
               <w:top w:w="90" w:type="dxa"/>
               <w:left w:w="90" w:type="dxa"/>
@@ -4780,6 +5099,7 @@
             <w:r>
               <w:rPr>
                 <w:b w:val="0"/>
+                <w:color w:val="000000"/>
                 <w:sz w:val="18"/>
               </w:rPr>
               <w:t>Offline only; 23 September developer-authored supplementary set</w:t>

</xml_diff>

<commit_message>
Add BPMN workflow figure to final report
</commit_message>
<xml_diff>
--- a/docs/Final_Report.docx
+++ b/docs/Final_Report.docx
@@ -84,6 +84,9 @@
     <w:p>
       <w:r>
         <w:t>The workflow combines a conservative local intent gate, active-policy retrieval and optional model generation. OpenRouter calls use openai/gpt-4o-mini in the saved runs. The model returns answer text, citation IDs and intent; Python extracts the ticket fields. The model does not receive a personnel-action tool.</w:t>
+      </w:r>
+      <w:r>
+        <w:t xml:space="preserve"> Figure 1 summarises this BPMN workflow and its safety gates before a draft can be returned.</w:t>
       </w:r>
     </w:p>
     <w:tbl>
@@ -555,7 +558,61 @@
     </w:p>
     <w:p>
       <w:pPr>
+        <w:pageBreakBefore/>
+        <w:jc w:val="center"/>
+      </w:pPr>
+      <w:r>
+        <w:drawing>
+          <wp:inline xmlns:a="http://schemas.openxmlformats.org/drawingml/2006/main" xmlns:pic="http://schemas.openxmlformats.org/drawingml/2006/picture">
+            <wp:extent cx="5989320" cy="3260852"/>
+            <wp:docPr id="1" name="Picture 1"/>
+            <wp:cNvGraphicFramePr>
+              <a:graphicFrameLocks noChangeAspect="1"/>
+            </wp:cNvGraphicFramePr>
+            <a:graphic>
+              <a:graphicData uri="http://schemas.openxmlformats.org/drawingml/2006/picture">
+                <pic:pic>
+                  <pic:nvPicPr>
+                    <pic:cNvPr id="0" name="HR_Ask_BPMN.png"/>
+                    <pic:cNvPicPr/>
+                  </pic:nvPicPr>
+                  <pic:blipFill>
+                    <a:blip r:embed="rId10"/>
+                    <a:stretch>
+                      <a:fillRect/>
+                    </a:stretch>
+                  </pic:blipFill>
+                  <pic:spPr>
+                    <a:xfrm>
+                      <a:off x="0" y="0"/>
+                      <a:ext cx="5989320" cy="3260852"/>
+                    </a:xfrm>
+                    <a:prstGeom prst="rect"/>
+                  </pic:spPr>
+                </pic:pic>
+              </a:graphicData>
+            </a:graphic>
+          </wp:inline>
+        </w:drawing>
+      </w:r>
+    </w:p>
+    <w:p>
+      <w:pPr>
+        <w:spacing w:before="100" w:after="120"/>
+        <w:jc w:val="center"/>
+      </w:pPr>
+      <w:r>
+        <w:rPr>
+          <w:b/>
+          <w:sz w:val="20"/>
+        </w:rPr>
+        <w:t>Figure 1. BPMN workflow for HR-Ask policy consultation and unsubmitted ticket drafting.</w:t>
+      </w:r>
+    </w:p>
+    <w:p>
+      <w:pPr>
         <w:pStyle w:val="Heading1"/>
+        <w:pageBreakBefore/>
       </w:pPr>
       <w:r>
         <w:t>3 Evaluation and measured results</w:t>

</xml_diff>

<commit_message>
Refine report reproducibility and demo subtitles
</commit_message>
<xml_diff>
--- a/docs/Final_Report.docx
+++ b/docs/Final_Report.docx
@@ -1357,32 +1357,7 @@
         </w:rPr>
       </w:pPr>
       <w:r>
-        <w:rPr>
-          <w:rFonts w:hint="default" w:ascii="Times New Roman Regular" w:hAnsi="Times New Roman Regular" w:cs="Times New Roman Regular"/>
-          <w:sz w:val="24"/>
-          <w:szCs w:val="24"/>
-        </w:rPr>
-        <w:t>Run python3 server.py and open http://127.0.0.1:8765 for the local demonstration. Run python3 -m unittest discover-s tests-v for regression tests, evaluate.py for offline cases, compare.py for the retrieval baseline, and scripts/summarize_evidence.py for outcome and cost aggregation. OpenRouter mode is optional and requires a locally entered API key that must never be committed. The repository contains the policy files, labelled datasets, review protocol, frozen results, code, README, BPMN diagram and final English demo video.</w:t>
-      </w:r>
-    </w:p>
-    <w:p>
-      <w:pPr>
-        <w:spacing w:line="360" w:lineRule="auto"/>
-        <w:ind w:firstLine="240" w:firstLineChars="100"/>
-        <w:jc w:val="both"/>
-        <w:rPr>
-          <w:rFonts w:hint="default" w:ascii="Times New Roman Regular" w:hAnsi="Times New Roman Regular" w:cs="Times New Roman Regular"/>
-          <w:sz w:val="24"/>
-          <w:szCs w:val="24"/>
-        </w:rPr>
-      </w:pPr>
-      <w:r>
-        <w:rPr>
-          <w:rFonts w:hint="default" w:ascii="Times New Roman Regular" w:hAnsi="Times New Roman Regular" w:cs="Times New Roman Regular"/>
-          <w:sz w:val="24"/>
-          <w:szCs w:val="24"/>
-        </w:rPr>
-        <w:t>The final delivery comprises this report, the GitHub repository, the recorded demonstration and the required self-appraisal cover document. AI assistance supported implementation, synthetic data, analysis and report/video materials. The final video uses the student’s recorded English narration with actual application screenshots and synchronized English subtitles; the student remains responsible for understanding and submitting the work.</w:t>
+        <w:t>The GitHub repository provides the policy corpus, labelled test cases, frozen evidence files, source code, BPMN workflow and English demo video. Its README explains how to run the local application and regression tests. These materials make the reported metrics traceable: a reviewer can inspect the inputs, outputs, test labels, review protocol and known limitations. OpenRouter mode is optional and uses a locally supplied key; no key is stored in the repository.</w:t>
       </w:r>
     </w:p>
     <w:sectPr>

</xml_diff>

<commit_message>
Expand report and add project self appraisal
</commit_message>
<xml_diff>
--- a/docs/Final_Report.docx
+++ b/docs/Final_Report.docx
@@ -1357,7 +1357,10 @@
         </w:rPr>
       </w:pPr>
       <w:r>
-        <w:t>The GitHub repository provides the policy corpus, labelled test cases, frozen evidence files, source code, BPMN workflow and English demo video. Its README explains how to run the local application and regression tests. These materials make the reported metrics traceable: a reviewer can inspect the inputs, outputs, test labels, review protocol and known limitations. OpenRouter mode is optional and uses a locally supplied key; no key is stored in the repository.</w:t>
+        <w:t>The GitHub repository provides the policy corpus, labelled test cases, frozen evidence files, source code, BPMN workflow and English demo video. Its README explains the project structure, the intended user, inputs, outputs, safety boundary and local setup. These materials make the reported metrics traceable: a reviewer can inspect the inputs, outputs, test labels, review protocol and known limitations.</w:t>
+        <w:br/>
+        <w:br/>
+        <w:t>For local reproduction, run python3 server.py and open http://127.0.0.1:8765. Run python3 -m unittest discover -s tests -v for regression checks; evaluate.py, compare.py and scripts/summarize_evidence.py reproduce the offline, retrieval-baseline and cost summaries. Optional OpenRouter mode uses a locally supplied API key; no key is stored in the repository. The saved result files preserve the evidence used for the reported outcomes, rather than presenting unsupported claims about production performance.</w:t>
       </w:r>
     </w:p>
     <w:sectPr>

</xml_diff>

<commit_message>
Expand report and self appraisal details
</commit_message>
<xml_diff>
--- a/docs/Final_Report.docx
+++ b/docs/Final_Report.docx
@@ -1363,6 +1363,21 @@
         <w:t>For local reproduction, run python3 server.py and open http://127.0.0.1:8765. Run python3 -m unittest discover -s tests -v for regression checks; evaluate.py, compare.py and scripts/summarize_evidence.py reproduce the offline, retrieval-baseline and cost summaries. Optional OpenRouter mode uses a locally supplied API key; no key is stored in the repository. The saved result files preserve the evidence used for the reported outcomes, rather than presenting unsupported claims about production performance.</w:t>
       </w:r>
     </w:p>
+    <w:p>
+      <w:pPr>
+        <w:spacing w:after="0" w:line="360" w:lineRule="auto"/>
+        <w:ind w:firstLine="240" w:firstLineChars="100"/>
+        <w:jc w:val="both"/>
+        <w:rPr>
+          <w:rFonts w:hint="default" w:ascii="Times New Roman Regular" w:hAnsi="Times New Roman Regular" w:cs="Times New Roman Regular"/>
+          <w:sz w:val="24"/>
+          <w:szCs w:val="24"/>
+        </w:rPr>
+      </w:pPr>
+      <w:r>
+        <w:t>Final delivery includes this report, the GitHub repository, the recorded demonstration and the required self-appraisal cover document. AI assistance supported code, synthetic teaching data, testing, analysis and materials; the student reviewed the code, evidence and claims and remains responsible for them.</w:t>
+      </w:r>
+    </w:p>
     <w:sectPr>
       <w:footerReference r:id="rId5" w:type="default"/>
       <w:pgSz w:w="12240" w:h="15840"/>

</xml_diff>

<commit_message>
Update final report and video narration
</commit_message>
<xml_diff>
--- a/docs/Final_Report.docx
+++ b/docs/Final_Report.docx
@@ -245,8 +245,6 @@
         </w:rPr>
         <w:t>Course integration is explicit. Class 1 frames a bounded HR-service problem and user journey. Class 2 informs the retrieval, generation and evaluation workflow. Class 3 informs prompt repair, structured output and measured comparisons. Class 5 separates observed model inference cost from human fallback and quarterly rule-maintenance assumptions. Class 6 informs the escalation boundary, fictional data, human review and production-risk discussion. This coverage connects each design choice to a course concept while avoiding a claim that the prototype is ready for operational deployment.</w:t>
       </w:r>
-      <w:bookmarkStart w:id="0" w:name="_GoBack"/>
-      <w:bookmarkEnd w:id="0"/>
     </w:p>
     <w:p>
       <w:pPr>
@@ -1395,25 +1393,107 @@
         <w:jc w:val="both"/>
         <w:rPr>
           <w:rFonts w:hint="default" w:ascii="Times New Roman Regular" w:hAnsi="Times New Roman Regular" w:cs="Times New Roman Regular"/>
+          <w:b w:val="0"/>
           <w:sz w:val="24"/>
           <w:szCs w:val="24"/>
         </w:rPr>
       </w:pPr>
       <w:r>
+        <w:rPr>
+          <w:rFonts w:hint="default" w:ascii="Times New Roman Regular" w:hAnsi="Times New Roman Regular" w:cs="Times New Roman Regular"/>
+          <w:b w:val="0"/>
+          <w:sz w:val="24"/>
+          <w:szCs w:val="24"/>
+        </w:rPr>
         <w:t xml:space="preserve">The repository contains the policy corpus, labelled test cases, frozen evidence, source code, BPMN workflow and English demo video. The README defines the intended user, inputs, outputs, safety boundary and local setup. Repository: </w:t>
       </w:r>
-      <w:hyperlink r:id="rId11">
-        <w:r>
-          <w:rPr>
-            <w:color w:val="0563C1"/>
-            <w:u w:val="single"/>
-          </w:rPr>
-          <w:t>https://github.com/kxy-creator/PE6201-End-of-project</w:t>
-        </w:r>
-      </w:hyperlink>
       <w:r>
-        <w:br/>
-        <w:t>Run python3 server.py and open http://127.0.0.1:8765. Run python3 -m unittest discover -s tests -v for regression checks. evaluate.py, compare.py and scripts/summarize_evidence.py reproduce the evidence summaries. Optional OpenRouter mode uses a local API key that is not stored in the repository.</w:t>
+        <w:rPr>
+          <w:rFonts w:hint="default" w:ascii="Times New Roman Bold" w:hAnsi="Times New Roman Bold" w:cs="Times New Roman Bold"/>
+          <w:b/>
+          <w:bCs w:val="0"/>
+          <w:color w:val="auto"/>
+          <w:sz w:val="24"/>
+          <w:szCs w:val="24"/>
+        </w:rPr>
+        <w:fldChar w:fldCharType="begin"/>
+      </w:r>
+      <w:r>
+        <w:rPr>
+          <w:rFonts w:hint="default" w:ascii="Times New Roman Bold" w:hAnsi="Times New Roman Bold" w:cs="Times New Roman Bold"/>
+          <w:b/>
+          <w:bCs w:val="0"/>
+          <w:color w:val="auto"/>
+          <w:sz w:val="24"/>
+          <w:szCs w:val="24"/>
+        </w:rPr>
+        <w:instrText xml:space="preserve"> HYPERLINK "https://github.com/kxy-creator/PE6201-End-of-project" \h </w:instrText>
+      </w:r>
+      <w:r>
+        <w:rPr>
+          <w:rFonts w:hint="default" w:ascii="Times New Roman Bold" w:hAnsi="Times New Roman Bold" w:cs="Times New Roman Bold"/>
+          <w:b/>
+          <w:bCs w:val="0"/>
+          <w:color w:val="auto"/>
+          <w:sz w:val="24"/>
+          <w:szCs w:val="24"/>
+        </w:rPr>
+        <w:fldChar w:fldCharType="separate"/>
+      </w:r>
+      <w:r>
+        <w:rPr>
+          <w:rFonts w:hint="default" w:ascii="Times New Roman Bold" w:hAnsi="Times New Roman Bold" w:cs="Times New Roman Bold"/>
+          <w:b/>
+          <w:bCs w:val="0"/>
+          <w:color w:val="auto"/>
+          <w:sz w:val="24"/>
+          <w:szCs w:val="24"/>
+          <w:u w:val="single"/>
+        </w:rPr>
+        <w:t>https://github.com/kxy-creator/PE6201-End-of-project</w:t>
+      </w:r>
+      <w:r>
+        <w:rPr>
+          <w:rFonts w:hint="default" w:ascii="Times New Roman Bold" w:hAnsi="Times New Roman Bold" w:cs="Times New Roman Bold"/>
+          <w:b/>
+          <w:bCs w:val="0"/>
+          <w:color w:val="auto"/>
+          <w:sz w:val="24"/>
+          <w:szCs w:val="24"/>
+          <w:u w:val="single"/>
+        </w:rPr>
+        <w:fldChar w:fldCharType="end"/>
+      </w:r>
+      <w:r>
+        <w:rPr>
+          <w:rFonts w:hint="default" w:ascii="Times New Roman Bold" w:hAnsi="Times New Roman Bold" w:cs="Times New Roman Bold"/>
+          <w:b/>
+          <w:bCs w:val="0"/>
+          <w:color w:val="auto"/>
+          <w:sz w:val="24"/>
+          <w:szCs w:val="24"/>
+        </w:rPr>
+        <w:br w:type="textWrapping"/>
+      </w:r>
+      <w:r>
+        <w:rPr>
+          <w:rFonts w:hint="default" w:ascii="Times New Roman Regular" w:hAnsi="Times New Roman Regular" w:cs="Times New Roman Regular"/>
+          <w:b w:val="0"/>
+          <w:sz w:val="24"/>
+          <w:szCs w:val="24"/>
+        </w:rPr>
+        <w:t>Run python3 server.py and open http://127.0.0.1:8765. Run python3 -m unittest discover -s tests -v for regression checks. evaluate.py, co</w:t>
+      </w:r>
+      <w:bookmarkStart w:id="0" w:name="_GoBack"/>
+      <w:bookmarkEnd w:id="0"/>
+      <w:r>
+        <w:rPr>
+          <w:rFonts w:hint="default" w:ascii="Times New Roman Regular" w:hAnsi="Times New Roman Regular" w:cs="Times New Roman Regular"/>
+          <w:b w:val="0"/>
+          <w:sz w:val="24"/>
+          <w:szCs w:val="24"/>
+        </w:rPr>
+        <w:t>mpare.py and scripts/summarize_evidence.py reproduce the evidence summaries. Optional OpenRouter mode uses a local API key that is not stored in the repository.</w:t>
       </w:r>
     </w:p>
     <w:p>
@@ -1423,11 +1503,18 @@
         <w:jc w:val="both"/>
         <w:rPr>
           <w:rFonts w:hint="default" w:ascii="Times New Roman Regular" w:hAnsi="Times New Roman Regular" w:cs="Times New Roman Regular"/>
+          <w:b w:val="0"/>
           <w:sz w:val="24"/>
           <w:szCs w:val="24"/>
         </w:rPr>
       </w:pPr>
       <w:r>
+        <w:rPr>
+          <w:rFonts w:hint="default" w:ascii="Times New Roman Regular" w:hAnsi="Times New Roman Regular" w:cs="Times New Roman Regular"/>
+          <w:b w:val="0"/>
+          <w:sz w:val="24"/>
+          <w:szCs w:val="24"/>
+        </w:rPr>
         <w:t>Final delivery includes this report, the repository, the recorded demonstration and the required self-appraisal cover document. AI assistance supported implementation and materials; the student reviewed the evidence and remains responsible for the claims.</w:t>
       </w:r>
     </w:p>
@@ -2197,7 +2284,7 @@
       <w:spacing w:after="200" w:line="276" w:lineRule="auto"/>
     </w:pPr>
     <w:rPr>
-      <w:rFonts w:ascii="Courier" w:hAnsi="Courier" w:eastAsiaTheme="minorEastAsia" w:cstheme="minorBidi"/>
+      <w:rFonts w:ascii="冬青黑体简体中文 W3" w:hAnsi="冬青黑体简体中文 W3" w:eastAsiaTheme="minorEastAsia" w:cstheme="minorBidi"/>
       <w:sz w:val="20"/>
       <w:szCs w:val="20"/>
       <w:lang w:val="en-US" w:eastAsia="en-US" w:bidi="ar-SA"/>
@@ -14069,7 +14156,7 @@
     <w:link w:val="2"/>
     <w:uiPriority w:val="99"/>
     <w:rPr>
-      <w:rFonts w:ascii="Courier" w:hAnsi="Courier"/>
+      <w:rFonts w:ascii="冬青黑体简体中文 W3" w:hAnsi="冬青黑体简体中文 W3"/>
       <w:sz w:val="20"/>
       <w:szCs w:val="20"/>
     </w:rPr>

</xml_diff>

<commit_message>
Expand final report and revise self appraisal
</commit_message>
<xml_diff>
--- a/docs/Final_Report.docx
+++ b/docs/Final_Report.docx
@@ -96,7 +96,7 @@
           <w:sz w:val="24"/>
           <w:szCs w:val="24"/>
         </w:rPr>
-        <w:t>Section C | 2 October 2026</w:t>
+        <w:t>Section C | 3 October 2026</w:t>
       </w:r>
     </w:p>
     <w:p>
@@ -164,6 +164,23 @@
     </w:p>
     <w:p>
       <w:pPr>
+        <w:pPr>
+          <w:spacing w:line="360" w:lineRule="auto"/>
+          <w:ind w:firstLine="240" w:firstLineChars="100"/>
+          <w:jc w:val="both"/>
+          <w:rPr>
+            <w:rFonts w:hint="default" w:ascii="Times New Roman Regular" w:hAnsi="Times New Roman Regular" w:cs="Times New Roman Regular"/>
+            <w:sz w:val="24"/>
+            <w:szCs w:val="24"/>
+          </w:rPr>
+        </w:pPr>
+      </w:pPr>
+      <w:r>
+        <w:t>I deliberately kept the first version narrow: one employee-facing question, a traceable policy answer, and an unsubmitted draft. This avoids presenting a chatbot as an HR decision-maker. The practical value I test is whether the system can make a later HR review easier by identifying relevant evidence and missing information, rather than replacing that review.</w:t>
+      </w:r>
+    </w:p>
+    <w:p>
+      <w:pPr>
         <w:pStyle w:val="3"/>
         <w:spacing w:line="360" w:lineRule="auto"/>
         <w:jc w:val="both"/>
@@ -224,6 +241,23 @@
           <w:szCs w:val="24"/>
         </w:rPr>
         <w:t>The local baseline uses Chinese bigrams, English tokens, aliases, TF-IDF and cosine similarity to retrieve up to three policy sections. In optional OpenRouter mode, openai/gpt-4o-mini receives the retrieved evidence and returns answer text, citation IDs and an intent. Python retains control of field extraction and validation. The model has no tool that can execute personnel actions. This build-and-buy split keeps policy handling inspectable while renting language generation rather than training a model for five fictional documents.</w:t>
+      </w:r>
+    </w:p>
+    <w:p>
+      <w:pPr>
+        <w:pPr>
+          <w:spacing w:after="0" w:line="360" w:lineRule="auto"/>
+          <w:ind w:firstLine="240" w:firstLineChars="100"/>
+          <w:jc w:val="both"/>
+          <w:rPr>
+            <w:rFonts w:hint="default" w:ascii="Times New Roman Regular" w:hAnsi="Times New Roman Regular" w:cs="Times New Roman Regular"/>
+            <w:sz w:val="24"/>
+            <w:szCs w:val="24"/>
+          </w:rPr>
+        </w:pPr>
+      </w:pPr>
+      <w:r>
+        <w:t>I also chose not to build an autonomous agent. The task does not require a multi-step tool loop, and an agent would add control, audit and failure-mode complexity without improving the core requirement. Retrieval, intent routing and validation therefore remain deterministic Python steps, while the optional model is limited to grounded language generation.</w:t>
       </w:r>
     </w:p>
     <w:p>
@@ -391,6 +425,23 @@
           <w:szCs w:val="24"/>
         </w:rPr>
         <w:t>Answer quality is therefore scored separately. A retrospective AI-assisted review assessed 25 eligible saved policy answers, while a documented student manual spot check assessed a stratified random sample of 10. The manual review is evidence of a student check, not independent HR validation. The saved live run used the revised prompt draft-intent-v2; five workflow cases were handled locally and 25 used the model without recorded API errors.</w:t>
+      </w:r>
+    </w:p>
+    <w:p>
+      <w:pPr>
+        <w:pPr>
+          <w:spacing w:line="360" w:lineRule="auto"/>
+          <w:ind w:firstLine="240" w:firstLineChars="100"/>
+          <w:jc w:val="both"/>
+          <w:rPr>
+            <w:rFonts w:hint="default" w:ascii="Times New Roman Regular" w:hAnsi="Times New Roman Regular" w:cs="Times New Roman Regular"/>
+            <w:sz w:val="24"/>
+            <w:szCs w:val="24"/>
+          </w:rPr>
+        </w:pPr>
+      </w:pPr>
+      <w:r>
+        <w:t>For reproducibility, I retained the prompts, policy snapshot, labelled cases and frozen result files in the repository. This allows a reviewer to trace a reported result back to a particular input and retrieved evidence. It does not remove the development-set limitation: the test cases were designed during the same project and may favour the system's known vocabulary and structure.</w:t>
       </w:r>
     </w:p>
     <w:p>
@@ -1236,6 +1287,23 @@
     </w:p>
     <w:p>
       <w:pPr>
+        <w:pPr>
+          <w:spacing w:line="360" w:lineRule="auto"/>
+          <w:ind w:firstLine="240" w:firstLineChars="100"/>
+          <w:jc w:val="both"/>
+          <w:rPr>
+            <w:rFonts w:hint="default" w:ascii="Times New Roman Regular" w:hAnsi="Times New Roman Regular" w:cs="Times New Roman Regular"/>
+            <w:sz w:val="24"/>
+            <w:szCs w:val="24"/>
+          </w:rPr>
+        </w:pPr>
+      </w:pPr>
+      <w:r>
+        <w:t>This distinction matters for the proposed use case. A superficially complete answer can still mislead an employee if it misses an exception, gives an overconfident tone, or routes a sensitive situation incorrectly. My reported results therefore support a claim about a bounded prototype and its engineering controls, not about HR policy accuracy in a real organisation.</w:t>
+      </w:r>
+    </w:p>
+    <w:p>
+      <w:pPr>
         <w:pStyle w:val="3"/>
         <w:spacing w:line="360" w:lineRule="auto"/>
         <w:jc w:val="both"/>
@@ -1296,6 +1364,23 @@
           <w:szCs w:val="24"/>
         </w:rPr>
         <w:t>The service model separately includes human fallback and recurring rule maintenance. Following instructor feedback, it assumes 15–20 regex rules rewritten each quarter; the midpoint of 17.5 rules, 20 minutes per rule and USD 25 per hour gives USD 48.61 monthly maintenance. A hypothetical unsuccessful enquiry needs five HR minutes, or USD 2.0833. At useful-resolution rates of 20%, 50% and 80%, illustrative cost per useful resolution is USD 8.94, USD 2.33 and USD 0.67. Only the 80% scenario produces a positive estimated monthly value. These are transparent assumptions, not observed business results.</w:t>
+      </w:r>
+    </w:p>
+    <w:p>
+      <w:pPr>
+        <w:pPr>
+          <w:spacing w:line="360" w:lineRule="auto"/>
+          <w:ind w:firstLine="240" w:firstLineChars="100"/>
+          <w:jc w:val="both"/>
+          <w:rPr>
+            <w:rFonts w:hint="default" w:ascii="Times New Roman Regular" w:hAnsi="Times New Roman Regular" w:cs="Times New Roman Regular"/>
+            <w:sz w:val="24"/>
+            <w:szCs w:val="24"/>
+          </w:rPr>
+        </w:pPr>
+      </w:pPr>
+      <w:r>
+        <w:t>The cost comparison also explains why quality and escalation matter commercially. A low model-call cost does not justify deployment if an incorrect answer creates rework or sends an employee down the wrong process. A future evaluation should measure useful resolution, time saved by HR reviewers and the proportion of cases correctly escalated, using an independently reviewed policy set.</w:t>
       </w:r>
     </w:p>
     <w:p>

</xml_diff>

<commit_message>
Add editable self appraisal and shorten report
</commit_message>
<xml_diff>
--- a/docs/Final_Report.docx
+++ b/docs/Final_Report.docx
@@ -257,7 +257,7 @@
         </w:pPr>
       </w:pPr>
       <w:r>
-        <w:t>I also chose not to build an autonomous agent. The task does not require a multi-step tool loop, and an agent would add control, audit and failure-mode complexity without improving the core requirement. Retrieval, intent routing and validation therefore remain deterministic Python steps, while the optional model is limited to grounded language generation.</w:t>
+        <w:t>I did not build an autonomous agent because the task needs no multi-step tool loop. Retrieval, intent routing and validation remain deterministic Python steps; the optional model only generates grounded language.</w:t>
       </w:r>
     </w:p>
     <w:p>
@@ -441,7 +441,7 @@
         </w:pPr>
       </w:pPr>
       <w:r>
-        <w:t>For reproducibility, I retained the prompts, policy snapshot, labelled cases and frozen result files in the repository. This allows a reviewer to trace a reported result back to a particular input and retrieved evidence. It does not remove the development-set limitation: the test cases were designed during the same project and may favour the system's known vocabulary and structure.</w:t>
+        <w:t>I retained prompts, the policy snapshot, labelled cases and frozen results so a reviewer can trace each reported outcome. Because the cases were designed during development, they may still favour known vocabulary and structure.</w:t>
       </w:r>
     </w:p>
     <w:p>
@@ -1299,7 +1299,7 @@
         </w:pPr>
       </w:pPr>
       <w:r>
-        <w:t>This distinction matters for the proposed use case. A superficially complete answer can still mislead an employee if it misses an exception, gives an overconfident tone, or routes a sensitive situation incorrectly. My reported results therefore support a claim about a bounded prototype and its engineering controls, not about HR policy accuracy in a real organisation.</w:t>
+        <w:t>A superficially complete answer can still mislead an employee by missing an exception, using an overconfident tone, or routing a sensitive situation incorrectly. These results support a bounded prototype, not real-organisation policy accuracy.</w:t>
       </w:r>
     </w:p>
     <w:p>
@@ -1579,6 +1579,27 @@
           <w:szCs w:val="24"/>
         </w:rPr>
         <w:t>mpare.py and scripts/summarize_evidence.py reproduce the evidence summaries. Optional OpenRouter mode uses a local API key that is not stored in the repository.</w:t>
+      </w:r>
+    </w:p>
+    <w:p>
+      <w:pPr>
+        <w:pPr>
+          <w:spacing w:after="0" w:line="360" w:lineRule="auto"/>
+          <w:ind w:firstLine="240" w:firstLineChars="100"/>
+          <w:jc w:val="both"/>
+          <w:rPr>
+            <w:rFonts w:hint="default" w:ascii="Times New Roman Regular" w:hAnsi="Times New Roman Regular" w:cs="Times New Roman Regular"/>
+            <w:b w:val="0"/>
+            <w:sz w:val="24"/>
+            <w:szCs w:val="24"/>
+          </w:rPr>
+        </w:pPr>
+      </w:pPr>
+      <w:r>
+        <w:rPr>
+          <w:rFonts w:ascii="Times New Roman" w:hAnsi="Times New Roman"/>
+        </w:rPr>
+        <w:t>The public repository also makes version history visible, so a reviewer can inspect how the code, evidence and documentation changed during the project.</w:t>
       </w:r>
     </w:p>
     <w:p>

</xml_diff>